<commit_message>
layer-level Hohle Fels phase assignment; update results, supplements, and response
</commit_message>
<xml_diff>
--- a/paper/supplement-site-assignment.docx
+++ b/paper/supplement-site-assignment.docx
@@ -2482,6 +2482,96 @@
         <w:rPr>
           <w:rStyle w:val="NormalTok"/>
         </w:rPr>
+        <w:t xml:space="preserve">    </w:t>
+      </w:r>
+      <w:r>
+        <w:rPr>
+          <w:rStyle w:val="CommentTok"/>
+        </w:rPr>
+        <w:t xml:space="preserve"># Hohle Fels is assigned at the layer level: the lower Aurignacian horizons</w:t>
+      </w:r>
+      <w:r>
+        <w:br/>
+      </w:r>
+      <w:r>
+        <w:rPr>
+          <w:rStyle w:val="NormalTok"/>
+        </w:rPr>
+        <w:t xml:space="preserve">    </w:t>
+      </w:r>
+      <w:r>
+        <w:rPr>
+          <w:rStyle w:val="CommentTok"/>
+        </w:rPr>
+        <w:t xml:space="preserve"># (AH Vb, Vab, Vaa, Va) are Early Aurignacian (Aur-P1), while the upper</w:t>
+      </w:r>
+      <w:r>
+        <w:br/>
+      </w:r>
+      <w:r>
+        <w:rPr>
+          <w:rStyle w:val="NormalTok"/>
+        </w:rPr>
+        <w:t xml:space="preserve">    </w:t>
+      </w:r>
+      <w:r>
+        <w:rPr>
+          <w:rStyle w:val="CommentTok"/>
+        </w:rPr>
+        <w:t xml:space="preserve"># horizons (AH IV, IIIb, IIIa and the II-series) are Evolved/Late</w:t>
+      </w:r>
+      <w:r>
+        <w:br/>
+      </w:r>
+      <w:r>
+        <w:rPr>
+          <w:rStyle w:val="NormalTok"/>
+        </w:rPr>
+        <w:t xml:space="preserve">    </w:t>
+      </w:r>
+      <w:r>
+        <w:rPr>
+          <w:rStyle w:val="CommentTok"/>
+        </w:rPr>
+        <w:t xml:space="preserve"># Aurignacian (Aur-P2), following Dinnis et al. (2019) and Bataille &amp;</w:t>
+      </w:r>
+      <w:r>
+        <w:br/>
+      </w:r>
+      <w:r>
+        <w:rPr>
+          <w:rStyle w:val="NormalTok"/>
+        </w:rPr>
+        <w:t xml:space="preserve">    </w:t>
+      </w:r>
+      <w:r>
+        <w:rPr>
+          <w:rStyle w:val="CommentTok"/>
+        </w:rPr>
+        <w:t xml:space="preserve"># Conard (2018). The single object from the mixed layer IIIa-V spans the</w:t>
+      </w:r>
+      <w:r>
+        <w:br/>
+      </w:r>
+      <w:r>
+        <w:rPr>
+          <w:rStyle w:val="NormalTok"/>
+        </w:rPr>
+        <w:t xml:space="preserve">    </w:t>
+      </w:r>
+      <w:r>
+        <w:rPr>
+          <w:rStyle w:val="CommentTok"/>
+        </w:rPr>
+        <w:t xml:space="preserve"># whole sequence and is excluded.</w:t>
+      </w:r>
+      <w:r>
+        <w:br/>
+      </w:r>
+      <w:r>
+        <w:rPr>
+          <w:rStyle w:val="NormalTok"/>
+        </w:rPr>
         <w:t xml:space="preserve">    site_name </w:t>
       </w:r>
       <w:r>
@@ -2506,12 +2596,96 @@
         <w:rPr>
           <w:rStyle w:val="NormalTok"/>
         </w:rPr>
-        <w:t xml:space="preserve">        </w:t>
+        <w:t xml:space="preserve"> </w:t>
       </w:r>
       <w:r>
         <w:rPr>
           <w:rStyle w:val="SpecialCharTok"/>
         </w:rPr>
+        <w:t xml:space="preserve">&amp;</w:t>
+      </w:r>
+      <w:r>
+        <w:rPr>
+          <w:rStyle w:val="NormalTok"/>
+        </w:rPr>
+        <w:t xml:space="preserve"> layer </w:t>
+      </w:r>
+      <w:r>
+        <w:rPr>
+          <w:rStyle w:val="SpecialCharTok"/>
+        </w:rPr>
+        <w:t xml:space="preserve">%in%</w:t>
+      </w:r>
+      <w:r>
+        <w:rPr>
+          <w:rStyle w:val="NormalTok"/>
+        </w:rPr>
+        <w:t xml:space="preserve"> </w:t>
+      </w:r>
+      <w:r>
+        <w:rPr>
+          <w:rStyle w:val="FunctionTok"/>
+        </w:rPr>
+        <w:t xml:space="preserve">c</w:t>
+      </w:r>
+      <w:r>
+        <w:rPr>
+          <w:rStyle w:val="NormalTok"/>
+        </w:rPr>
+        <w:t xml:space="preserve">(</w:t>
+      </w:r>
+      <w:r>
+        <w:rPr>
+          <w:rStyle w:val="StringTok"/>
+        </w:rPr>
+        <w:t xml:space="preserve">"Va"</w:t>
+      </w:r>
+      <w:r>
+        <w:rPr>
+          <w:rStyle w:val="NormalTok"/>
+        </w:rPr>
+        <w:t xml:space="preserve">, </w:t>
+      </w:r>
+      <w:r>
+        <w:rPr>
+          <w:rStyle w:val="StringTok"/>
+        </w:rPr>
+        <w:t xml:space="preserve">"Vaa"</w:t>
+      </w:r>
+      <w:r>
+        <w:rPr>
+          <w:rStyle w:val="NormalTok"/>
+        </w:rPr>
+        <w:t xml:space="preserve">, </w:t>
+      </w:r>
+      <w:r>
+        <w:rPr>
+          <w:rStyle w:val="StringTok"/>
+        </w:rPr>
+        <w:t xml:space="preserve">"Vab"</w:t>
+      </w:r>
+      <w:r>
+        <w:rPr>
+          <w:rStyle w:val="NormalTok"/>
+        </w:rPr>
+        <w:t xml:space="preserve">, </w:t>
+      </w:r>
+      <w:r>
+        <w:rPr>
+          <w:rStyle w:val="StringTok"/>
+        </w:rPr>
+        <w:t xml:space="preserve">"Vb"</w:t>
+      </w:r>
+      <w:r>
+        <w:rPr>
+          <w:rStyle w:val="NormalTok"/>
+        </w:rPr>
+        <w:t xml:space="preserve">) </w:t>
+      </w:r>
+      <w:r>
+        <w:rPr>
+          <w:rStyle w:val="SpecialCharTok"/>
+        </w:rPr>
         <w:t xml:space="preserve">~</w:t>
       </w:r>
       <w:r>
@@ -2525,6 +2699,264 @@
           <w:rStyle w:val="StringTok"/>
         </w:rPr>
         <w:t xml:space="preserve">"early_aurignacian"</w:t>
+      </w:r>
+      <w:r>
+        <w:rPr>
+          <w:rStyle w:val="NormalTok"/>
+        </w:rPr>
+        <w:t xml:space="preserve">,</w:t>
+      </w:r>
+      <w:r>
+        <w:br/>
+      </w:r>
+      <w:r>
+        <w:rPr>
+          <w:rStyle w:val="NormalTok"/>
+        </w:rPr>
+        <w:t xml:space="preserve">    site_name </w:t>
+      </w:r>
+      <w:r>
+        <w:rPr>
+          <w:rStyle w:val="SpecialCharTok"/>
+        </w:rPr>
+        <w:t xml:space="preserve">==</w:t>
+      </w:r>
+      <w:r>
+        <w:rPr>
+          <w:rStyle w:val="NormalTok"/>
+        </w:rPr>
+        <w:t xml:space="preserve"> </w:t>
+      </w:r>
+      <w:r>
+        <w:rPr>
+          <w:rStyle w:val="StringTok"/>
+        </w:rPr>
+        <w:t xml:space="preserve">"Hohle Fels"</w:t>
+      </w:r>
+      <w:r>
+        <w:rPr>
+          <w:rStyle w:val="NormalTok"/>
+        </w:rPr>
+        <w:t xml:space="preserve"> </w:t>
+      </w:r>
+      <w:r>
+        <w:rPr>
+          <w:rStyle w:val="SpecialCharTok"/>
+        </w:rPr>
+        <w:t xml:space="preserve">&amp;</w:t>
+      </w:r>
+      <w:r>
+        <w:rPr>
+          <w:rStyle w:val="NormalTok"/>
+        </w:rPr>
+        <w:t xml:space="preserve"> layer </w:t>
+      </w:r>
+      <w:r>
+        <w:rPr>
+          <w:rStyle w:val="SpecialCharTok"/>
+        </w:rPr>
+        <w:t xml:space="preserve">%in%</w:t>
+      </w:r>
+      <w:r>
+        <w:rPr>
+          <w:rStyle w:val="NormalTok"/>
+        </w:rPr>
+        <w:t xml:space="preserve"> </w:t>
+      </w:r>
+      <w:r>
+        <w:rPr>
+          <w:rStyle w:val="FunctionTok"/>
+        </w:rPr>
+        <w:t xml:space="preserve">c</w:t>
+      </w:r>
+      <w:r>
+        <w:rPr>
+          <w:rStyle w:val="NormalTok"/>
+        </w:rPr>
+        <w:t xml:space="preserve">(</w:t>
+      </w:r>
+      <w:r>
+        <w:rPr>
+          <w:rStyle w:val="StringTok"/>
+        </w:rPr>
+        <w:t xml:space="preserve">"IV"</w:t>
+      </w:r>
+      <w:r>
+        <w:rPr>
+          <w:rStyle w:val="NormalTok"/>
+        </w:rPr>
+        <w:t xml:space="preserve">, </w:t>
+      </w:r>
+      <w:r>
+        <w:rPr>
+          <w:rStyle w:val="StringTok"/>
+        </w:rPr>
+        <w:t xml:space="preserve">"IIIa"</w:t>
+      </w:r>
+      <w:r>
+        <w:rPr>
+          <w:rStyle w:val="NormalTok"/>
+        </w:rPr>
+        <w:t xml:space="preserve">, </w:t>
+      </w:r>
+      <w:r>
+        <w:rPr>
+          <w:rStyle w:val="StringTok"/>
+        </w:rPr>
+        <w:t xml:space="preserve">"IIIb"</w:t>
+      </w:r>
+      <w:r>
+        <w:rPr>
+          <w:rStyle w:val="NormalTok"/>
+        </w:rPr>
+        <w:t xml:space="preserve">, </w:t>
+      </w:r>
+      <w:r>
+        <w:rPr>
+          <w:rStyle w:val="StringTok"/>
+        </w:rPr>
+        <w:t xml:space="preserve">"Iid"</w:t>
+      </w:r>
+      <w:r>
+        <w:rPr>
+          <w:rStyle w:val="NormalTok"/>
+        </w:rPr>
+        <w:t xml:space="preserve">, </w:t>
+      </w:r>
+      <w:r>
+        <w:rPr>
+          <w:rStyle w:val="StringTok"/>
+        </w:rPr>
+        <w:t xml:space="preserve">"Iida"</w:t>
+      </w:r>
+      <w:r>
+        <w:rPr>
+          <w:rStyle w:val="NormalTok"/>
+        </w:rPr>
+        <w:t xml:space="preserve">, </w:t>
+      </w:r>
+      <w:r>
+        <w:rPr>
+          <w:rStyle w:val="StringTok"/>
+        </w:rPr>
+        <w:t xml:space="preserve">"Iie"</w:t>
+      </w:r>
+      <w:r>
+        <w:rPr>
+          <w:rStyle w:val="NormalTok"/>
+        </w:rPr>
+        <w:t xml:space="preserve">) </w:t>
+      </w:r>
+      <w:r>
+        <w:rPr>
+          <w:rStyle w:val="SpecialCharTok"/>
+        </w:rPr>
+        <w:t xml:space="preserve">~</w:t>
+      </w:r>
+      <w:r>
+        <w:rPr>
+          <w:rStyle w:val="NormalTok"/>
+        </w:rPr>
+        <w:t xml:space="preserve"> </w:t>
+      </w:r>
+      <w:r>
+        <w:rPr>
+          <w:rStyle w:val="StringTok"/>
+        </w:rPr>
+        <w:t xml:space="preserve">"evolved_aurignacian"</w:t>
+      </w:r>
+      <w:r>
+        <w:rPr>
+          <w:rStyle w:val="NormalTok"/>
+        </w:rPr>
+        <w:t xml:space="preserve">,</w:t>
+      </w:r>
+      <w:r>
+        <w:br/>
+      </w:r>
+      <w:r>
+        <w:rPr>
+          <w:rStyle w:val="NormalTok"/>
+        </w:rPr>
+        <w:t xml:space="preserve">    site_name </w:t>
+      </w:r>
+      <w:r>
+        <w:rPr>
+          <w:rStyle w:val="SpecialCharTok"/>
+        </w:rPr>
+        <w:t xml:space="preserve">==</w:t>
+      </w:r>
+      <w:r>
+        <w:rPr>
+          <w:rStyle w:val="NormalTok"/>
+        </w:rPr>
+        <w:t xml:space="preserve"> </w:t>
+      </w:r>
+      <w:r>
+        <w:rPr>
+          <w:rStyle w:val="StringTok"/>
+        </w:rPr>
+        <w:t xml:space="preserve">"Hohle Fels"</w:t>
+      </w:r>
+      <w:r>
+        <w:rPr>
+          <w:rStyle w:val="NormalTok"/>
+        </w:rPr>
+        <w:t xml:space="preserve"> </w:t>
+      </w:r>
+      <w:r>
+        <w:rPr>
+          <w:rStyle w:val="SpecialCharTok"/>
+        </w:rPr>
+        <w:t xml:space="preserve">&amp;</w:t>
+      </w:r>
+      <w:r>
+        <w:rPr>
+          <w:rStyle w:val="NormalTok"/>
+        </w:rPr>
+        <w:t xml:space="preserve"> layer </w:t>
+      </w:r>
+      <w:r>
+        <w:rPr>
+          <w:rStyle w:val="SpecialCharTok"/>
+        </w:rPr>
+        <w:t xml:space="preserve">==</w:t>
+      </w:r>
+      <w:r>
+        <w:rPr>
+          <w:rStyle w:val="NormalTok"/>
+        </w:rPr>
+        <w:t xml:space="preserve"> </w:t>
+      </w:r>
+      <w:r>
+        <w:rPr>
+          <w:rStyle w:val="StringTok"/>
+        </w:rPr>
+        <w:t xml:space="preserve">"IIIa-V"</w:t>
+      </w:r>
+      <w:r>
+        <w:rPr>
+          <w:rStyle w:val="NormalTok"/>
+        </w:rPr>
+        <w:t xml:space="preserve"> </w:t>
+      </w:r>
+      <w:r>
+        <w:rPr>
+          <w:rStyle w:val="SpecialCharTok"/>
+        </w:rPr>
+        <w:t xml:space="preserve">~</w:t>
+      </w:r>
+      <w:r>
+        <w:rPr>
+          <w:rStyle w:val="NormalTok"/>
+        </w:rPr>
+        <w:t xml:space="preserve"> </w:t>
+      </w:r>
+      <w:r>
+        <w:rPr>
+          <w:rStyle w:val="ConstantTok"/>
+        </w:rPr>
+        <w:t xml:space="preserve">NA_character_</w:t>
       </w:r>
       <w:r>
         <w:rPr>
@@ -3647,7 +4079,7 @@
         <w:rPr>
           <w:rStyle w:val="VerbatimChar"/>
         </w:rPr>
-        <w:t xml:space="preserve">1 Aur-P1    20     376</w:t>
+        <w:t xml:space="preserve">1 Aur-P1    20     346</w:t>
       </w:r>
       <w:r>
         <w:br/>
@@ -3656,7 +4088,7 @@
         <w:rPr>
           <w:rStyle w:val="VerbatimChar"/>
         </w:rPr>
-        <w:t xml:space="preserve">2 Aur-P2     8      34</w:t>
+        <w:t xml:space="preserve">2 Aur-P2     9      63</w:t>
       </w:r>
     </w:p>
     <w:p>
@@ -3925,7 +4357,7 @@
         <w:rPr>
           <w:rStyle w:val="StringTok"/>
         </w:rPr>
-        <w:t xml:space="preserve">"Early Aurignacian (Bataille &amp; Conard 2018; Dinnis et al. 2019)"</w:t>
+        <w:t xml:space="preserve">"Layer-level split: AH V Early Aurignacian (Aur-P1); AH IV, III and II-series Evolved/Late Aurignacian (Aur-P2) (Bataille &amp; Conard 2018, 2019; Dinnis et al. 2019)"</w:t>
       </w:r>
       <w:r>
         <w:rPr>
@@ -5083,12 +5515,12 @@
         <w:tblCaption w:val="Retained sites with object counts and assignment basis."/>
       </w:tblPr>
       <w:tblGrid>
-        <w:gridCol w:w="1444"/>
-        <w:gridCol w:w="374"/>
-        <w:gridCol w:w="428"/>
-        <w:gridCol w:w="535"/>
-        <w:gridCol w:w="588"/>
-        <w:gridCol w:w="4548"/>
+        <w:gridCol w:w="950"/>
+        <w:gridCol w:w="246"/>
+        <w:gridCol w:w="281"/>
+        <w:gridCol w:w="352"/>
+        <w:gridCol w:w="387"/>
+        <w:gridCol w:w="5702"/>
       </w:tblGrid>
       <w:tr>
         <w:trPr>
@@ -6088,7 +6520,7 @@
               <w:jc w:val="right"/>
             </w:pPr>
             <w:r>
-              <w:t xml:space="preserve">50</w:t>
+              <w:t xml:space="preserve">20</w:t>
             </w:r>
           </w:p>
         </w:tc>
@@ -6100,7 +6532,7 @@
               <w:jc w:val="right"/>
             </w:pPr>
             <w:r>
-              <w:t xml:space="preserve">37683</w:t>
+              <w:t xml:space="preserve">39718</w:t>
             </w:r>
           </w:p>
         </w:tc>
@@ -6124,7 +6556,81 @@
               <w:jc w:val="left"/>
             </w:pPr>
             <w:r>
-              <w:t xml:space="preserve">Early Aurignacian (Bataille &amp; Conard 2018; Dinnis et al. 2019)</w:t>
+              <w:t xml:space="preserve">Layer-level split: AH V Early Aurignacian (Aur-P1); AH IV, III and II-series Evolved/Late Aurignacian (Aur-P2) (Bataille &amp; Conard 2018, 2019; Dinnis et al. 2019)</w:t>
+            </w:r>
+          </w:p>
+        </w:tc>
+      </w:tr>
+      <w:tr>
+        <w:tc>
+          <w:tcPr/>
+          <w:p>
+            <w:pPr>
+              <w:pStyle w:val="Compact"/>
+              <w:jc w:val="left"/>
+            </w:pPr>
+            <w:r>
+              <w:t xml:space="preserve">Hohle Fels</w:t>
+            </w:r>
+          </w:p>
+        </w:tc>
+        <w:tc>
+          <w:tcPr/>
+          <w:p>
+            <w:pPr>
+              <w:pStyle w:val="Compact"/>
+              <w:jc w:val="left"/>
+            </w:pPr>
+            <w:r>
+              <w:t xml:space="preserve">Aur-P2</w:t>
+            </w:r>
+          </w:p>
+        </w:tc>
+        <w:tc>
+          <w:tcPr/>
+          <w:p>
+            <w:pPr>
+              <w:pStyle w:val="Compact"/>
+              <w:jc w:val="right"/>
+            </w:pPr>
+            <w:r>
+              <w:t xml:space="preserve">29</w:t>
+            </w:r>
+          </w:p>
+        </w:tc>
+        <w:tc>
+          <w:tcPr/>
+          <w:p>
+            <w:pPr>
+              <w:pStyle w:val="Compact"/>
+              <w:jc w:val="right"/>
+            </w:pPr>
+            <w:r>
+              <w:t xml:space="preserve">35538</w:t>
+            </w:r>
+          </w:p>
+        </w:tc>
+        <w:tc>
+          <w:tcPr/>
+          <w:p>
+            <w:pPr>
+              <w:pStyle w:val="Compact"/>
+              <w:jc w:val="left"/>
+            </w:pPr>
+            <w:r>
+              <w:t xml:space="preserve">technology</w:t>
+            </w:r>
+          </w:p>
+        </w:tc>
+        <w:tc>
+          <w:tcPr/>
+          <w:p>
+            <w:pPr>
+              <w:pStyle w:val="Compact"/>
+              <w:jc w:val="left"/>
+            </w:pPr>
+            <w:r>
+              <w:t xml:space="preserve">Layer-level split: AH V Early Aurignacian (Aur-P1); AH IV, III and II-series Evolved/Late Aurignacian (Aur-P2) (Bataille &amp; Conard 2018, 2019; Dinnis et al. 2019)</w:t>
             </w:r>
           </w:p>
         </w:tc>
@@ -7885,7 +8391,7 @@
       </w:r>
     </w:p>
     <w:bookmarkEnd w:id="21"/>
-    <w:bookmarkStart w:id="31" w:name="key-literature-findings"/>
+    <w:bookmarkStart w:id="32" w:name="key-literature-findings"/>
     <w:p>
       <w:pPr>
         <w:pStyle w:val="Heading2"/>
@@ -7894,13 +8400,21 @@
         <w:t xml:space="preserve">Key literature findings</w:t>
       </w:r>
     </w:p>
-    <w:bookmarkStart w:id="22" w:name="hohle-fels-early-aurignacian"/>
+    <w:bookmarkStart w:id="22" w:name="Xaa48a3383dbb317aa56ed49af9ef72d79b6a3c9"/>
     <w:p>
       <w:pPr>
         <w:pStyle w:val="Heading3"/>
       </w:pPr>
       <w:r>
-        <w:t xml:space="preserve">Hohle Fels → Early Aurignacian</w:t>
+        <w:t xml:space="preserve">Hohle Fels → layer-level assignment (AH V Early; AH IV, III, II-series Evolved)</w:t>
+      </w:r>
+    </w:p>
+    <w:p>
+      <w:pPr>
+        <w:pStyle w:val="FirstParagraph"/>
+      </w:pPr>
+      <w:r>
+        <w:t xml:space="preserve">Hohle Fels is the only site in the dataset whose internal sequence warrants splitting the phase assignment at the layer level rather than treating the whole site as a single phase.</w:t>
       </w:r>
     </w:p>
     <w:p>
@@ -7930,7 +8444,7 @@
         <w:t xml:space="preserve"> </w:t>
       </w:r>
       <w:r>
-        <w:t xml:space="preserve">with burin-core bladelet production; shares features with Early Aurignacian; challenges application of Western European typo-chronological system to Central Europe.</w:t>
+        <w:t xml:space="preserve">with burin-core bladelet production; it shares features with the Early Aurignacian but is compositionally distinct from the underlying AH V assemblage, challenging the straightforward application of the Western European typo-chronological system to Central Europe.</w:t>
       </w:r>
     </w:p>
     <w:p>
@@ -7942,7 +8456,7 @@
         <w:pStyle w:val="Compact"/>
       </w:pPr>
       <w:r>
-        <w:t xml:space="preserve">Bataille &amp; Conard 2019 (Quartär): AH IIIa and IV share similar tool/core assemblages typical of Swabian Aurignacian.</w:t>
+        <w:t xml:space="preserve">Bataille &amp; Conard 2019 (Quartär): AH IIIa and IV share similar tool/core assemblages typical of the Swabian Aurignacian, forming a coherent upper unit that contrasts with AH V.</w:t>
       </w:r>
     </w:p>
     <w:p>
@@ -7969,17 +8483,59 @@
         <w:t xml:space="preserve">”</w:t>
       </w:r>
       <w:r>
-        <w:t xml:space="preserve">; radiocarbon dates of 33–30 ka uncal BP are not older than Western European Late Aurignacian.</w:t>
+        <w:t xml:space="preserve">; its radiocarbon dates of 33–30 ka uncal BP are not older than those of the Western European Late Aurignacian. This is the direct basis for placing AH IV and the overlying III and II-series layers in Aur-P2 (Evolved/Late).</w:t>
+      </w:r>
+    </w:p>
+    <w:p>
+      <w:pPr>
+        <w:numPr>
+          <w:ilvl w:val="0"/>
+          <w:numId w:val="1001"/>
+        </w:numPr>
+        <w:pStyle w:val="Compact"/>
+      </w:pPr>
+      <w:r>
+        <w:t xml:space="preserve">AH V (Va, Vaa, Vab, Vb) is the earlier Aurignacian unit at Hohle Fels and is retained in Aur-P1 (Early Aurignacian); its calibrated median dates (~39.7–43.3 ka BP) are consistent with that placement.</w:t>
+      </w:r>
+    </w:p>
+    <w:p>
+      <w:pPr>
+        <w:numPr>
+          <w:ilvl w:val="0"/>
+          <w:numId w:val="1001"/>
+        </w:numPr>
+        <w:pStyle w:val="Compact"/>
+      </w:pPr>
+      <w:r>
+        <w:t xml:space="preserve">The single object recorded from the mixed layer</w:t>
+      </w:r>
+      <w:r>
+        <w:t xml:space="preserve"> </w:t>
+      </w:r>
+      <w:r>
+        <w:t xml:space="preserve">“</w:t>
+      </w:r>
+      <w:r>
+        <w:t xml:space="preserve">IIIa-V</w:t>
+      </w:r>
+      <w:r>
+        <w:t xml:space="preserve">”</w:t>
+      </w:r>
+      <w:r>
+        <w:t xml:space="preserve"> </w:t>
+      </w:r>
+      <w:r>
+        <w:t xml:space="preserve">spans the whole Aurignacian sequence and is therefore excluded from the analysis, in line with the treatment of the mixed-assemblage sites Spy and El Castillo.</w:t>
       </w:r>
     </w:p>
     <w:bookmarkEnd w:id="22"/>
-    <w:bookmarkStart w:id="23" w:name="vogelherd-early-aurignacian"/>
+    <w:bookmarkStart w:id="23" w:name="X929d947406c212d8f968cd52856f51a1bb90040"/>
     <w:p>
       <w:pPr>
         <w:pStyle w:val="Heading3"/>
       </w:pPr>
       <w:r>
-        <w:t xml:space="preserve">Vogelherd → Early Aurignacian</w:t>
+        <w:t xml:space="preserve">Geissenklösterle → Early Aurignacian (Aur-P1)</w:t>
       </w:r>
     </w:p>
     <w:p>
@@ -7991,7 +8547,7 @@
         <w:pStyle w:val="Compact"/>
       </w:pPr>
       <w:r>
-        <w:t xml:space="preserve">Schürch &amp; Conard 2026 (JPA): Reassesses cultural stratigraphy; AH IV–V are Aurignacian but with severe mixing (38 refit connections between layers); 15 radiocarbon dates span 42–34.5 ka BP (calibrated); Gravettian also present.</w:t>
+        <w:t xml:space="preserve">Bataille &amp; Conard 2018 (PLoS ONE): The Geissenklösterle Aurignacian (AH III and II) is assigned to the Early Aurignacian on technological grounds.</w:t>
       </w:r>
     </w:p>
     <w:p>
@@ -8003,29 +8559,41 @@
         <w:pStyle w:val="Compact"/>
       </w:pPr>
       <w:r>
-        <w:t xml:space="preserve">Schürch et al. 2025 (PLoS ONE): Blade/bladelet production analysis; mixing documented but majority of artifacts are Aurignacian.</w:t>
-      </w:r>
-    </w:p>
-    <w:p>
-      <w:pPr>
-        <w:numPr>
-          <w:ilvl w:val="0"/>
-          <w:numId w:val="1002"/>
-        </w:numPr>
-        <w:pStyle w:val="Compact"/>
-      </w:pPr>
-      <w:r>
-        <w:t xml:space="preserve">Conard &amp; Bolus 2003, 2008: Original dating of Vogelherd Aurignacian to 41–35 ka BP (calibrated).</w:t>
+        <w:t xml:space="preserve">Both Geissenklösterle layers remain in Aur-P1: the calibrated median dates of the SignBase radiocarbon determinations for AH II (~40.7 ka BP) and AH III (~42.7 ka BP) fall within the Aur-P1 range, so the technology- and date-based assignments agree for this site. A minority reassessment (Zilhão 2013) places AH III later (~33–35 ka BP), but this conflicts with the site’s own radiocarbon chronology and is not adopted here; the weight of the technological and stratigraphic evidence keeps both layers in Aur-P1.</w:t>
       </w:r>
     </w:p>
     <w:bookmarkEnd w:id="23"/>
-    <w:bookmarkStart w:id="24" w:name="fumane-protoaurignacian"/>
+    <w:bookmarkStart w:id="24" w:name="Xeaab8167c3763f4e7d6b9af5f079d3bf695d673"/>
     <w:p>
       <w:pPr>
         <w:pStyle w:val="Heading3"/>
       </w:pPr>
       <w:r>
-        <w:t xml:space="preserve">Fumane → Protoaurignacian</w:t>
+        <w:t xml:space="preserve">Vogelherd → Early Aurignacian (Aur-P1, site-level)</w:t>
+      </w:r>
+    </w:p>
+    <w:p>
+      <w:pPr>
+        <w:pStyle w:val="FirstParagraph"/>
+      </w:pPr>
+      <w:r>
+        <w:t xml:space="preserve">Vogelherd is kept as a single site-level Aur-P1 unit rather than split by layer: unlike Hohle Fels, its documented mixing is</w:t>
+      </w:r>
+      <w:r>
+        <w:t xml:space="preserve"> </w:t>
+      </w:r>
+      <w:r>
+        <w:rPr>
+          <w:iCs/>
+          <w:i/>
+        </w:rPr>
+        <w:t xml:space="preserve">between</w:t>
+      </w:r>
+      <w:r>
+        <w:t xml:space="preserve"> </w:t>
+      </w:r>
+      <w:r>
+        <w:t xml:space="preserve">the Aurignacian and other technocomplexes (Gravettian, Magdalenian), not between Aur-P1 and Aur-P2 Aurignacian facies, so no layer-level phase boundary can be drawn from the published reassessments. The mixing concern is instead addressed directly in Supplement S8 Analysis B (exclusion of Vogelherd).</w:t>
       </w:r>
     </w:p>
     <w:p>
@@ -8037,7 +8605,7 @@
         <w:pStyle w:val="Compact"/>
       </w:pPr>
       <w:r>
-        <w:t xml:space="preserve">Falcucci et al. 2017 (PLoS ONE): Protoaurignacian techno-typology persists throughout sequence at Fumane (A2-A1 through D3).</w:t>
+        <w:t xml:space="preserve">Schürch &amp; Conard 2026 (JPA): Reassesses cultural stratigraphy; AH IV–V are Aurignacian but with severe mixing (38 refit connections between layers); 15 radiocarbon dates span 42–34.5 ka BP (calibrated); Gravettian also present.</w:t>
       </w:r>
     </w:p>
     <w:p>
@@ -8049,19 +8617,7 @@
         <w:pStyle w:val="Compact"/>
       </w:pPr>
       <w:r>
-        <w:t xml:space="preserve">Falcucci et al. 2020 (JASS):</w:t>
-      </w:r>
-      <w:r>
-        <w:t xml:space="preserve"> </w:t>
-      </w:r>
-      <w:r>
-        <w:t xml:space="preserve">“</w:t>
-      </w:r>
-      <w:r>
-        <w:t xml:space="preserve">Features of the Protoaurignacian techno-typology are present throughout the stratigraphic sequence.</w:t>
-      </w:r>
-      <w:r>
-        <w:t xml:space="preserve">”</w:t>
+        <w:t xml:space="preserve">Schürch et al. 2025 (PLoS ONE): Blade/bladelet production analysis; mixing documented but majority of artifacts are Aurignacian.</w:t>
       </w:r>
     </w:p>
     <w:p>
@@ -8073,29 +8629,17 @@
         <w:pStyle w:val="Compact"/>
       </w:pPr>
       <w:r>
-        <w:t xml:space="preserve">Falcucci 2018 (MGFu):</w:t>
-      </w:r>
-      <w:r>
-        <w:t xml:space="preserve"> </w:t>
-      </w:r>
-      <w:r>
-        <w:t xml:space="preserve">“</w:t>
-      </w:r>
-      <w:r>
-        <w:t xml:space="preserve">Protoaurignacian clearly persists throughout the stratigraphic sequence.</w:t>
-      </w:r>
-      <w:r>
-        <w:t xml:space="preserve">”</w:t>
+        <w:t xml:space="preserve">Conard &amp; Bolus 2003, 2008: Original dating of Vogelherd Aurignacian to 41–35 ka BP (calibrated).</w:t>
       </w:r>
     </w:p>
     <w:bookmarkEnd w:id="24"/>
-    <w:bookmarkStart w:id="25" w:name="la-ferrassie-early-aurignacian"/>
+    <w:bookmarkStart w:id="25" w:name="fumane-protoaurignacian"/>
     <w:p>
       <w:pPr>
         <w:pStyle w:val="Heading3"/>
       </w:pPr>
       <w:r>
-        <w:t xml:space="preserve">La Ferrassie → Early Aurignacian</w:t>
+        <w:t xml:space="preserve">Fumane → Protoaurignacian</w:t>
       </w:r>
     </w:p>
     <w:p>
@@ -8107,17 +8651,65 @@
         <w:pStyle w:val="Compact"/>
       </w:pPr>
       <w:r>
-        <w:t xml:space="preserve">Talamo et al. 2020: Technological attribution places La Ferrassie in the Early Aurignacian.</w:t>
+        <w:t xml:space="preserve">Falcucci et al. 2017 (PLoS ONE): Protoaurignacian techno-typology persists throughout sequence at Fumane (A2-A1 through D3).</w:t>
+      </w:r>
+    </w:p>
+    <w:p>
+      <w:pPr>
+        <w:numPr>
+          <w:ilvl w:val="0"/>
+          <w:numId w:val="1004"/>
+        </w:numPr>
+        <w:pStyle w:val="Compact"/>
+      </w:pPr>
+      <w:r>
+        <w:t xml:space="preserve">Falcucci et al. 2020 (JASS):</w:t>
+      </w:r>
+      <w:r>
+        <w:t xml:space="preserve"> </w:t>
+      </w:r>
+      <w:r>
+        <w:t xml:space="preserve">“</w:t>
+      </w:r>
+      <w:r>
+        <w:t xml:space="preserve">Features of the Protoaurignacian techno-typology are present throughout the stratigraphic sequence.</w:t>
+      </w:r>
+      <w:r>
+        <w:t xml:space="preserve">”</w:t>
+      </w:r>
+    </w:p>
+    <w:p>
+      <w:pPr>
+        <w:numPr>
+          <w:ilvl w:val="0"/>
+          <w:numId w:val="1004"/>
+        </w:numPr>
+        <w:pStyle w:val="Compact"/>
+      </w:pPr>
+      <w:r>
+        <w:t xml:space="preserve">Falcucci 2018 (MGFu):</w:t>
+      </w:r>
+      <w:r>
+        <w:t xml:space="preserve"> </w:t>
+      </w:r>
+      <w:r>
+        <w:t xml:space="preserve">“</w:t>
+      </w:r>
+      <w:r>
+        <w:t xml:space="preserve">Protoaurignacian clearly persists throughout the stratigraphic sequence.</w:t>
+      </w:r>
+      <w:r>
+        <w:t xml:space="preserve">”</w:t>
       </w:r>
     </w:p>
     <w:bookmarkEnd w:id="25"/>
-    <w:bookmarkStart w:id="26" w:name="abri-pataud-early-aurignacian"/>
+    <w:bookmarkStart w:id="26" w:name="la-ferrassie-early-aurignacian"/>
     <w:p>
       <w:pPr>
         <w:pStyle w:val="Heading3"/>
       </w:pPr>
       <w:r>
-        <w:t xml:space="preserve">Abri Pataud → Early Aurignacian</w:t>
+        <w:t xml:space="preserve">La Ferrassie → Early Aurignacian</w:t>
       </w:r>
     </w:p>
     <w:p>
@@ -8129,29 +8721,17 @@
         <w:pStyle w:val="Compact"/>
       </w:pPr>
       <w:r>
-        <w:t xml:space="preserve">Chiotti 2005: Technological analysis assigns Abri Pataud to the Early Aurignacian.</w:t>
-      </w:r>
-    </w:p>
-    <w:p>
-      <w:pPr>
-        <w:numPr>
-          <w:ilvl w:val="0"/>
-          <w:numId w:val="1005"/>
-        </w:numPr>
-        <w:pStyle w:val="Compact"/>
-      </w:pPr>
-      <w:r>
-        <w:t xml:space="preserve">Higham et al. 2011: Radiocarbon dating supports Early Aurignacian placement.</w:t>
+        <w:t xml:space="preserve">Talamo et al. 2020: Technological attribution places La Ferrassie in the Early Aurignacian.</w:t>
       </w:r>
     </w:p>
     <w:bookmarkEnd w:id="26"/>
-    <w:bookmarkStart w:id="27" w:name="mladeč-evolved-aurignacian"/>
+    <w:bookmarkStart w:id="27" w:name="abri-pataud-early-aurignacian"/>
     <w:p>
       <w:pPr>
         <w:pStyle w:val="Heading3"/>
       </w:pPr>
       <w:r>
-        <w:t xml:space="preserve">Mladeč → Evolved Aurignacian</w:t>
+        <w:t xml:space="preserve">Abri Pataud → Early Aurignacian</w:t>
       </w:r>
     </w:p>
     <w:p>
@@ -8163,17 +8743,29 @@
         <w:pStyle w:val="Compact"/>
       </w:pPr>
       <w:r>
-        <w:t xml:space="preserve">Oliva 2006: Technological and typological analysis assigns Mladeč to the Evolved Aurignacian.</w:t>
+        <w:t xml:space="preserve">Chiotti 2005: Technological analysis assigns Abri Pataud to the Early Aurignacian.</w:t>
+      </w:r>
+    </w:p>
+    <w:p>
+      <w:pPr>
+        <w:numPr>
+          <w:ilvl w:val="0"/>
+          <w:numId w:val="1006"/>
+        </w:numPr>
+        <w:pStyle w:val="Compact"/>
+      </w:pPr>
+      <w:r>
+        <w:t xml:space="preserve">Higham et al. 2011: Radiocarbon dating supports Early Aurignacian placement.</w:t>
       </w:r>
     </w:p>
     <w:bookmarkEnd w:id="27"/>
-    <w:bookmarkStart w:id="28" w:name="spy-excluded"/>
+    <w:bookmarkStart w:id="28" w:name="mladeč-evolved-aurignacian"/>
     <w:p>
       <w:pPr>
         <w:pStyle w:val="Heading3"/>
       </w:pPr>
       <w:r>
-        <w:t xml:space="preserve">Spy → Excluded</w:t>
+        <w:t xml:space="preserve">Mladeč → Evolved Aurignacian</w:t>
       </w:r>
     </w:p>
     <w:p>
@@ -8185,83 +8777,17 @@
         <w:pStyle w:val="Compact"/>
       </w:pPr>
       <w:r>
-        <w:t xml:space="preserve">Flas et al. 2013: The Spy Aurignacian assemblage exhibits features of both Early and Late Aurignacian phases. Split-based osseous points suggest Early Aurignacian; small curved bladelets from nosed endscrapers, burins busqués, and Vachons burins suggest Late Aurignacian.</w:t>
-      </w:r>
-    </w:p>
-    <w:p>
-      <w:pPr>
-        <w:numPr>
-          <w:ilvl w:val="0"/>
-          <w:numId w:val="1007"/>
-        </w:numPr>
-        <w:pStyle w:val="Compact"/>
-      </w:pPr>
-      <w:r>
-        <w:t xml:space="preserve">Flas 2015: The Aurignacian at Spy is a mixed assemblage containing a small Early Aurignacian component and several Late Aurignacian components. The earliest convincing Aurignacian date in the region is about 33,000–32,000 BP.</w:t>
-      </w:r>
-    </w:p>
-    <w:p>
-      <w:pPr>
-        <w:numPr>
-          <w:ilvl w:val="0"/>
-          <w:numId w:val="1007"/>
-        </w:numPr>
-        <w:pStyle w:val="Compact"/>
-      </w:pPr>
-      <w:r>
-        <w:t xml:space="preserve">Semal et al. 2009: The Spy Neandertals date to ~36,000 BP, associated with the Lincombian-Ranisian-Jerzmanowician (LRJ). The LRJ and Aurignacian are mixed in the</w:t>
-      </w:r>
-      <w:r>
-        <w:t xml:space="preserve"> </w:t>
-      </w:r>
-      <w:r>
-        <w:t xml:space="preserve">“</w:t>
-      </w:r>
-      <w:r>
-        <w:t xml:space="preserve">deuxième niveau ossifère.</w:t>
-      </w:r>
-      <w:r>
-        <w:t xml:space="preserve">”</w:t>
-      </w:r>
-    </w:p>
-    <w:p>
-      <w:pPr>
-        <w:numPr>
-          <w:ilvl w:val="0"/>
-          <w:numId w:val="1007"/>
-        </w:numPr>
-        <w:pStyle w:val="Compact"/>
-      </w:pPr>
-      <w:r>
-        <w:t xml:space="preserve">The site is heavily mixed: Multiple excavations (1885–1886, 1903–1904, 1952–1960s) with inconsistent methods. The</w:t>
-      </w:r>
-      <w:r>
-        <w:t xml:space="preserve"> </w:t>
-      </w:r>
-      <w:r>
-        <w:t xml:space="preserve">“</w:t>
-      </w:r>
-      <w:r>
-        <w:t xml:space="preserve">deuxième niveau ossifère</w:t>
-      </w:r>
-      <w:r>
-        <w:t xml:space="preserve">”</w:t>
-      </w:r>
-      <w:r>
-        <w:t xml:space="preserve"> </w:t>
-      </w:r>
-      <w:r>
-        <w:t xml:space="preserve">contains Mousterian, LRJ, and Aurignacian materials mixed together.</w:t>
+        <w:t xml:space="preserve">Oliva 2006: Technological and typological analysis assigns Mladeč to the Evolved Aurignacian.</w:t>
       </w:r>
     </w:p>
     <w:bookmarkEnd w:id="28"/>
-    <w:bookmarkStart w:id="29" w:name="gatzarria-proto-aurignacian"/>
+    <w:bookmarkStart w:id="29" w:name="spy-excluded"/>
     <w:p>
       <w:pPr>
         <w:pStyle w:val="Heading3"/>
       </w:pPr>
       <w:r>
-        <w:t xml:space="preserve">Gatzarria → Proto-Aurignacian</w:t>
+        <w:t xml:space="preserve">Spy → Excluded</w:t>
       </w:r>
     </w:p>
     <w:p>
@@ -8273,37 +8799,7 @@
         <w:pStyle w:val="Compact"/>
       </w:pPr>
       <w:r>
-        <w:t xml:space="preserve">Barshay-Szmidt et al. 2012: Layer Cjn2 is a Proto-Aurignacian —</w:t>
-      </w:r>
-      <w:r>
-        <w:t xml:space="preserve"> </w:t>
-      </w:r>
-      <w:r>
-        <w:t xml:space="preserve">“</w:t>
-      </w:r>
-      <w:r>
-        <w:t xml:space="preserve">fits completely within the definition and characterization of the Proto-Aurignacian</w:t>
-      </w:r>
-      <w:r>
-        <w:t xml:space="preserve">”</w:t>
-      </w:r>
-      <w:r>
-        <w:t xml:space="preserve"> </w:t>
-      </w:r>
-      <w:r>
-        <w:t xml:space="preserve">with exclusive blade/bladelet production and Dufour bladelets (sub-type Dufour). Layer Cjn1 may be mixed with Cjn2 and Cbf (Classic Aurignacian). The back of the cave is mixed, but the front zone (</w:t>
-      </w:r>
-      <w:r>
-        <w:t xml:space="preserve">“</w:t>
-      </w:r>
-      <w:r>
-        <w:t xml:space="preserve">sampled set</w:t>
-      </w:r>
-      <w:r>
-        <w:t xml:space="preserve">”</w:t>
-      </w:r>
-      <w:r>
-        <w:t xml:space="preserve">) is internally coherent; refitting confirms minimal vertical displacement.</w:t>
+        <w:t xml:space="preserve">Flas et al. 2013: The Spy Aurignacian assemblage exhibits features of both Early and Late Aurignacian phases. Split-based osseous points suggest Early Aurignacian; small curved bladelets from nosed endscrapers, burins busqués, and Vachons burins suggest Late Aurignacian.</w:t>
       </w:r>
     </w:p>
     <w:p>
@@ -8315,17 +8811,71 @@
         <w:pStyle w:val="Compact"/>
       </w:pPr>
       <w:r>
-        <w:t xml:space="preserve">Deschamps 2019: Confirms complex stratigraphy and mixing concerns, but notes Cjn2 is internally coherent in the anterior zone.</w:t>
+        <w:t xml:space="preserve">Flas 2015: The Aurignacian at Spy is a mixed assemblage containing a small Early Aurignacian component and several Late Aurignacian components. The earliest convincing Aurignacian date in the region is about 33,000–32,000 BP.</w:t>
+      </w:r>
+    </w:p>
+    <w:p>
+      <w:pPr>
+        <w:numPr>
+          <w:ilvl w:val="0"/>
+          <w:numId w:val="1008"/>
+        </w:numPr>
+        <w:pStyle w:val="Compact"/>
+      </w:pPr>
+      <w:r>
+        <w:t xml:space="preserve">Semal et al. 2009: The Spy Neandertals date to ~36,000 BP, associated with the Lincombian-Ranisian-Jerzmanowician (LRJ). The LRJ and Aurignacian are mixed in the</w:t>
+      </w:r>
+      <w:r>
+        <w:t xml:space="preserve"> </w:t>
+      </w:r>
+      <w:r>
+        <w:t xml:space="preserve">“</w:t>
+      </w:r>
+      <w:r>
+        <w:t xml:space="preserve">deuxième niveau ossifère.</w:t>
+      </w:r>
+      <w:r>
+        <w:t xml:space="preserve">”</w:t>
+      </w:r>
+    </w:p>
+    <w:p>
+      <w:pPr>
+        <w:numPr>
+          <w:ilvl w:val="0"/>
+          <w:numId w:val="1008"/>
+        </w:numPr>
+        <w:pStyle w:val="Compact"/>
+      </w:pPr>
+      <w:r>
+        <w:t xml:space="preserve">The site is heavily mixed: Multiple excavations (1885–1886, 1903–1904, 1952–1960s) with inconsistent methods. The</w:t>
+      </w:r>
+      <w:r>
+        <w:t xml:space="preserve"> </w:t>
+      </w:r>
+      <w:r>
+        <w:t xml:space="preserve">“</w:t>
+      </w:r>
+      <w:r>
+        <w:t xml:space="preserve">deuxième niveau ossifère</w:t>
+      </w:r>
+      <w:r>
+        <w:t xml:space="preserve">”</w:t>
+      </w:r>
+      <w:r>
+        <w:t xml:space="preserve"> </w:t>
+      </w:r>
+      <w:r>
+        <w:t xml:space="preserve">contains Mousterian, LRJ, and Aurignacian materials mixed together.</w:t>
       </w:r>
     </w:p>
     <w:bookmarkEnd w:id="29"/>
-    <w:bookmarkStart w:id="30" w:name="el-castillo-excluded"/>
+    <w:bookmarkStart w:id="30" w:name="gatzarria-proto-aurignacian"/>
     <w:p>
       <w:pPr>
         <w:pStyle w:val="Heading3"/>
       </w:pPr>
       <w:r>
-        <w:t xml:space="preserve">El Castillo → Excluded</w:t>
+        <w:t xml:space="preserve">Gatzarria → Proto-Aurignacian</w:t>
       </w:r>
     </w:p>
     <w:p>
@@ -8337,12 +8887,76 @@
         <w:pStyle w:val="Compact"/>
       </w:pPr>
       <w:r>
-        <w:t xml:space="preserve">Mixed/contaminated layers preclude reliable phase assignment.</w:t>
+        <w:t xml:space="preserve">Barshay-Szmidt et al. 2012: Layer Cjn2 is a Proto-Aurignacian —</w:t>
+      </w:r>
+      <w:r>
+        <w:t xml:space="preserve"> </w:t>
+      </w:r>
+      <w:r>
+        <w:t xml:space="preserve">“</w:t>
+      </w:r>
+      <w:r>
+        <w:t xml:space="preserve">fits completely within the definition and characterization of the Proto-Aurignacian</w:t>
+      </w:r>
+      <w:r>
+        <w:t xml:space="preserve">”</w:t>
+      </w:r>
+      <w:r>
+        <w:t xml:space="preserve"> </w:t>
+      </w:r>
+      <w:r>
+        <w:t xml:space="preserve">with exclusive blade/bladelet production and Dufour bladelets (sub-type Dufour). Layer Cjn1 may be mixed with Cjn2 and Cbf (Classic Aurignacian). The back of the cave is mixed, but the front zone (</w:t>
+      </w:r>
+      <w:r>
+        <w:t xml:space="preserve">“</w:t>
+      </w:r>
+      <w:r>
+        <w:t xml:space="preserve">sampled set</w:t>
+      </w:r>
+      <w:r>
+        <w:t xml:space="preserve">”</w:t>
+      </w:r>
+      <w:r>
+        <w:t xml:space="preserve">) is internally coherent; refitting confirms minimal vertical displacement.</w:t>
+      </w:r>
+    </w:p>
+    <w:p>
+      <w:pPr>
+        <w:numPr>
+          <w:ilvl w:val="0"/>
+          <w:numId w:val="1009"/>
+        </w:numPr>
+        <w:pStyle w:val="Compact"/>
+      </w:pPr>
+      <w:r>
+        <w:t xml:space="preserve">Deschamps 2019: Confirms complex stratigraphy and mixing concerns, but notes Cjn2 is internally coherent in the anterior zone.</w:t>
       </w:r>
     </w:p>
     <w:bookmarkEnd w:id="30"/>
+    <w:bookmarkStart w:id="31" w:name="el-castillo-excluded"/>
+    <w:p>
+      <w:pPr>
+        <w:pStyle w:val="Heading3"/>
+      </w:pPr>
+      <w:r>
+        <w:t xml:space="preserve">El Castillo → Excluded</w:t>
+      </w:r>
+    </w:p>
+    <w:p>
+      <w:pPr>
+        <w:numPr>
+          <w:ilvl w:val="0"/>
+          <w:numId w:val="1010"/>
+        </w:numPr>
+        <w:pStyle w:val="Compact"/>
+      </w:pPr>
+      <w:r>
+        <w:t xml:space="preserve">Mixed/contaminated layers preclude reliable phase assignment.</w:t>
+      </w:r>
+    </w:p>
     <w:bookmarkEnd w:id="31"/>
-    <w:bookmarkStart w:id="44" w:name="site-status-table"/>
+    <w:bookmarkEnd w:id="32"/>
+    <w:bookmarkStart w:id="45" w:name="site-status-table"/>
     <w:p>
       <w:pPr>
         <w:pStyle w:val="Heading2"/>
@@ -8388,10 +9002,10 @@
           <w:bCs/>
           <w:b/>
         </w:rPr>
-        <w:t xml:space="preserve">28 sites carrying 410 objects across 7 countries</w:t>
-      </w:r>
-      <w:r>
-        <w:t xml:space="preserve">: Aur-P1 (Proto/Early) has 20 sites and 376 objects, Aur-P2 (Evolved/Late) has 8 sites and 34 objects.</w:t>
+        <w:t xml:space="preserve">28 sites carrying 409 objects across 7 countries</w:t>
+      </w:r>
+      <w:r>
+        <w:t xml:space="preserve">: Aur-P1 (Proto/Early) has 20 sites and 346 objects, Aur-P2 (Evolved/Late) has 9 sites and 63 objects.</w:t>
       </w:r>
     </w:p>
     <w:p>
@@ -8945,7 +9559,7 @@
               <w:jc w:val="right"/>
             </w:pPr>
             <w:r>
-              <w:t xml:space="preserve">50</w:t>
+              <w:t xml:space="preserve">20</w:t>
             </w:r>
           </w:p>
         </w:tc>
@@ -8959,19 +9573,19 @@
               <w:jc w:val="left"/>
             </w:pPr>
             <w:r>
-              <w:t xml:space="preserve">Hohlenstein-Stadel</w:t>
-            </w:r>
-          </w:p>
-        </w:tc>
-        <w:tc>
-          <w:tcPr/>
-          <w:p>
-            <w:pPr>
-              <w:pStyle w:val="Compact"/>
-              <w:jc w:val="left"/>
-            </w:pPr>
-            <w:r>
-              <w:t xml:space="preserve">Aur-P1</w:t>
+              <w:t xml:space="preserve">Hohle Fels</w:t>
+            </w:r>
+          </w:p>
+        </w:tc>
+        <w:tc>
+          <w:tcPr/>
+          <w:p>
+            <w:pPr>
+              <w:pStyle w:val="Compact"/>
+              <w:jc w:val="left"/>
+            </w:pPr>
+            <w:r>
+              <w:t xml:space="preserve">Aur-P2</w:t>
             </w:r>
           </w:p>
         </w:tc>
@@ -8983,7 +9597,7 @@
               <w:jc w:val="right"/>
             </w:pPr>
             <w:r>
-              <w:t xml:space="preserve">2</w:t>
+              <w:t xml:space="preserve">29</w:t>
             </w:r>
           </w:p>
         </w:tc>
@@ -8997,7 +9611,7 @@
               <w:jc w:val="left"/>
             </w:pPr>
             <w:r>
-              <w:t xml:space="preserve">La Ferrassie</w:t>
+              <w:t xml:space="preserve">Hohlenstein-Stadel</w:t>
             </w:r>
           </w:p>
         </w:tc>
@@ -9021,7 +9635,7 @@
               <w:jc w:val="right"/>
             </w:pPr>
             <w:r>
-              <w:t xml:space="preserve">22</w:t>
+              <w:t xml:space="preserve">2</w:t>
             </w:r>
           </w:p>
         </w:tc>
@@ -9035,19 +9649,19 @@
               <w:jc w:val="left"/>
             </w:pPr>
             <w:r>
-              <w:t xml:space="preserve">La Viña</w:t>
-            </w:r>
-          </w:p>
-        </w:tc>
-        <w:tc>
-          <w:tcPr/>
-          <w:p>
-            <w:pPr>
-              <w:pStyle w:val="Compact"/>
-              <w:jc w:val="left"/>
-            </w:pPr>
-            <w:r>
-              <w:t xml:space="preserve">Aur-P2</w:t>
+              <w:t xml:space="preserve">La Ferrassie</w:t>
+            </w:r>
+          </w:p>
+        </w:tc>
+        <w:tc>
+          <w:tcPr/>
+          <w:p>
+            <w:pPr>
+              <w:pStyle w:val="Compact"/>
+              <w:jc w:val="left"/>
+            </w:pPr>
+            <w:r>
+              <w:t xml:space="preserve">Aur-P1</w:t>
             </w:r>
           </w:p>
         </w:tc>
@@ -9059,7 +9673,7 @@
               <w:jc w:val="right"/>
             </w:pPr>
             <w:r>
-              <w:t xml:space="preserve">1</w:t>
+              <w:t xml:space="preserve">22</w:t>
             </w:r>
           </w:p>
         </w:tc>
@@ -9073,19 +9687,19 @@
               <w:jc w:val="left"/>
             </w:pPr>
             <w:r>
-              <w:t xml:space="preserve">Labeko Koba</w:t>
-            </w:r>
-          </w:p>
-        </w:tc>
-        <w:tc>
-          <w:tcPr/>
-          <w:p>
-            <w:pPr>
-              <w:pStyle w:val="Compact"/>
-              <w:jc w:val="left"/>
-            </w:pPr>
-            <w:r>
-              <w:t xml:space="preserve">Aur-P1</w:t>
+              <w:t xml:space="preserve">La Viña</w:t>
+            </w:r>
+          </w:p>
+        </w:tc>
+        <w:tc>
+          <w:tcPr/>
+          <w:p>
+            <w:pPr>
+              <w:pStyle w:val="Compact"/>
+              <w:jc w:val="left"/>
+            </w:pPr>
+            <w:r>
+              <w:t xml:space="preserve">Aur-P2</w:t>
             </w:r>
           </w:p>
         </w:tc>
@@ -9097,7 +9711,7 @@
               <w:jc w:val="right"/>
             </w:pPr>
             <w:r>
-              <w:t xml:space="preserve">2</w:t>
+              <w:t xml:space="preserve">1</w:t>
             </w:r>
           </w:p>
         </w:tc>
@@ -9111,7 +9725,7 @@
               <w:jc w:val="left"/>
             </w:pPr>
             <w:r>
-              <w:t xml:space="preserve">Les Cottés</w:t>
+              <w:t xml:space="preserve">Labeko Koba</w:t>
             </w:r>
           </w:p>
         </w:tc>
@@ -9149,19 +9763,19 @@
               <w:jc w:val="left"/>
             </w:pPr>
             <w:r>
-              <w:t xml:space="preserve">Les Rois</w:t>
-            </w:r>
-          </w:p>
-        </w:tc>
-        <w:tc>
-          <w:tcPr/>
-          <w:p>
-            <w:pPr>
-              <w:pStyle w:val="Compact"/>
-              <w:jc w:val="left"/>
-            </w:pPr>
-            <w:r>
-              <w:t xml:space="preserve">Aur-P2</w:t>
+              <w:t xml:space="preserve">Les Cottés</w:t>
+            </w:r>
+          </w:p>
+        </w:tc>
+        <w:tc>
+          <w:tcPr/>
+          <w:p>
+            <w:pPr>
+              <w:pStyle w:val="Compact"/>
+              <w:jc w:val="left"/>
+            </w:pPr>
+            <w:r>
+              <w:t xml:space="preserve">Aur-P1</w:t>
             </w:r>
           </w:p>
         </w:tc>
@@ -9173,7 +9787,7 @@
               <w:jc w:val="right"/>
             </w:pPr>
             <w:r>
-              <w:t xml:space="preserve">1</w:t>
+              <w:t xml:space="preserve">2</w:t>
             </w:r>
           </w:p>
         </w:tc>
@@ -9187,7 +9801,7 @@
               <w:jc w:val="left"/>
             </w:pPr>
             <w:r>
-              <w:t xml:space="preserve">Mladeč</w:t>
+              <w:t xml:space="preserve">Les Rois</w:t>
             </w:r>
           </w:p>
         </w:tc>
@@ -9211,7 +9825,7 @@
               <w:jc w:val="right"/>
             </w:pPr>
             <w:r>
-              <w:t xml:space="preserve">4</w:t>
+              <w:t xml:space="preserve">1</w:t>
             </w:r>
           </w:p>
         </w:tc>
@@ -9225,19 +9839,19 @@
               <w:jc w:val="left"/>
             </w:pPr>
             <w:r>
-              <w:t xml:space="preserve">Pod Hradem</w:t>
-            </w:r>
-          </w:p>
-        </w:tc>
-        <w:tc>
-          <w:tcPr/>
-          <w:p>
-            <w:pPr>
-              <w:pStyle w:val="Compact"/>
-              <w:jc w:val="left"/>
-            </w:pPr>
-            <w:r>
-              <w:t xml:space="preserve">Aur-P1</w:t>
+              <w:t xml:space="preserve">Mladeč</w:t>
+            </w:r>
+          </w:p>
+        </w:tc>
+        <w:tc>
+          <w:tcPr/>
+          <w:p>
+            <w:pPr>
+              <w:pStyle w:val="Compact"/>
+              <w:jc w:val="left"/>
+            </w:pPr>
+            <w:r>
+              <w:t xml:space="preserve">Aur-P2</w:t>
             </w:r>
           </w:p>
         </w:tc>
@@ -9249,7 +9863,7 @@
               <w:jc w:val="right"/>
             </w:pPr>
             <w:r>
-              <w:t xml:space="preserve">1</w:t>
+              <w:t xml:space="preserve">4</w:t>
             </w:r>
           </w:p>
         </w:tc>
@@ -9263,7 +9877,7 @@
               <w:jc w:val="left"/>
             </w:pPr>
             <w:r>
-              <w:t xml:space="preserve">Riparo Bombrini</w:t>
+              <w:t xml:space="preserve">Pod Hradem</w:t>
             </w:r>
           </w:p>
         </w:tc>
@@ -9287,7 +9901,7 @@
               <w:jc w:val="right"/>
             </w:pPr>
             <w:r>
-              <w:t xml:space="preserve">3</w:t>
+              <w:t xml:space="preserve">1</w:t>
             </w:r>
           </w:p>
         </w:tc>
@@ -9301,19 +9915,19 @@
               <w:jc w:val="left"/>
             </w:pPr>
             <w:r>
-              <w:t xml:space="preserve">Sirgenstein Cave</w:t>
-            </w:r>
-          </w:p>
-        </w:tc>
-        <w:tc>
-          <w:tcPr/>
-          <w:p>
-            <w:pPr>
-              <w:pStyle w:val="Compact"/>
-              <w:jc w:val="left"/>
-            </w:pPr>
-            <w:r>
-              <w:t xml:space="preserve">Aur-P2</w:t>
+              <w:t xml:space="preserve">Riparo Bombrini</w:t>
+            </w:r>
+          </w:p>
+        </w:tc>
+        <w:tc>
+          <w:tcPr/>
+          <w:p>
+            <w:pPr>
+              <w:pStyle w:val="Compact"/>
+              <w:jc w:val="left"/>
+            </w:pPr>
+            <w:r>
+              <w:t xml:space="preserve">Aur-P1</w:t>
             </w:r>
           </w:p>
         </w:tc>
@@ -9325,7 +9939,7 @@
               <w:jc w:val="right"/>
             </w:pPr>
             <w:r>
-              <w:t xml:space="preserve">1</w:t>
+              <w:t xml:space="preserve">3</w:t>
             </w:r>
           </w:p>
         </w:tc>
@@ -9339,19 +9953,19 @@
               <w:jc w:val="left"/>
             </w:pPr>
             <w:r>
-              <w:t xml:space="preserve">Solutré</w:t>
-            </w:r>
-          </w:p>
-        </w:tc>
-        <w:tc>
-          <w:tcPr/>
-          <w:p>
-            <w:pPr>
-              <w:pStyle w:val="Compact"/>
-              <w:jc w:val="left"/>
-            </w:pPr>
-            <w:r>
-              <w:t xml:space="preserve">Aur-P1</w:t>
+              <w:t xml:space="preserve">Sirgenstein Cave</w:t>
+            </w:r>
+          </w:p>
+        </w:tc>
+        <w:tc>
+          <w:tcPr/>
+          <w:p>
+            <w:pPr>
+              <w:pStyle w:val="Compact"/>
+              <w:jc w:val="left"/>
+            </w:pPr>
+            <w:r>
+              <w:t xml:space="preserve">Aur-P2</w:t>
             </w:r>
           </w:p>
         </w:tc>
@@ -9363,7 +9977,7 @@
               <w:jc w:val="right"/>
             </w:pPr>
             <w:r>
-              <w:t xml:space="preserve">4</w:t>
+              <w:t xml:space="preserve">1</w:t>
             </w:r>
           </w:p>
         </w:tc>
@@ -9377,19 +9991,19 @@
               <w:jc w:val="left"/>
             </w:pPr>
             <w:r>
-              <w:t xml:space="preserve">Trou Magrite</w:t>
-            </w:r>
-          </w:p>
-        </w:tc>
-        <w:tc>
-          <w:tcPr/>
-          <w:p>
-            <w:pPr>
-              <w:pStyle w:val="Compact"/>
-              <w:jc w:val="left"/>
-            </w:pPr>
-            <w:r>
-              <w:t xml:space="preserve">Aur-P2</w:t>
+              <w:t xml:space="preserve">Solutré</w:t>
+            </w:r>
+          </w:p>
+        </w:tc>
+        <w:tc>
+          <w:tcPr/>
+          <w:p>
+            <w:pPr>
+              <w:pStyle w:val="Compact"/>
+              <w:jc w:val="left"/>
+            </w:pPr>
+            <w:r>
+              <w:t xml:space="preserve">Aur-P1</w:t>
             </w:r>
           </w:p>
         </w:tc>
@@ -9401,7 +10015,7 @@
               <w:jc w:val="right"/>
             </w:pPr>
             <w:r>
-              <w:t xml:space="preserve">12</w:t>
+              <w:t xml:space="preserve">4</w:t>
             </w:r>
           </w:p>
         </w:tc>
@@ -9415,19 +10029,19 @@
               <w:jc w:val="left"/>
             </w:pPr>
             <w:r>
-              <w:t xml:space="preserve">Trou al’Wesse</w:t>
-            </w:r>
-          </w:p>
-        </w:tc>
-        <w:tc>
-          <w:tcPr/>
-          <w:p>
-            <w:pPr>
-              <w:pStyle w:val="Compact"/>
-              <w:jc w:val="left"/>
-            </w:pPr>
-            <w:r>
-              <w:t xml:space="preserve">Aur-P1</w:t>
+              <w:t xml:space="preserve">Trou Magrite</w:t>
+            </w:r>
+          </w:p>
+        </w:tc>
+        <w:tc>
+          <w:tcPr/>
+          <w:p>
+            <w:pPr>
+              <w:pStyle w:val="Compact"/>
+              <w:jc w:val="left"/>
+            </w:pPr>
+            <w:r>
+              <w:t xml:space="preserve">Aur-P2</w:t>
             </w:r>
           </w:p>
         </w:tc>
@@ -9439,7 +10053,7 @@
               <w:jc w:val="right"/>
             </w:pPr>
             <w:r>
-              <w:t xml:space="preserve">1</w:t>
+              <w:t xml:space="preserve">12</w:t>
             </w:r>
           </w:p>
         </w:tc>
@@ -9453,19 +10067,19 @@
               <w:jc w:val="left"/>
             </w:pPr>
             <w:r>
-              <w:t xml:space="preserve">Vindija Cave</w:t>
-            </w:r>
-          </w:p>
-        </w:tc>
-        <w:tc>
-          <w:tcPr/>
-          <w:p>
-            <w:pPr>
-              <w:pStyle w:val="Compact"/>
-              <w:jc w:val="left"/>
-            </w:pPr>
-            <w:r>
-              <w:t xml:space="preserve">Aur-P2</w:t>
+              <w:t xml:space="preserve">Trou al’Wesse</w:t>
+            </w:r>
+          </w:p>
+        </w:tc>
+        <w:tc>
+          <w:tcPr/>
+          <w:p>
+            <w:pPr>
+              <w:pStyle w:val="Compact"/>
+              <w:jc w:val="left"/>
+            </w:pPr>
+            <w:r>
+              <w:t xml:space="preserve">Aur-P1</w:t>
             </w:r>
           </w:p>
         </w:tc>
@@ -9491,6 +10105,44 @@
               <w:jc w:val="left"/>
             </w:pPr>
             <w:r>
+              <w:t xml:space="preserve">Vindija Cave</w:t>
+            </w:r>
+          </w:p>
+        </w:tc>
+        <w:tc>
+          <w:tcPr/>
+          <w:p>
+            <w:pPr>
+              <w:pStyle w:val="Compact"/>
+              <w:jc w:val="left"/>
+            </w:pPr>
+            <w:r>
+              <w:t xml:space="preserve">Aur-P2</w:t>
+            </w:r>
+          </w:p>
+        </w:tc>
+        <w:tc>
+          <w:tcPr/>
+          <w:p>
+            <w:pPr>
+              <w:pStyle w:val="Compact"/>
+              <w:jc w:val="right"/>
+            </w:pPr>
+            <w:r>
+              <w:t xml:space="preserve">1</w:t>
+            </w:r>
+          </w:p>
+        </w:tc>
+      </w:tr>
+      <w:tr>
+        <w:tc>
+          <w:tcPr/>
+          <w:p>
+            <w:pPr>
+              <w:pStyle w:val="Compact"/>
+              <w:jc w:val="left"/>
+            </w:pPr>
+            <w:r>
               <w:t xml:space="preserve">Vogelherd</w:t>
             </w:r>
           </w:p>
@@ -9521,7 +10173,7 @@
         </w:tc>
       </w:tr>
     </w:tbl>
-    <w:bookmarkStart w:id="33" w:name="X2806760d9dbc8bdb45d251bcf5a3a592ba28839"/>
+    <w:bookmarkStart w:id="34" w:name="X2806760d9dbc8bdb45d251bcf5a3a592ba28839"/>
     <w:p>
       <w:pPr>
         <w:pStyle w:val="Heading3"/>
@@ -9552,7 +10204,7 @@
       <w:tr>
         <w:tc>
           <w:tcPr/>
-          <w:bookmarkStart w:id="32" w:name="tbl-tech-aurp1"/>
+          <w:bookmarkStart w:id="33" w:name="tbl-tech-aurp1"/>
           <w:p>
             <w:pPr>
               <w:jc w:val="center"/>
@@ -9575,9 +10227,9 @@
               <w:tblLayout w:type="fixed"/>
             </w:tblPr>
             <w:tblGrid>
-              <w:gridCol w:w="1479"/>
-              <w:gridCol w:w="696"/>
-              <w:gridCol w:w="5744"/>
+              <w:gridCol w:w="720"/>
+              <w:gridCol w:w="338"/>
+              <w:gridCol w:w="6861"/>
             </w:tblGrid>
             <w:tr>
               <w:trPr>
@@ -9674,7 +10326,7 @@
                     <w:jc w:val="center"/>
                   </w:pPr>
                   <w:r>
-                    <w:t xml:space="preserve">Hohle Fels</w:t>
+                    <w:t xml:space="preserve">Geissenklösterle</w:t>
                   </w:r>
                 </w:p>
               </w:tc>
@@ -9687,7 +10339,7 @@
                     <w:jc w:val="center"/>
                   </w:pPr>
                   <w:r>
-                    <w:t xml:space="preserve">50</w:t>
+                    <w:t xml:space="preserve">30</w:t>
                   </w:r>
                 </w:p>
               </w:tc>
@@ -9700,7 +10352,7 @@
                     <w:jc w:val="center"/>
                   </w:pPr>
                   <w:r>
-                    <w:t xml:space="preserve">Early Aurignacian (Bataille &amp; Conard 2018; Dinnis et al. 2019)</w:t>
+                    <w:t xml:space="preserve">Early Aurignacian (Bataille &amp; Conard 2018)</w:t>
                   </w:r>
                 </w:p>
               </w:tc>
@@ -9715,7 +10367,7 @@
                     <w:jc w:val="center"/>
                   </w:pPr>
                   <w:r>
-                    <w:t xml:space="preserve">Geissenklösterle</w:t>
+                    <w:t xml:space="preserve">La Ferrassie</w:t>
                   </w:r>
                 </w:p>
               </w:tc>
@@ -9728,7 +10380,7 @@
                     <w:jc w:val="center"/>
                   </w:pPr>
                   <w:r>
-                    <w:t xml:space="preserve">30</w:t>
+                    <w:t xml:space="preserve">22</w:t>
                   </w:r>
                 </w:p>
               </w:tc>
@@ -9741,7 +10393,7 @@
                     <w:jc w:val="center"/>
                   </w:pPr>
                   <w:r>
-                    <w:t xml:space="preserve">Early Aurignacian (Bataille &amp; Conard 2018)</w:t>
+                    <w:t xml:space="preserve">Early Aurignacian (Talamo et al. 2020)</w:t>
                   </w:r>
                 </w:p>
               </w:tc>
@@ -9756,7 +10408,7 @@
                     <w:jc w:val="center"/>
                   </w:pPr>
                   <w:r>
-                    <w:t xml:space="preserve">La Ferrassie</w:t>
+                    <w:t xml:space="preserve">Hohle Fels</w:t>
                   </w:r>
                 </w:p>
               </w:tc>
@@ -9769,7 +10421,7 @@
                     <w:jc w:val="center"/>
                   </w:pPr>
                   <w:r>
-                    <w:t xml:space="preserve">22</w:t>
+                    <w:t xml:space="preserve">20</w:t>
                   </w:r>
                 </w:p>
               </w:tc>
@@ -9782,7 +10434,7 @@
                     <w:jc w:val="center"/>
                   </w:pPr>
                   <w:r>
-                    <w:t xml:space="preserve">Early Aurignacian (Talamo et al. 2020)</w:t>
+                    <w:t xml:space="preserve">Layer-level split: AH V Early Aurignacian (Aur-P1); AH IV, III and II-series Evolved/Late Aurignacian (Aur-P2) (Bataille &amp; Conard 2018, 2019; Dinnis et al. 2019)</w:t>
                   </w:r>
                 </w:p>
               </w:tc>
@@ -9870,13 +10522,13 @@
               </w:tc>
             </w:tr>
           </w:tbl>
-          <w:bookmarkEnd w:id="32"/>
+          <w:bookmarkEnd w:id="33"/>
           <w:p/>
         </w:tc>
       </w:tr>
     </w:tbl>
-    <w:bookmarkEnd w:id="33"/>
-    <w:bookmarkStart w:id="35" w:name="X076eb53732cccd673d661c39585e38c9b7c9759"/>
+    <w:bookmarkEnd w:id="34"/>
+    <w:bookmarkStart w:id="36" w:name="X076eb53732cccd673d661c39585e38c9b7c9759"/>
     <w:p>
       <w:pPr>
         <w:pStyle w:val="Heading3"/>
@@ -9899,7 +10551,7 @@
       <w:tr>
         <w:tc>
           <w:tcPr/>
-          <w:bookmarkStart w:id="34" w:name="tbl-tech-aurp2"/>
+          <w:bookmarkStart w:id="35" w:name="tbl-tech-aurp2"/>
           <w:p>
             <w:pPr>
               <w:jc w:val="center"/>
@@ -9916,14 +10568,15 @@
           <w:tbl>
             <w:tblPr>
               <w:tblStyle w:val="Table"/>
-              <w:tblW w:type="auto" w:w="0"/>
+              <w:tblW w:type="pct" w:w="5000"/>
               <w:tblLook w:firstRow="1" w:lastRow="0" w:firstColumn="0" w:lastColumn="0" w:noHBand="0" w:noVBand="0" w:val="0020"/>
               <w:jc w:val="start"/>
+              <w:tblLayout w:type="fixed"/>
             </w:tblPr>
             <w:tblGrid>
-              <w:gridCol w:w="2640"/>
-              <w:gridCol w:w="2640"/>
-              <w:gridCol w:w="2640"/>
+              <w:gridCol w:w="481"/>
+              <w:gridCol w:w="350"/>
+              <w:gridCol w:w="7088"/>
             </w:tblGrid>
             <w:tr>
               <w:trPr>
@@ -9979,6 +10632,47 @@
                     <w:jc w:val="center"/>
                   </w:pPr>
                   <w:r>
+                    <w:t xml:space="preserve">Hohle Fels</w:t>
+                  </w:r>
+                </w:p>
+              </w:tc>
+              <w:tc>
+                <w:tcPr/>
+                <w:p>
+                  <w:pPr>
+                    <w:pStyle w:val="Compact"/>
+                    <w:jc w:val="right"/>
+                    <w:jc w:val="center"/>
+                  </w:pPr>
+                  <w:r>
+                    <w:t xml:space="preserve">29</w:t>
+                  </w:r>
+                </w:p>
+              </w:tc>
+              <w:tc>
+                <w:tcPr/>
+                <w:p>
+                  <w:pPr>
+                    <w:pStyle w:val="Compact"/>
+                    <w:jc w:val="left"/>
+                    <w:jc w:val="center"/>
+                  </w:pPr>
+                  <w:r>
+                    <w:t xml:space="preserve">Layer-level split: AH V Early Aurignacian (Aur-P1); AH IV, III and II-series Evolved/Late Aurignacian (Aur-P2) (Bataille &amp; Conard 2018, 2019; Dinnis et al. 2019)</w:t>
+                  </w:r>
+                </w:p>
+              </w:tc>
+            </w:tr>
+            <w:tr>
+              <w:tc>
+                <w:tcPr/>
+                <w:p>
+                  <w:pPr>
+                    <w:pStyle w:val="Compact"/>
+                    <w:jc w:val="left"/>
+                    <w:jc w:val="center"/>
+                  </w:pPr>
+                  <w:r>
                     <w:t xml:space="preserve">Mladeč</w:t>
                   </w:r>
                 </w:p>
@@ -10011,13 +10705,13 @@
               </w:tc>
             </w:tr>
           </w:tbl>
-          <w:bookmarkEnd w:id="34"/>
+          <w:bookmarkEnd w:id="35"/>
           <w:p/>
         </w:tc>
       </w:tr>
     </w:tbl>
-    <w:bookmarkEnd w:id="35"/>
-    <w:bookmarkStart w:id="37" w:name="excluded-due-to-mixing"/>
+    <w:bookmarkEnd w:id="36"/>
+    <w:bookmarkStart w:id="38" w:name="excluded-due-to-mixing"/>
     <w:p>
       <w:pPr>
         <w:pStyle w:val="Heading3"/>
@@ -10040,7 +10734,7 @@
       <w:tr>
         <w:tc>
           <w:tcPr/>
-          <w:bookmarkStart w:id="36" w:name="tbl-excluded"/>
+          <w:bookmarkStart w:id="37" w:name="tbl-excluded"/>
           <w:p>
             <w:pPr>
               <w:jc w:val="center"/>
@@ -10194,13 +10888,13 @@
               </w:tc>
             </w:tr>
           </w:tbl>
-          <w:bookmarkEnd w:id="36"/>
+          <w:bookmarkEnd w:id="37"/>
           <w:p/>
         </w:tc>
       </w:tr>
     </w:tbl>
-    <w:bookmarkEnd w:id="37"/>
-    <w:bookmarkStart w:id="39" w:name="aur-p1-protoearly-date-based-assignment"/>
+    <w:bookmarkEnd w:id="38"/>
+    <w:bookmarkStart w:id="40" w:name="aur-p1-protoearly-date-based-assignment"/>
     <w:p>
       <w:pPr>
         <w:pStyle w:val="Heading3"/>
@@ -10246,7 +10940,7 @@
       <w:tr>
         <w:tc>
           <w:tcPr/>
-          <w:bookmarkStart w:id="38" w:name="tbl-date-aurp1"/>
+          <w:bookmarkStart w:id="39" w:name="tbl-date-aurp1"/>
           <w:p>
             <w:pPr>
               <w:jc w:val="center"/>
@@ -10892,13 +11586,13 @@
               </w:tc>
             </w:tr>
           </w:tbl>
-          <w:bookmarkEnd w:id="38"/>
+          <w:bookmarkEnd w:id="39"/>
           <w:p/>
         </w:tc>
       </w:tr>
     </w:tbl>
-    <w:bookmarkEnd w:id="39"/>
-    <w:bookmarkStart w:id="41" w:name="aur-p2-evolvedlate-date-based-assignment"/>
+    <w:bookmarkEnd w:id="40"/>
+    <w:bookmarkStart w:id="42" w:name="aur-p2-evolvedlate-date-based-assignment"/>
     <w:p>
       <w:pPr>
         <w:pStyle w:val="Heading3"/>
@@ -10921,7 +11615,7 @@
       <w:tr>
         <w:tc>
           <w:tcPr/>
-          <w:bookmarkStart w:id="40" w:name="tbl-date-aurp2"/>
+          <w:bookmarkStart w:id="41" w:name="tbl-date-aurp2"/>
           <w:p>
             <w:pPr>
               <w:jc w:val="center"/>
@@ -11279,13 +11973,13 @@
               </w:tc>
             </w:tr>
           </w:tbl>
-          <w:bookmarkEnd w:id="40"/>
+          <w:bookmarkEnd w:id="41"/>
           <w:p/>
         </w:tc>
       </w:tr>
     </w:tbl>
-    <w:bookmarkEnd w:id="41"/>
-    <w:bookmarkStart w:id="43" w:name="objects-without-geometric-signs"/>
+    <w:bookmarkEnd w:id="42"/>
+    <w:bookmarkStart w:id="44" w:name="objects-without-geometric-signs"/>
     <w:p>
       <w:pPr>
         <w:pStyle w:val="Heading3"/>
@@ -11344,7 +12038,7 @@
       <w:tr>
         <w:tc>
           <w:tcPr/>
-          <w:bookmarkStart w:id="42" w:name="tbl-zero-sign"/>
+          <w:bookmarkStart w:id="43" w:name="tbl-zero-sign"/>
           <w:p>
             <w:pPr>
               <w:jc w:val="center"/>
@@ -12132,7 +12826,7 @@
               </w:tc>
             </w:tr>
           </w:tbl>
-          <w:bookmarkEnd w:id="42"/>
+          <w:bookmarkEnd w:id="43"/>
           <w:p/>
         </w:tc>
       </w:tr>
@@ -12195,8 +12889,8 @@
         <w:t xml:space="preserve">sites are lost at the date-parsing/calibration step rather than because of the zero-sign filter.</w:t>
       </w:r>
     </w:p>
-    <w:bookmarkEnd w:id="43"/>
     <w:bookmarkEnd w:id="44"/>
+    <w:bookmarkEnd w:id="45"/>
     <w:sectPr>
       <w:pgSz w:h="15840" w:w="12240"/>
       <w:pgMar w:bottom="1440" w:footer="720" w:gutter="0" w:header="720" w:left="1440" w:right="1440" w:top="1440"/>
@@ -12700,1086 +13394,13 @@
   <w:num w:numId="1009">
     <w:abstractNumId w:val="991"/>
   </w:num>
+  <w:num w:numId="1010">
+    <w:abstractNumId w:val="991"/>
+  </w:num>
 </w:numbering>
 </file>
 
-<file path=word/styles.xml><?xml version="1.0" encoding="utf-8"?>
-<w:styles xmlns:mc="http://schemas.openxmlformats.org/markup-compatibility/2006" xmlns:r="http://schemas.openxmlformats.org/officeDocument/2006/relationships" xmlns:w="http://schemas.openxmlformats.org/wordprocessingml/2006/main" xmlns:w14="http://schemas.microsoft.com/office/word/2010/wordml" xmlns:w15="http://schemas.microsoft.com/office/word/2012/wordml" xmlns:w16="http://schemas.microsoft.com/office/word/2018/wordml" xmlns:w16cex="http://schemas.microsoft.com/office/word/2018/wordml/cex" xmlns:w16cid="http://schemas.microsoft.com/office/word/2016/wordml/cid" xmlns:w16se="http://schemas.microsoft.com/office/word/2015/wordml/symex" mc:Ignorable="w14 w15 w16se w16cid w16 w16cex">
-  <w:docDefaults>
-    <w:rPrDefault>
-      <w:rPr>
-        <w:rFonts w:asciiTheme="minorHAnsi" w:cstheme="minorBidi" w:eastAsiaTheme="minorHAnsi" w:hAnsiTheme="minorHAnsi"/>
-        <w:sz w:val="24"/>
-        <w:szCs w:val="24"/>
-        <w:lang w:bidi="ar-SA" w:eastAsia="en-US" w:val="en-US"/>
-      </w:rPr>
-    </w:rPrDefault>
-    <w:pPrDefault>
-      <w:pPr>
-        <w:spacing w:after="200"/>
-      </w:pPr>
-    </w:pPrDefault>
-  </w:docDefaults>
-  <w:latentStyles w:count="376" w:defLockedState="0" w:defQFormat="0" w:defSemiHidden="0" w:defUIPriority="0" w:defUnhideWhenUsed="0">
-    <w:lsdException w:name="heading 2" w:semiHidden="1" w:unhideWhenUsed="1"/>
-    <w:lsdException w:name="heading 3" w:semiHidden="1" w:unhideWhenUsed="1"/>
-    <w:lsdException w:name="heading 4" w:semiHidden="1" w:unhideWhenUsed="1"/>
-    <w:lsdException w:name="heading 5" w:semiHidden="1" w:unhideWhenUsed="1"/>
-    <w:lsdException w:name="heading 6" w:semiHidden="1" w:unhideWhenUsed="1"/>
-    <w:lsdException w:name="heading 7" w:semiHidden="1" w:unhideWhenUsed="1"/>
-    <w:lsdException w:name="heading 8" w:semiHidden="1" w:unhideWhenUsed="1"/>
-    <w:lsdException w:name="heading 9" w:semiHidden="1" w:unhideWhenUsed="1"/>
-    <w:lsdException w:name="index 1" w:semiHidden="1" w:unhideWhenUsed="1"/>
-    <w:lsdException w:name="index 2" w:semiHidden="1" w:unhideWhenUsed="1"/>
-    <w:lsdException w:name="index 3" w:semiHidden="1" w:unhideWhenUsed="1"/>
-    <w:lsdException w:name="index 4" w:semiHidden="1" w:unhideWhenUsed="1"/>
-    <w:lsdException w:name="index 5" w:semiHidden="1" w:unhideWhenUsed="1"/>
-    <w:lsdException w:name="index 6" w:semiHidden="1" w:unhideWhenUsed="1"/>
-    <w:lsdException w:name="index 7" w:semiHidden="1" w:unhideWhenUsed="1"/>
-    <w:lsdException w:name="index 8" w:semiHidden="1" w:unhideWhenUsed="1"/>
-    <w:lsdException w:name="index 9" w:semiHidden="1" w:unhideWhenUsed="1"/>
-    <w:lsdException w:name="toc 1" w:semiHidden="1" w:unhideWhenUsed="1"/>
-    <w:lsdException w:name="toc 2" w:semiHidden="1" w:unhideWhenUsed="1"/>
-    <w:lsdException w:name="toc 3" w:semiHidden="1" w:unhideWhenUsed="1"/>
-    <w:lsdException w:name="toc 4" w:semiHidden="1" w:unhideWhenUsed="1"/>
-    <w:lsdException w:name="toc 5" w:semiHidden="1" w:unhideWhenUsed="1"/>
-    <w:lsdException w:name="toc 6" w:semiHidden="1" w:unhideWhenUsed="1"/>
-    <w:lsdException w:name="toc 7" w:semiHidden="1" w:unhideWhenUsed="1"/>
-    <w:lsdException w:name="toc 8" w:semiHidden="1" w:unhideWhenUsed="1"/>
-    <w:lsdException w:name="toc 9" w:semiHidden="1" w:unhideWhenUsed="1"/>
-    <w:lsdException w:name="Normal Indent" w:semiHidden="1" w:unhideWhenUsed="1"/>
-    <w:lsdException w:name="footnote text" w:semiHidden="1" w:unhideWhenUsed="1"/>
-    <w:lsdException w:name="annotation text" w:semiHidden="1" w:unhideWhenUsed="1"/>
-    <w:lsdException w:name="header" w:semiHidden="1" w:unhideWhenUsed="1"/>
-    <w:lsdException w:name="footer" w:semiHidden="1" w:unhideWhenUsed="1"/>
-    <w:lsdException w:name="index heading" w:semiHidden="1" w:unhideWhenUsed="1"/>
-    <w:lsdException w:name="caption" w:semiHidden="1" w:unhideWhenUsed="1"/>
-    <w:lsdException w:name="table of figures" w:semiHidden="1" w:unhideWhenUsed="1"/>
-    <w:lsdException w:name="envelope address" w:semiHidden="1" w:unhideWhenUsed="1"/>
-    <w:lsdException w:name="envelope return" w:semiHidden="1" w:unhideWhenUsed="1"/>
-    <w:lsdException w:name="footnote reference" w:semiHidden="1" w:unhideWhenUsed="1"/>
-    <w:lsdException w:name="annotation reference" w:semiHidden="1" w:unhideWhenUsed="1"/>
-    <w:lsdException w:name="line number" w:semiHidden="1" w:unhideWhenUsed="1"/>
-    <w:lsdException w:name="page number" w:semiHidden="1" w:unhideWhenUsed="1"/>
-    <w:lsdException w:name="endnote reference" w:semiHidden="1" w:unhideWhenUsed="1"/>
-    <w:lsdException w:name="endnote text" w:semiHidden="1" w:unhideWhenUsed="1"/>
-    <w:lsdException w:name="macro" w:semiHidden="1" w:unhideWhenUsed="1"/>
-    <w:lsdException w:name="toa heading" w:semiHidden="1" w:unhideWhenUsed="1"/>
-    <w:lsdException w:name="List Number" w:semiHidden="1" w:unhideWhenUsed="1"/>
-    <w:lsdException w:name="List 2" w:semiHidden="1" w:unhideWhenUsed="1"/>
-    <w:lsdException w:name="List 3" w:semiHidden="1" w:unhideWhenUsed="1"/>
-    <w:lsdException w:name="List 4" w:semiHidden="1" w:unhideWhenUsed="1"/>
-    <w:lsdException w:name="List 5" w:semiHidden="1" w:unhideWhenUsed="1"/>
-    <w:lsdException w:name="List Bullet 2" w:semiHidden="1" w:unhideWhenUsed="1"/>
-    <w:lsdException w:name="List Bullet 3" w:semiHidden="1" w:unhideWhenUsed="1"/>
-    <w:lsdException w:name="List Bullet 4" w:semiHidden="1" w:unhideWhenUsed="1"/>
-    <w:lsdException w:name="List Bullet 5" w:semiHidden="1" w:unhideWhenUsed="1"/>
-    <w:lsdException w:name="List Number 2" w:semiHidden="1" w:unhideWhenUsed="1"/>
-    <w:lsdException w:name="List Number 3" w:semiHidden="1" w:unhideWhenUsed="1"/>
-    <w:lsdException w:name="List Number 4" w:semiHidden="1" w:unhideWhenUsed="1"/>
-    <w:lsdException w:name="List Number 5" w:semiHidden="1" w:unhideWhenUsed="1"/>
-    <w:lsdException w:name="Closing" w:semiHidden="1" w:unhideWhenUsed="1"/>
-    <w:lsdException w:name="Signature" w:semiHidden="1" w:unhideWhenUsed="1"/>
-    <w:lsdException w:name="Default Paragraph Font" w:semiHidden="1" w:unhideWhenUsed="1"/>
-    <w:lsdException w:name="Body Text" w:semiHidden="1" w:unhideWhenUsed="1"/>
-    <w:lsdException w:name="Body Text Indent" w:semiHidden="1" w:unhideWhenUsed="1"/>
-    <w:lsdException w:name="List Continue" w:semiHidden="1" w:unhideWhenUsed="1"/>
-    <w:lsdException w:name="Message Header" w:semiHidden="1" w:unhideWhenUsed="1"/>
-    <w:lsdException w:name="Salutation" w:semiHidden="1" w:unhideWhenUsed="1"/>
-    <w:lsdException w:name="Date" w:semiHidden="1" w:unhideWhenUsed="1"/>
-    <w:lsdException w:name="Body Text First Indent" w:semiHidden="1" w:unhideWhenUsed="1"/>
-    <w:lsdException w:name="Body Text First Indent 2" w:semiHidden="1" w:unhideWhenUsed="1"/>
-    <w:lsdException w:name="Note Heading" w:semiHidden="1" w:unhideWhenUsed="1"/>
-    <w:lsdException w:name="Body Text 2" w:semiHidden="1" w:unhideWhenUsed="1"/>
-    <w:lsdException w:name="Body Text 3" w:semiHidden="1" w:unhideWhenUsed="1"/>
-    <w:lsdException w:name="Body Text Indent 2" w:semiHidden="1" w:unhideWhenUsed="1"/>
-    <w:lsdException w:name="Body Text Indent 3" w:semiHidden="1" w:unhideWhenUsed="1"/>
-    <w:lsdException w:name="Block Text" w:semiHidden="1" w:unhideWhenUsed="1"/>
-    <w:lsdException w:name="Hyperlink" w:semiHidden="1" w:unhideWhenUsed="1"/>
-    <w:lsdException w:name="FollowedHyperlink" w:semiHidden="1" w:unhideWhenUsed="1"/>
-    <w:lsdException w:name="Document Map" w:semiHidden="1" w:unhideWhenUsed="1"/>
-    <w:lsdException w:name="Plain Text" w:semiHidden="1" w:unhideWhenUsed="1"/>
-    <w:lsdException w:name="E-mail Signature" w:semiHidden="1" w:unhideWhenUsed="1"/>
-    <w:lsdException w:name="HTML Top of Form" w:semiHidden="1" w:unhideWhenUsed="1"/>
-    <w:lsdException w:name="HTML Bottom of Form" w:semiHidden="1" w:unhideWhenUsed="1"/>
-    <w:lsdException w:name="Normal (Web)" w:semiHidden="1" w:unhideWhenUsed="1"/>
-    <w:lsdException w:name="HTML Acronym" w:semiHidden="1" w:unhideWhenUsed="1"/>
-    <w:lsdException w:name="HTML Address" w:semiHidden="1" w:unhideWhenUsed="1"/>
-    <w:lsdException w:name="HTML Cite" w:semiHidden="1" w:unhideWhenUsed="1"/>
-    <w:lsdException w:name="HTML Code" w:semiHidden="1" w:unhideWhenUsed="1"/>
-    <w:lsdException w:name="HTML Definition" w:semiHidden="1" w:unhideWhenUsed="1"/>
-    <w:lsdException w:name="HTML Keyboard" w:semiHidden="1" w:unhideWhenUsed="1"/>
-    <w:lsdException w:name="HTML Preformatted" w:semiHidden="1" w:unhideWhenUsed="1"/>
-    <w:lsdException w:name="HTML Sample" w:semiHidden="1" w:unhideWhenUsed="1"/>
-    <w:lsdException w:name="HTML Typewriter" w:semiHidden="1" w:unhideWhenUsed="1"/>
-    <w:lsdException w:name="HTML Variable" w:semiHidden="1" w:unhideWhenUsed="1"/>
-    <w:lsdException w:name="Normal Table" w:semiHidden="1" w:unhideWhenUsed="1"/>
-    <w:lsdException w:name="annotation subject" w:semiHidden="1" w:unhideWhenUsed="1"/>
-    <w:lsdException w:name="No List" w:semiHidden="1" w:unhideWhenUsed="1"/>
-    <w:lsdException w:name="Outline List 1" w:semiHidden="1" w:unhideWhenUsed="1"/>
-    <w:lsdException w:name="Outline List 2" w:semiHidden="1" w:unhideWhenUsed="1"/>
-    <w:lsdException w:name="Outline List 3" w:semiHidden="1" w:unhideWhenUsed="1"/>
-    <w:lsdException w:name="Table Simple 1" w:semiHidden="1" w:unhideWhenUsed="1"/>
-    <w:lsdException w:name="Table Simple 2" w:semiHidden="1" w:unhideWhenUsed="1"/>
-    <w:lsdException w:name="Table Simple 3" w:semiHidden="1" w:unhideWhenUsed="1"/>
-    <w:lsdException w:name="Table Classic 1" w:semiHidden="1" w:unhideWhenUsed="1"/>
-    <w:lsdException w:name="Table Classic 2" w:semiHidden="1" w:unhideWhenUsed="1"/>
-    <w:lsdException w:name="Table Classic 3" w:semiHidden="1" w:unhideWhenUsed="1"/>
-    <w:lsdException w:name="Table Classic 4" w:semiHidden="1" w:unhideWhenUsed="1"/>
-    <w:lsdException w:name="Table Colorful 1" w:semiHidden="1" w:unhideWhenUsed="1"/>
-    <w:lsdException w:name="Table Colorful 2" w:semiHidden="1" w:unhideWhenUsed="1"/>
-    <w:lsdException w:name="Table Colorful 3" w:semiHidden="1" w:unhideWhenUsed="1"/>
-    <w:lsdException w:name="Table Columns 1" w:semiHidden="1" w:unhideWhenUsed="1"/>
-    <w:lsdException w:name="Table Columns 2" w:semiHidden="1" w:unhideWhenUsed="1"/>
-    <w:lsdException w:name="Table Columns 3" w:semiHidden="1" w:unhideWhenUsed="1"/>
-    <w:lsdException w:name="Table Columns 4" w:semiHidden="1" w:unhideWhenUsed="1"/>
-    <w:lsdException w:name="Table Columns 5" w:semiHidden="1" w:unhideWhenUsed="1"/>
-    <w:lsdException w:name="Table Grid 1" w:semiHidden="1" w:unhideWhenUsed="1"/>
-    <w:lsdException w:name="Table Grid 2" w:semiHidden="1" w:unhideWhenUsed="1"/>
-    <w:lsdException w:name="Table Grid 3" w:semiHidden="1" w:unhideWhenUsed="1"/>
-    <w:lsdException w:name="Table Grid 4" w:semiHidden="1" w:unhideWhenUsed="1"/>
-    <w:lsdException w:name="Table Grid 5" w:semiHidden="1" w:unhideWhenUsed="1"/>
-    <w:lsdException w:name="Table Grid 6" w:semiHidden="1" w:unhideWhenUsed="1"/>
-    <w:lsdException w:name="Table Grid 7" w:semiHidden="1" w:unhideWhenUsed="1"/>
-    <w:lsdException w:name="Table Grid 8" w:semiHidden="1" w:unhideWhenUsed="1"/>
-    <w:lsdException w:name="Table List 1" w:semiHidden="1" w:unhideWhenUsed="1"/>
-    <w:lsdException w:name="Table List 2" w:semiHidden="1" w:unhideWhenUsed="1"/>
-    <w:lsdException w:name="Table List 3" w:semiHidden="1" w:unhideWhenUsed="1"/>
-    <w:lsdException w:name="Table List 4" w:semiHidden="1" w:unhideWhenUsed="1"/>
-    <w:lsdException w:name="Table List 5" w:semiHidden="1" w:unhideWhenUsed="1"/>
-    <w:lsdException w:name="Table List 6" w:semiHidden="1" w:unhideWhenUsed="1"/>
-    <w:lsdException w:name="Table List 7" w:semiHidden="1" w:unhideWhenUsed="1"/>
-    <w:lsdException w:name="Table List 8" w:semiHidden="1" w:unhideWhenUsed="1"/>
-    <w:lsdException w:name="Table 3D effects 1" w:semiHidden="1" w:unhideWhenUsed="1"/>
-    <w:lsdException w:name="Table 3D effects 2" w:semiHidden="1" w:unhideWhenUsed="1"/>
-    <w:lsdException w:name="Table 3D effects 3" w:semiHidden="1" w:unhideWhenUsed="1"/>
-    <w:lsdException w:name="Table Contemporary" w:semiHidden="1" w:unhideWhenUsed="1"/>
-    <w:lsdException w:name="Table Elegant" w:semiHidden="1" w:unhideWhenUsed="1"/>
-    <w:lsdException w:name="Table Professional" w:semiHidden="1" w:unhideWhenUsed="1"/>
-    <w:lsdException w:name="Table Subtle 1" w:semiHidden="1" w:unhideWhenUsed="1"/>
-    <w:lsdException w:name="Table Subtle 2" w:semiHidden="1" w:unhideWhenUsed="1"/>
-    <w:lsdException w:name="Table Web 1" w:semiHidden="1" w:unhideWhenUsed="1"/>
-    <w:lsdException w:name="Light Shading"/>
-    <w:lsdException w:name="Light List"/>
-    <w:lsdException w:name="Light Grid"/>
-    <w:lsdException w:name="Medium Shading 1"/>
-    <w:lsdException w:name="Medium Shading 2"/>
-    <w:lsdException w:name="Medium List 1"/>
-    <w:lsdException w:name="Medium List 2"/>
-    <w:lsdException w:name="Medium Grid 1"/>
-    <w:lsdException w:name="Medium Grid 2"/>
-    <w:lsdException w:name="Medium Grid 3"/>
-    <w:lsdException w:name="Dark List"/>
-    <w:lsdException w:name="Colorful Shading"/>
-    <w:lsdException w:name="Colorful List"/>
-    <w:lsdException w:name="Colorful Grid"/>
-    <w:lsdException w:name="Light Shading Accent 1"/>
-    <w:lsdException w:name="Light List Accent 1"/>
-    <w:lsdException w:name="Light Grid Accent 1"/>
-    <w:lsdException w:name="Medium Shading 1 Accent 1"/>
-    <w:lsdException w:name="Medium Shading 2 Accent 1"/>
-    <w:lsdException w:name="Medium List 1 Accent 1"/>
-    <w:lsdException w:name="Revision" w:semiHidden="1"/>
-    <w:lsdException w:name="Medium List 2 Accent 1"/>
-    <w:lsdException w:name="Medium Grid 1 Accent 1"/>
-    <w:lsdException w:name="Medium Grid 2 Accent 1"/>
-    <w:lsdException w:name="Medium Grid 3 Accent 1"/>
-    <w:lsdException w:name="Dark List Accent 1"/>
-    <w:lsdException w:name="Colorful Shading Accent 1"/>
-    <w:lsdException w:name="Colorful List Accent 1"/>
-    <w:lsdException w:name="Colorful Grid Accent 1"/>
-    <w:lsdException w:name="Light Shading Accent 2"/>
-    <w:lsdException w:name="Light List Accent 2"/>
-    <w:lsdException w:name="Light Grid Accent 2"/>
-    <w:lsdException w:name="Medium Shading 1 Accent 2"/>
-    <w:lsdException w:name="Medium Shading 2 Accent 2"/>
-    <w:lsdException w:name="Medium List 1 Accent 2"/>
-    <w:lsdException w:name="Medium List 2 Accent 2"/>
-    <w:lsdException w:name="Medium Grid 1 Accent 2"/>
-    <w:lsdException w:name="Medium Grid 2 Accent 2"/>
-    <w:lsdException w:name="Medium Grid 3 Accent 2"/>
-    <w:lsdException w:name="Dark List Accent 2"/>
-    <w:lsdException w:name="Colorful Shading Accent 2"/>
-    <w:lsdException w:name="Colorful List Accent 2"/>
-    <w:lsdException w:name="Colorful Grid Accent 2"/>
-    <w:lsdException w:name="Light Shading Accent 3"/>
-    <w:lsdException w:name="Light List Accent 3"/>
-    <w:lsdException w:name="Light Grid Accent 3"/>
-    <w:lsdException w:name="Medium Shading 1 Accent 3"/>
-    <w:lsdException w:name="Medium Shading 2 Accent 3"/>
-    <w:lsdException w:name="Medium List 1 Accent 3"/>
-    <w:lsdException w:name="Medium List 2 Accent 3"/>
-    <w:lsdException w:name="Medium Grid 1 Accent 3"/>
-    <w:lsdException w:name="Medium Grid 2 Accent 3"/>
-    <w:lsdException w:name="Medium Grid 3 Accent 3"/>
-    <w:lsdException w:name="Dark List Accent 3"/>
-    <w:lsdException w:name="Colorful Shading Accent 3"/>
-    <w:lsdException w:name="Colorful List Accent 3"/>
-    <w:lsdException w:name="Colorful Grid Accent 3"/>
-    <w:lsdException w:name="Light Shading Accent 4"/>
-    <w:lsdException w:name="Light List Accent 4"/>
-    <w:lsdException w:name="Light Grid Accent 4"/>
-    <w:lsdException w:name="Medium Shading 1 Accent 4"/>
-    <w:lsdException w:name="Medium Shading 2 Accent 4"/>
-    <w:lsdException w:name="Medium List 1 Accent 4"/>
-    <w:lsdException w:name="Medium List 2 Accent 4"/>
-    <w:lsdException w:name="Medium Grid 1 Accent 4"/>
-    <w:lsdException w:name="Medium Grid 2 Accent 4"/>
-    <w:lsdException w:name="Medium Grid 3 Accent 4"/>
-    <w:lsdException w:name="Dark List Accent 4"/>
-    <w:lsdException w:name="Colorful Shading Accent 4"/>
-    <w:lsdException w:name="Colorful List Accent 4"/>
-    <w:lsdException w:name="Colorful Grid Accent 4"/>
-    <w:lsdException w:name="Light Shading Accent 5"/>
-    <w:lsdException w:name="Light List Accent 5"/>
-    <w:lsdException w:name="Light Grid Accent 5"/>
-    <w:lsdException w:name="Medium Shading 1 Accent 5"/>
-    <w:lsdException w:name="Medium Shading 2 Accent 5"/>
-    <w:lsdException w:name="Medium List 1 Accent 5"/>
-    <w:lsdException w:name="Medium List 2 Accent 5"/>
-    <w:lsdException w:name="Medium Grid 1 Accent 5"/>
-    <w:lsdException w:name="Medium Grid 2 Accent 5"/>
-    <w:lsdException w:name="Medium Grid 3 Accent 5"/>
-    <w:lsdException w:name="Dark List Accent 5"/>
-    <w:lsdException w:name="Colorful Shading Accent 5"/>
-    <w:lsdException w:name="Colorful List Accent 5"/>
-    <w:lsdException w:name="Colorful Grid Accent 5"/>
-    <w:lsdException w:name="Light Shading Accent 6"/>
-    <w:lsdException w:name="Light List Accent 6"/>
-    <w:lsdException w:name="Light Grid Accent 6"/>
-    <w:lsdException w:name="Medium Shading 1 Accent 6"/>
-    <w:lsdException w:name="Medium Shading 2 Accent 6"/>
-    <w:lsdException w:name="Medium List 1 Accent 6"/>
-    <w:lsdException w:name="Medium List 2 Accent 6"/>
-    <w:lsdException w:name="Medium Grid 1 Accent 6"/>
-    <w:lsdException w:name="Medium Grid 2 Accent 6"/>
-    <w:lsdException w:name="Medium Grid 3 Accent 6"/>
-    <w:lsdException w:name="Dark List Accent 6"/>
-    <w:lsdException w:name="Colorful Shading Accent 6"/>
-    <w:lsdException w:name="Colorful List Accent 6"/>
-    <w:lsdException w:name="Colorful Grid Accent 6"/>
-    <w:lsdException w:name="Plain Table 1" w:uiPriority="41"/>
-    <w:lsdException w:name="Plain Table 2" w:uiPriority="42"/>
-    <w:lsdException w:name="Plain Table 3" w:uiPriority="43"/>
-    <w:lsdException w:name="Plain Table 4" w:uiPriority="44"/>
-    <w:lsdException w:name="Plain Table 5" w:uiPriority="45"/>
-    <w:lsdException w:name="Grid Table Light" w:uiPriority="40"/>
-    <w:lsdException w:name="Grid Table 1 Light" w:uiPriority="46"/>
-    <w:lsdException w:name="Grid Table 2" w:uiPriority="47"/>
-    <w:lsdException w:name="Grid Table 3" w:uiPriority="48"/>
-    <w:lsdException w:name="Grid Table 4" w:uiPriority="49"/>
-    <w:lsdException w:name="Grid Table 5 Dark" w:uiPriority="50"/>
-    <w:lsdException w:name="Grid Table 6 Colorful" w:uiPriority="51"/>
-    <w:lsdException w:name="Grid Table 7 Colorful" w:uiPriority="52"/>
-    <w:lsdException w:name="Grid Table 1 Light Accent 1" w:uiPriority="46"/>
-    <w:lsdException w:name="Grid Table 2 Accent 1" w:uiPriority="47"/>
-    <w:lsdException w:name="Grid Table 3 Accent 1" w:uiPriority="48"/>
-    <w:lsdException w:name="Grid Table 4 Accent 1" w:uiPriority="49"/>
-    <w:lsdException w:name="Grid Table 5 Dark Accent 1" w:uiPriority="50"/>
-    <w:lsdException w:name="Grid Table 6 Colorful Accent 1" w:uiPriority="51"/>
-    <w:lsdException w:name="Grid Table 7 Colorful Accent 1" w:uiPriority="52"/>
-    <w:lsdException w:name="Grid Table 1 Light Accent 2" w:uiPriority="46"/>
-    <w:lsdException w:name="Grid Table 2 Accent 2" w:uiPriority="47"/>
-    <w:lsdException w:name="Grid Table 3 Accent 2" w:uiPriority="48"/>
-    <w:lsdException w:name="Grid Table 4 Accent 2" w:uiPriority="49"/>
-    <w:lsdException w:name="Grid Table 5 Dark Accent 2" w:uiPriority="50"/>
-    <w:lsdException w:name="Grid Table 6 Colorful Accent 2" w:uiPriority="51"/>
-    <w:lsdException w:name="Grid Table 7 Colorful Accent 2" w:uiPriority="52"/>
-    <w:lsdException w:name="Grid Table 1 Light Accent 3" w:uiPriority="46"/>
-    <w:lsdException w:name="Grid Table 2 Accent 3" w:uiPriority="47"/>
-    <w:lsdException w:name="Grid Table 3 Accent 3" w:uiPriority="48"/>
-    <w:lsdException w:name="Grid Table 4 Accent 3" w:uiPriority="49"/>
-    <w:lsdException w:name="Grid Table 5 Dark Accent 3" w:uiPriority="50"/>
-    <w:lsdException w:name="Grid Table 6 Colorful Accent 3" w:uiPriority="51"/>
-    <w:lsdException w:name="Grid Table 7 Colorful Accent 3" w:uiPriority="52"/>
-    <w:lsdException w:name="Grid Table 1 Light Accent 4" w:uiPriority="46"/>
-    <w:lsdException w:name="Grid Table 2 Accent 4" w:uiPriority="47"/>
-    <w:lsdException w:name="Grid Table 3 Accent 4" w:uiPriority="48"/>
-    <w:lsdException w:name="Grid Table 4 Accent 4" w:uiPriority="49"/>
-    <w:lsdException w:name="Grid Table 5 Dark Accent 4" w:uiPriority="50"/>
-    <w:lsdException w:name="Grid Table 6 Colorful Accent 4" w:uiPriority="51"/>
-    <w:lsdException w:name="Grid Table 7 Colorful Accent 4" w:uiPriority="52"/>
-    <w:lsdException w:name="Grid Table 1 Light Accent 5" w:uiPriority="46"/>
-    <w:lsdException w:name="Grid Table 2 Accent 5" w:uiPriority="47"/>
-    <w:lsdException w:name="Grid Table 3 Accent 5" w:uiPriority="48"/>
-    <w:lsdException w:name="Grid Table 4 Accent 5" w:uiPriority="49"/>
-    <w:lsdException w:name="Grid Table 5 Dark Accent 5" w:uiPriority="50"/>
-    <w:lsdException w:name="Grid Table 6 Colorful Accent 5" w:uiPriority="51"/>
-    <w:lsdException w:name="Grid Table 7 Colorful Accent 5" w:uiPriority="52"/>
-    <w:lsdException w:name="Grid Table 1 Light Accent 6" w:uiPriority="46"/>
-    <w:lsdException w:name="Grid Table 2 Accent 6" w:uiPriority="47"/>
-    <w:lsdException w:name="Grid Table 3 Accent 6" w:uiPriority="48"/>
-    <w:lsdException w:name="Grid Table 4 Accent 6" w:uiPriority="49"/>
-    <w:lsdException w:name="Grid Table 5 Dark Accent 6" w:uiPriority="50"/>
-    <w:lsdException w:name="Grid Table 6 Colorful Accent 6" w:uiPriority="51"/>
-    <w:lsdException w:name="Grid Table 7 Colorful Accent 6" w:uiPriority="52"/>
-    <w:lsdException w:name="List Table 1 Light" w:uiPriority="46"/>
-    <w:lsdException w:name="List Table 2" w:uiPriority="47"/>
-    <w:lsdException w:name="List Table 3" w:uiPriority="48"/>
-    <w:lsdException w:name="List Table 4" w:uiPriority="49"/>
-    <w:lsdException w:name="List Table 5 Dark" w:uiPriority="50"/>
-    <w:lsdException w:name="List Table 6 Colorful" w:uiPriority="51"/>
-    <w:lsdException w:name="List Table 7 Colorful" w:uiPriority="52"/>
-    <w:lsdException w:name="List Table 1 Light Accent 1" w:uiPriority="46"/>
-    <w:lsdException w:name="List Table 2 Accent 1" w:uiPriority="47"/>
-    <w:lsdException w:name="List Table 3 Accent 1" w:uiPriority="48"/>
-    <w:lsdException w:name="List Table 4 Accent 1" w:uiPriority="49"/>
-    <w:lsdException w:name="List Table 5 Dark Accent 1" w:uiPriority="50"/>
-    <w:lsdException w:name="List Table 6 Colorful Accent 1" w:uiPriority="51"/>
-    <w:lsdException w:name="List Table 7 Colorful Accent 1" w:uiPriority="52"/>
-    <w:lsdException w:name="List Table 1 Light Accent 2" w:uiPriority="46"/>
-    <w:lsdException w:name="List Table 2 Accent 2" w:uiPriority="47"/>
-    <w:lsdException w:name="List Table 3 Accent 2" w:uiPriority="48"/>
-    <w:lsdException w:name="List Table 4 Accent 2" w:uiPriority="49"/>
-    <w:lsdException w:name="List Table 5 Dark Accent 2" w:uiPriority="50"/>
-    <w:lsdException w:name="List Table 6 Colorful Accent 2" w:uiPriority="51"/>
-    <w:lsdException w:name="List Table 7 Colorful Accent 2" w:uiPriority="52"/>
-    <w:lsdException w:name="List Table 1 Light Accent 3" w:uiPriority="46"/>
-    <w:lsdException w:name="List Table 2 Accent 3" w:uiPriority="47"/>
-    <w:lsdException w:name="List Table 3 Accent 3" w:uiPriority="48"/>
-    <w:lsdException w:name="List Table 4 Accent 3" w:uiPriority="49"/>
-    <w:lsdException w:name="List Table 5 Dark Accent 3" w:uiPriority="50"/>
-    <w:lsdException w:name="List Table 6 Colorful Accent 3" w:uiPriority="51"/>
-    <w:lsdException w:name="List Table 7 Colorful Accent 3" w:uiPriority="52"/>
-    <w:lsdException w:name="List Table 1 Light Accent 4" w:uiPriority="46"/>
-    <w:lsdException w:name="List Table 2 Accent 4" w:uiPriority="47"/>
-    <w:lsdException w:name="List Table 3 Accent 4" w:uiPriority="48"/>
-    <w:lsdException w:name="List Table 4 Accent 4" w:uiPriority="49"/>
-    <w:lsdException w:name="List Table 5 Dark Accent 4" w:uiPriority="50"/>
-    <w:lsdException w:name="List Table 6 Colorful Accent 4" w:uiPriority="51"/>
-    <w:lsdException w:name="List Table 7 Colorful Accent 4" w:uiPriority="52"/>
-    <w:lsdException w:name="List Table 1 Light Accent 5" w:uiPriority="46"/>
-    <w:lsdException w:name="List Table 2 Accent 5" w:uiPriority="47"/>
-    <w:lsdException w:name="List Table 3 Accent 5" w:uiPriority="48"/>
-    <w:lsdException w:name="List Table 4 Accent 5" w:uiPriority="49"/>
-    <w:lsdException w:name="List Table 5 Dark Accent 5" w:uiPriority="50"/>
-    <w:lsdException w:name="List Table 6 Colorful Accent 5" w:uiPriority="51"/>
-    <w:lsdException w:name="List Table 7 Colorful Accent 5" w:uiPriority="52"/>
-    <w:lsdException w:name="List Table 1 Light Accent 6" w:uiPriority="46"/>
-    <w:lsdException w:name="List Table 2 Accent 6" w:uiPriority="47"/>
-    <w:lsdException w:name="List Table 3 Accent 6" w:uiPriority="48"/>
-    <w:lsdException w:name="List Table 4 Accent 6" w:uiPriority="49"/>
-    <w:lsdException w:name="List Table 5 Dark Accent 6" w:uiPriority="50"/>
-    <w:lsdException w:name="List Table 6 Colorful Accent 6" w:uiPriority="51"/>
-    <w:lsdException w:name="List Table 7 Colorful Accent 6" w:uiPriority="52"/>
-    <w:lsdException w:name="Mention" w:semiHidden="1" w:uiPriority="99" w:unhideWhenUsed="1"/>
-    <w:lsdException w:name="Smart Hyperlink" w:semiHidden="1" w:uiPriority="99" w:unhideWhenUsed="1"/>
-    <w:lsdException w:name="Hashtag" w:semiHidden="1" w:uiPriority="99" w:unhideWhenUsed="1"/>
-    <w:lsdException w:name="Unresolved Mention" w:semiHidden="1" w:uiPriority="99" w:unhideWhenUsed="1"/>
-    <w:lsdException w:name="Smart Link" w:semiHidden="1" w:uiPriority="99" w:unhideWhenUsed="1"/>
-  </w:latentStyles>
-  <w:style w:default="1" w:styleId="Normal" w:type="paragraph">
-    <w:name w:val="Normal"/>
-    <w:qFormat/>
-  </w:style>
-  <w:style w:styleId="Heading1" w:type="paragraph">
-    <w:name w:val="heading 1"/>
-    <w:basedOn w:val="Normal"/>
-    <w:next w:val="BodyText"/>
-    <w:uiPriority w:val="9"/>
-    <w:qFormat/>
-    <w:pPr>
-      <w:keepNext/>
-      <w:keepLines/>
-      <w:spacing w:after="0" w:before="480"/>
-      <w:outlineLvl w:val="0"/>
-    </w:pPr>
-    <w:rPr>
-      <w:rFonts w:asciiTheme="majorHAnsi" w:cstheme="majorBidi" w:eastAsiaTheme="majorEastAsia" w:hAnsiTheme="majorHAnsi"/>
-      <w:b/>
-      <w:bCs/>
-      <w:color w:themeColor="accent1" w:themeShade="B5" w:val="345A8A"/>
-      <w:sz w:val="32"/>
-      <w:szCs w:val="32"/>
-    </w:rPr>
-  </w:style>
-  <w:style w:styleId="Heading2" w:type="paragraph">
-    <w:name w:val="heading 2"/>
-    <w:basedOn w:val="Normal"/>
-    <w:next w:val="BodyText"/>
-    <w:uiPriority w:val="9"/>
-    <w:unhideWhenUsed/>
-    <w:qFormat/>
-    <w:pPr>
-      <w:keepNext/>
-      <w:keepLines/>
-      <w:spacing w:after="0" w:before="200"/>
-      <w:outlineLvl w:val="1"/>
-    </w:pPr>
-    <w:rPr>
-      <w:rFonts w:asciiTheme="majorHAnsi" w:cstheme="majorBidi" w:eastAsiaTheme="majorEastAsia" w:hAnsiTheme="majorHAnsi"/>
-      <w:b/>
-      <w:bCs/>
-      <w:color w:themeColor="accent1" w:val="4F81BD"/>
-      <w:sz w:val="32"/>
-      <w:szCs w:val="32"/>
-    </w:rPr>
-  </w:style>
-  <w:style w:styleId="Heading3" w:type="paragraph">
-    <w:name w:val="heading 3"/>
-    <w:basedOn w:val="Normal"/>
-    <w:next w:val="BodyText"/>
-    <w:uiPriority w:val="9"/>
-    <w:unhideWhenUsed/>
-    <w:qFormat/>
-    <w:pPr>
-      <w:keepNext/>
-      <w:keepLines/>
-      <w:spacing w:after="0" w:before="200"/>
-      <w:outlineLvl w:val="2"/>
-    </w:pPr>
-    <w:rPr>
-      <w:rFonts w:asciiTheme="majorHAnsi" w:cstheme="majorBidi" w:eastAsiaTheme="majorEastAsia" w:hAnsiTheme="majorHAnsi"/>
-      <w:b/>
-      <w:bCs/>
-      <w:color w:themeColor="accent1" w:val="4F81BD"/>
-      <w:sz w:val="28"/>
-      <w:szCs w:val="28"/>
-    </w:rPr>
-  </w:style>
-  <w:style w:styleId="Heading4" w:type="paragraph">
-    <w:name w:val="heading 4"/>
-    <w:basedOn w:val="Normal"/>
-    <w:next w:val="BodyText"/>
-    <w:uiPriority w:val="9"/>
-    <w:unhideWhenUsed/>
-    <w:qFormat/>
-    <w:pPr>
-      <w:keepNext/>
-      <w:keepLines/>
-      <w:spacing w:after="0" w:before="200"/>
-      <w:outlineLvl w:val="3"/>
-    </w:pPr>
-    <w:rPr>
-      <w:rFonts w:asciiTheme="majorHAnsi" w:cstheme="majorBidi" w:eastAsiaTheme="majorEastAsia" w:hAnsiTheme="majorHAnsi"/>
-      <w:b/>
-      <w:bCs/>
-      <w:color w:themeColor="accent1" w:val="4F81BD"/>
-    </w:rPr>
-  </w:style>
-  <w:style w:styleId="Heading5" w:type="paragraph">
-    <w:name w:val="heading 5"/>
-    <w:basedOn w:val="Normal"/>
-    <w:next w:val="BodyText"/>
-    <w:uiPriority w:val="9"/>
-    <w:unhideWhenUsed/>
-    <w:qFormat/>
-    <w:rsid w:val="00884F3F"/>
-    <w:pPr>
-      <w:keepNext/>
-      <w:keepLines/>
-      <w:pageBreakBefore/>
-      <w:spacing w:after="0" w:before="200" w:line="20" w:lineRule="exact"/>
-      <w:outlineLvl w:val="4"/>
-    </w:pPr>
-    <w:rPr>
-      <w:rFonts w:asciiTheme="majorHAnsi" w:cstheme="majorBidi" w:eastAsiaTheme="majorEastAsia" w:hAnsiTheme="majorHAnsi"/>
-      <w:i/>
-      <w:iCs/>
-      <w:color w:themeColor="background1" w:val="FFFFFF"/>
-      <w:sz w:val="16"/>
-    </w:rPr>
-  </w:style>
-  <w:style w:styleId="Heading6" w:type="paragraph">
-    <w:name w:val="heading 6"/>
-    <w:basedOn w:val="Normal"/>
-    <w:next w:val="BodyText"/>
-    <w:uiPriority w:val="9"/>
-    <w:unhideWhenUsed/>
-    <w:qFormat/>
-    <w:pPr>
-      <w:keepNext/>
-      <w:keepLines/>
-      <w:spacing w:after="0" w:before="200"/>
-      <w:outlineLvl w:val="5"/>
-    </w:pPr>
-    <w:rPr>
-      <w:rFonts w:asciiTheme="majorHAnsi" w:cstheme="majorBidi" w:eastAsiaTheme="majorEastAsia" w:hAnsiTheme="majorHAnsi"/>
-      <w:color w:themeColor="accent1" w:val="4F81BD"/>
-    </w:rPr>
-  </w:style>
-  <w:style w:default="1" w:styleId="DefaultParagraphFont" w:type="character">
-    <w:name w:val="Default Paragraph Font"/>
-    <w:uiPriority w:val="1"/>
-    <w:semiHidden/>
-    <w:unhideWhenUsed/>
-  </w:style>
-  <w:style w:default="1" w:styleId="TableNormal" w:type="table">
-    <w:name w:val="Normal Table"/>
-    <w:uiPriority w:val="99"/>
-    <w:semiHidden/>
-    <w:unhideWhenUsed/>
-    <w:tblPr>
-      <w:tblInd w:type="dxa" w:w="0"/>
-      <w:tblCellMar>
-        <w:top w:type="dxa" w:w="0"/>
-        <w:left w:type="dxa" w:w="108"/>
-        <w:bottom w:type="dxa" w:w="0"/>
-        <w:right w:type="dxa" w:w="108"/>
-      </w:tblCellMar>
-    </w:tblPr>
-  </w:style>
-  <w:style w:default="1" w:styleId="NoList" w:type="numbering">
-    <w:name w:val="No List"/>
-    <w:uiPriority w:val="99"/>
-    <w:semiHidden/>
-    <w:unhideWhenUsed/>
-  </w:style>
-  <w:style w:styleId="BodyText" w:type="paragraph">
-    <w:name w:val="Body Text"/>
-    <w:basedOn w:val="Normal"/>
-    <w:qFormat/>
-    <w:pPr>
-      <w:spacing w:after="180" w:before="180"/>
-    </w:pPr>
-  </w:style>
-  <w:style w:customStyle="1" w:styleId="FirstParagraph" w:type="paragraph">
-    <w:name w:val="First Paragraph"/>
-    <w:basedOn w:val="BodyText"/>
-    <w:next w:val="BodyText"/>
-    <w:qFormat/>
-  </w:style>
-  <w:style w:customStyle="1" w:styleId="Compact" w:type="paragraph">
-    <w:name w:val="Compact"/>
-    <w:basedOn w:val="BodyText"/>
-    <w:qFormat/>
-    <w:pPr>
-      <w:spacing w:after="36" w:before="36"/>
-    </w:pPr>
-    <w:rPr>
-      <w:rFonts w:ascii="Arial" w:cs="Arial" w:hAnsi="Arial"/>
-      <w:sz w:val="20"/>
-      <w:szCs w:val="20"/>
-    </w:rPr>
-  </w:style>
-  <w:style w:styleId="Title" w:type="paragraph">
-    <w:name w:val="Title"/>
-    <w:basedOn w:val="Normal"/>
-    <w:next w:val="BodyText"/>
-    <w:qFormat/>
-    <w:pPr>
-      <w:keepNext/>
-      <w:keepLines/>
-      <w:spacing w:after="240" w:before="480"/>
-      <w:jc w:val="center"/>
-    </w:pPr>
-    <w:rPr>
-      <w:rFonts w:asciiTheme="majorHAnsi" w:cstheme="majorBidi" w:eastAsiaTheme="majorEastAsia" w:hAnsiTheme="majorHAnsi"/>
-      <w:b/>
-      <w:bCs/>
-      <w:color w:themeColor="accent1" w:themeShade="B5" w:val="345A8A"/>
-      <w:sz w:val="36"/>
-      <w:szCs w:val="36"/>
-    </w:rPr>
-  </w:style>
-  <w:style w:styleId="Subtitle" w:type="paragraph">
-    <w:name w:val="Subtitle"/>
-    <w:basedOn w:val="Title"/>
-    <w:next w:val="BodyText"/>
-    <w:qFormat/>
-    <w:pPr>
-      <w:spacing w:before="240"/>
-    </w:pPr>
-    <w:rPr>
-      <w:sz w:val="30"/>
-      <w:szCs w:val="30"/>
-    </w:rPr>
-  </w:style>
-  <w:style w:customStyle="1" w:styleId="Author" w:type="paragraph">
-    <w:name w:val="Author"/>
-    <w:next w:val="BodyText"/>
-    <w:qFormat/>
-    <w:pPr>
-      <w:keepNext/>
-      <w:keepLines/>
-      <w:jc w:val="center"/>
-    </w:pPr>
-  </w:style>
-  <w:style w:styleId="Date" w:type="paragraph">
-    <w:name w:val="Date"/>
-    <w:next w:val="BodyText"/>
-    <w:qFormat/>
-    <w:pPr>
-      <w:keepNext/>
-      <w:keepLines/>
-      <w:jc w:val="center"/>
-    </w:pPr>
-  </w:style>
-  <w:style w:customStyle="1" w:styleId="Abstract" w:type="paragraph">
-    <w:name w:val="Abstract"/>
-    <w:basedOn w:val="Normal"/>
-    <w:next w:val="BodyText"/>
-    <w:qFormat/>
-    <w:pPr>
-      <w:keepNext/>
-      <w:keepLines/>
-      <w:spacing w:after="300" w:before="300"/>
-    </w:pPr>
-    <w:rPr>
-      <w:sz w:val="20"/>
-      <w:szCs w:val="20"/>
-    </w:rPr>
-  </w:style>
-  <w:style w:styleId="Bibliography" w:type="paragraph">
-    <w:name w:val="Bibliography"/>
-    <w:basedOn w:val="Normal"/>
-    <w:qFormat/>
-  </w:style>
-  <w:style w:styleId="BlockText" w:type="paragraph">
-    <w:name w:val="Block Text"/>
-    <w:basedOn w:val="BodyText"/>
-    <w:next w:val="BodyText"/>
-    <w:uiPriority w:val="9"/>
-    <w:unhideWhenUsed/>
-    <w:qFormat/>
-    <w:pPr>
-      <w:spacing w:after="100" w:before="100"/>
-    </w:pPr>
-    <w:rPr>
-      <w:rFonts w:asciiTheme="majorHAnsi" w:cstheme="majorBidi" w:eastAsiaTheme="majorEastAsia" w:hAnsiTheme="majorHAnsi"/>
-      <w:bCs/>
-      <w:sz w:val="20"/>
-      <w:szCs w:val="20"/>
-    </w:rPr>
-  </w:style>
-  <w:style w:styleId="FootnoteText" w:type="paragraph">
-    <w:name w:val="footnote text"/>
-    <w:basedOn w:val="Normal"/>
-    <w:uiPriority w:val="9"/>
-    <w:unhideWhenUsed/>
-    <w:qFormat/>
-  </w:style>
-  <w:style w:customStyle="1" w:styleId="DefinitionTerm" w:type="paragraph">
-    <w:name w:val="Definition Term"/>
-    <w:basedOn w:val="Normal"/>
-    <w:next w:val="Definition"/>
-    <w:pPr>
-      <w:keepNext/>
-      <w:keepLines/>
-      <w:spacing w:after="0"/>
-    </w:pPr>
-    <w:rPr>
-      <w:b/>
-    </w:rPr>
-  </w:style>
-  <w:style w:customStyle="1" w:styleId="Definition" w:type="paragraph">
-    <w:name w:val="Definition"/>
-    <w:basedOn w:val="Normal"/>
-  </w:style>
-  <w:style w:styleId="Caption" w:type="paragraph">
-    <w:name w:val="caption"/>
-    <w:basedOn w:val="Normal"/>
-    <w:link w:val="CaptionChar"/>
-    <w:pPr>
-      <w:spacing w:after="120"/>
-    </w:pPr>
-    <w:rPr>
-      <w:i/>
-    </w:rPr>
-  </w:style>
-  <w:style w:customStyle="1" w:styleId="TableCaption" w:type="paragraph">
-    <w:name w:val="Table Caption"/>
-    <w:basedOn w:val="Caption"/>
-    <w:pPr>
-      <w:keepNext/>
-    </w:pPr>
-  </w:style>
-  <w:style w:customStyle="1" w:styleId="ImageCaption" w:type="paragraph">
-    <w:name w:val="Image Caption"/>
-    <w:basedOn w:val="Caption"/>
-  </w:style>
-  <w:style w:customStyle="1" w:styleId="Figure" w:type="paragraph">
-    <w:name w:val="Figure"/>
-    <w:basedOn w:val="Normal"/>
-  </w:style>
-  <w:style w:customStyle="1" w:styleId="FigurewithCaption" w:type="paragraph">
-    <w:name w:val="Figure with Caption"/>
-    <w:basedOn w:val="Figure"/>
-    <w:pPr>
-      <w:keepNext/>
-    </w:pPr>
-  </w:style>
-  <w:style w:customStyle="1" w:styleId="CaptionChar" w:type="character">
-    <w:name w:val="Caption Char"/>
-    <w:basedOn w:val="DefaultParagraphFont"/>
-    <w:link w:val="Caption"/>
-  </w:style>
-  <w:style w:customStyle="1" w:styleId="VerbatimChar" w:type="character">
-    <w:name w:val="Verbatim Char"/>
-    <w:basedOn w:val="CaptionChar"/>
-    <w:link w:val="SourceCode"/>
-    <w:rPr>
-      <w:rFonts w:ascii="Consolas" w:hAnsi="Consolas"/>
-      <w:sz w:val="22"/>
-    </w:rPr>
-  </w:style>
-  <w:style w:styleId="FootnoteReference" w:type="character">
-    <w:name w:val="footnote reference"/>
-    <w:basedOn w:val="CaptionChar"/>
-    <w:rPr>
-      <w:vertAlign w:val="superscript"/>
-    </w:rPr>
-  </w:style>
-  <w:style w:styleId="Hyperlink" w:type="character">
-    <w:name w:val="Hyperlink"/>
-    <w:basedOn w:val="CaptionChar"/>
-    <w:rPr>
-      <w:color w:themeColor="accent1" w:val="4F81BD"/>
-    </w:rPr>
-  </w:style>
-  <w:style w:styleId="TOCHeading" w:type="paragraph">
-    <w:name w:val="TOC Heading"/>
-    <w:basedOn w:val="Heading1"/>
-    <w:next w:val="BodyText"/>
-    <w:uiPriority w:val="39"/>
-    <w:unhideWhenUsed/>
-    <w:qFormat/>
-    <w:pPr>
-      <w:spacing w:before="240" w:line="259" w:lineRule="auto"/>
-      <w:outlineLvl w:val="9"/>
-    </w:pPr>
-    <w:rPr>
-      <w:b w:val="0"/>
-      <w:bCs w:val="0"/>
-      <w:color w:themeColor="accent1" w:themeShade="BF" w:val="365F91"/>
-    </w:rPr>
-  </w:style>
-  <w:style w:customStyle="1" w:styleId="SourceCode" w:type="paragraph">
-    <w:name w:val="Source Code"/>
-    <w:basedOn w:val="Normal"/>
-    <w:link w:val="VerbatimChar"/>
-    <w:pPr>
-      <w:shd w:color="auto" w:fill="F8F8F8" w:val="clear"/>
-      <w:wordWrap w:val="0"/>
-    </w:pPr>
-  </w:style>
-  <w:style w:customStyle="1" w:styleId="KeywordTok" w:type="character">
-    <w:name w:val="KeywordTok"/>
-    <w:basedOn w:val="VerbatimChar"/>
-    <w:rPr>
-      <w:rFonts w:ascii="Consolas" w:hAnsi="Consolas"/>
-      <w:b/>
-      <w:color w:val="204A87"/>
-      <w:sz w:val="22"/>
-      <w:shd w:color="auto" w:fill="F8F8F8" w:val="clear"/>
-    </w:rPr>
-  </w:style>
-  <w:style w:customStyle="1" w:styleId="DataTypeTok" w:type="character">
-    <w:name w:val="DataTypeTok"/>
-    <w:basedOn w:val="VerbatimChar"/>
-    <w:rPr>
-      <w:rFonts w:ascii="Consolas" w:hAnsi="Consolas"/>
-      <w:color w:val="204A87"/>
-      <w:sz w:val="22"/>
-      <w:shd w:color="auto" w:fill="F8F8F8" w:val="clear"/>
-    </w:rPr>
-  </w:style>
-  <w:style w:customStyle="1" w:styleId="DecValTok" w:type="character">
-    <w:name w:val="DecValTok"/>
-    <w:basedOn w:val="VerbatimChar"/>
-    <w:rPr>
-      <w:rFonts w:ascii="Consolas" w:hAnsi="Consolas"/>
-      <w:color w:val="0000CF"/>
-      <w:sz w:val="22"/>
-      <w:shd w:color="auto" w:fill="F8F8F8" w:val="clear"/>
-    </w:rPr>
-  </w:style>
-  <w:style w:customStyle="1" w:styleId="BaseNTok" w:type="character">
-    <w:name w:val="BaseNTok"/>
-    <w:basedOn w:val="VerbatimChar"/>
-    <w:rPr>
-      <w:rFonts w:ascii="Consolas" w:hAnsi="Consolas"/>
-      <w:color w:val="0000CF"/>
-      <w:sz w:val="22"/>
-      <w:shd w:color="auto" w:fill="F8F8F8" w:val="clear"/>
-    </w:rPr>
-  </w:style>
-  <w:style w:customStyle="1" w:styleId="FloatTok" w:type="character">
-    <w:name w:val="FloatTok"/>
-    <w:basedOn w:val="VerbatimChar"/>
-    <w:rPr>
-      <w:rFonts w:ascii="Consolas" w:hAnsi="Consolas"/>
-      <w:color w:val="0000CF"/>
-      <w:sz w:val="22"/>
-      <w:shd w:color="auto" w:fill="F8F8F8" w:val="clear"/>
-    </w:rPr>
-  </w:style>
-  <w:style w:customStyle="1" w:styleId="ConstantTok" w:type="character">
-    <w:name w:val="ConstantTok"/>
-    <w:basedOn w:val="VerbatimChar"/>
-    <w:rPr>
-      <w:rFonts w:ascii="Consolas" w:hAnsi="Consolas"/>
-      <w:color w:val="000000"/>
-      <w:sz w:val="22"/>
-      <w:shd w:color="auto" w:fill="F8F8F8" w:val="clear"/>
-    </w:rPr>
-  </w:style>
-  <w:style w:customStyle="1" w:styleId="CharTok" w:type="character">
-    <w:name w:val="CharTok"/>
-    <w:basedOn w:val="VerbatimChar"/>
-    <w:rPr>
-      <w:rFonts w:ascii="Consolas" w:hAnsi="Consolas"/>
-      <w:color w:val="4E9A06"/>
-      <w:sz w:val="22"/>
-      <w:shd w:color="auto" w:fill="F8F8F8" w:val="clear"/>
-    </w:rPr>
-  </w:style>
-  <w:style w:customStyle="1" w:styleId="SpecialCharTok" w:type="character">
-    <w:name w:val="SpecialCharTok"/>
-    <w:basedOn w:val="VerbatimChar"/>
-    <w:rPr>
-      <w:rFonts w:ascii="Consolas" w:hAnsi="Consolas"/>
-      <w:color w:val="000000"/>
-      <w:sz w:val="22"/>
-      <w:shd w:color="auto" w:fill="F8F8F8" w:val="clear"/>
-    </w:rPr>
-  </w:style>
-  <w:style w:customStyle="1" w:styleId="StringTok" w:type="character">
-    <w:name w:val="StringTok"/>
-    <w:basedOn w:val="VerbatimChar"/>
-    <w:rPr>
-      <w:rFonts w:ascii="Consolas" w:hAnsi="Consolas"/>
-      <w:color w:val="4E9A06"/>
-      <w:sz w:val="22"/>
-      <w:shd w:color="auto" w:fill="F8F8F8" w:val="clear"/>
-    </w:rPr>
-  </w:style>
-  <w:style w:customStyle="1" w:styleId="VerbatimStringTok" w:type="character">
-    <w:name w:val="VerbatimStringTok"/>
-    <w:basedOn w:val="VerbatimChar"/>
-    <w:rPr>
-      <w:rFonts w:ascii="Consolas" w:hAnsi="Consolas"/>
-      <w:color w:val="4E9A06"/>
-      <w:sz w:val="22"/>
-      <w:shd w:color="auto" w:fill="F8F8F8" w:val="clear"/>
-    </w:rPr>
-  </w:style>
-  <w:style w:customStyle="1" w:styleId="SpecialStringTok" w:type="character">
-    <w:name w:val="SpecialStringTok"/>
-    <w:basedOn w:val="VerbatimChar"/>
-    <w:rPr>
-      <w:rFonts w:ascii="Consolas" w:hAnsi="Consolas"/>
-      <w:color w:val="4E9A06"/>
-      <w:sz w:val="22"/>
-      <w:shd w:color="auto" w:fill="F8F8F8" w:val="clear"/>
-    </w:rPr>
-  </w:style>
-  <w:style w:customStyle="1" w:styleId="ImportTok" w:type="character">
-    <w:name w:val="ImportTok"/>
-    <w:basedOn w:val="VerbatimChar"/>
-    <w:rPr>
-      <w:rFonts w:ascii="Consolas" w:hAnsi="Consolas"/>
-      <w:sz w:val="22"/>
-      <w:shd w:color="auto" w:fill="F8F8F8" w:val="clear"/>
-    </w:rPr>
-  </w:style>
-  <w:style w:customStyle="1" w:styleId="CommentTok" w:type="character">
-    <w:name w:val="CommentTok"/>
-    <w:basedOn w:val="VerbatimChar"/>
-    <w:rPr>
-      <w:rFonts w:ascii="Consolas" w:hAnsi="Consolas"/>
-      <w:i/>
-      <w:color w:val="8F5902"/>
-      <w:sz w:val="22"/>
-      <w:shd w:color="auto" w:fill="F8F8F8" w:val="clear"/>
-    </w:rPr>
-  </w:style>
-  <w:style w:customStyle="1" w:styleId="DocumentationTok" w:type="character">
-    <w:name w:val="DocumentationTok"/>
-    <w:basedOn w:val="VerbatimChar"/>
-    <w:rPr>
-      <w:rFonts w:ascii="Consolas" w:hAnsi="Consolas"/>
-      <w:b/>
-      <w:i/>
-      <w:color w:val="8F5902"/>
-      <w:sz w:val="22"/>
-      <w:shd w:color="auto" w:fill="F8F8F8" w:val="clear"/>
-    </w:rPr>
-  </w:style>
-  <w:style w:customStyle="1" w:styleId="AnnotationTok" w:type="character">
-    <w:name w:val="AnnotationTok"/>
-    <w:basedOn w:val="VerbatimChar"/>
-    <w:rPr>
-      <w:rFonts w:ascii="Consolas" w:hAnsi="Consolas"/>
-      <w:b/>
-      <w:i/>
-      <w:color w:val="8F5902"/>
-      <w:sz w:val="22"/>
-      <w:shd w:color="auto" w:fill="F8F8F8" w:val="clear"/>
-    </w:rPr>
-  </w:style>
-  <w:style w:customStyle="1" w:styleId="CommentVarTok" w:type="character">
-    <w:name w:val="CommentVarTok"/>
-    <w:basedOn w:val="VerbatimChar"/>
-    <w:rPr>
-      <w:rFonts w:ascii="Consolas" w:hAnsi="Consolas"/>
-      <w:b/>
-      <w:i/>
-      <w:color w:val="8F5902"/>
-      <w:sz w:val="22"/>
-      <w:shd w:color="auto" w:fill="F8F8F8" w:val="clear"/>
-    </w:rPr>
-  </w:style>
-  <w:style w:customStyle="1" w:styleId="OtherTok" w:type="character">
-    <w:name w:val="OtherTok"/>
-    <w:basedOn w:val="VerbatimChar"/>
-    <w:rPr>
-      <w:rFonts w:ascii="Consolas" w:hAnsi="Consolas"/>
-      <w:color w:val="8F5902"/>
-      <w:sz w:val="22"/>
-      <w:shd w:color="auto" w:fill="F8F8F8" w:val="clear"/>
-    </w:rPr>
-  </w:style>
-  <w:style w:customStyle="1" w:styleId="FunctionTok" w:type="character">
-    <w:name w:val="FunctionTok"/>
-    <w:basedOn w:val="VerbatimChar"/>
-    <w:rPr>
-      <w:rFonts w:ascii="Consolas" w:hAnsi="Consolas"/>
-      <w:color w:val="000000"/>
-      <w:sz w:val="22"/>
-      <w:shd w:color="auto" w:fill="F8F8F8" w:val="clear"/>
-    </w:rPr>
-  </w:style>
-  <w:style w:customStyle="1" w:styleId="VariableTok" w:type="character">
-    <w:name w:val="VariableTok"/>
-    <w:basedOn w:val="VerbatimChar"/>
-    <w:rPr>
-      <w:rFonts w:ascii="Consolas" w:hAnsi="Consolas"/>
-      <w:color w:val="000000"/>
-      <w:sz w:val="22"/>
-      <w:shd w:color="auto" w:fill="F8F8F8" w:val="clear"/>
-    </w:rPr>
-  </w:style>
-  <w:style w:customStyle="1" w:styleId="ControlFlowTok" w:type="character">
-    <w:name w:val="ControlFlowTok"/>
-    <w:basedOn w:val="VerbatimChar"/>
-    <w:rPr>
-      <w:rFonts w:ascii="Consolas" w:hAnsi="Consolas"/>
-      <w:b/>
-      <w:color w:val="204A87"/>
-      <w:sz w:val="22"/>
-      <w:shd w:color="auto" w:fill="F8F8F8" w:val="clear"/>
-    </w:rPr>
-  </w:style>
-  <w:style w:customStyle="1" w:styleId="OperatorTok" w:type="character">
-    <w:name w:val="OperatorTok"/>
-    <w:basedOn w:val="VerbatimChar"/>
-    <w:rPr>
-      <w:rFonts w:ascii="Consolas" w:hAnsi="Consolas"/>
-      <w:b/>
-      <w:color w:val="CE5C00"/>
-      <w:sz w:val="22"/>
-      <w:shd w:color="auto" w:fill="F8F8F8" w:val="clear"/>
-    </w:rPr>
-  </w:style>
-  <w:style w:customStyle="1" w:styleId="BuiltInTok" w:type="character">
-    <w:name w:val="BuiltInTok"/>
-    <w:basedOn w:val="VerbatimChar"/>
-    <w:rPr>
-      <w:rFonts w:ascii="Consolas" w:hAnsi="Consolas"/>
-      <w:sz w:val="22"/>
-      <w:shd w:color="auto" w:fill="F8F8F8" w:val="clear"/>
-    </w:rPr>
-  </w:style>
-  <w:style w:customStyle="1" w:styleId="ExtensionTok" w:type="character">
-    <w:name w:val="ExtensionTok"/>
-    <w:basedOn w:val="VerbatimChar"/>
-    <w:rPr>
-      <w:rFonts w:ascii="Consolas" w:hAnsi="Consolas"/>
-      <w:sz w:val="22"/>
-      <w:shd w:color="auto" w:fill="F8F8F8" w:val="clear"/>
-    </w:rPr>
-  </w:style>
-  <w:style w:customStyle="1" w:styleId="PreprocessorTok" w:type="character">
-    <w:name w:val="PreprocessorTok"/>
-    <w:basedOn w:val="VerbatimChar"/>
-    <w:rPr>
-      <w:rFonts w:ascii="Consolas" w:hAnsi="Consolas"/>
-      <w:i/>
-      <w:color w:val="8F5902"/>
-      <w:sz w:val="22"/>
-      <w:shd w:color="auto" w:fill="F8F8F8" w:val="clear"/>
-    </w:rPr>
-  </w:style>
-  <w:style w:customStyle="1" w:styleId="AttributeTok" w:type="character">
-    <w:name w:val="AttributeTok"/>
-    <w:basedOn w:val="VerbatimChar"/>
-    <w:rPr>
-      <w:rFonts w:ascii="Consolas" w:hAnsi="Consolas"/>
-      <w:color w:val="C4A000"/>
-      <w:sz w:val="22"/>
-      <w:shd w:color="auto" w:fill="F8F8F8" w:val="clear"/>
-    </w:rPr>
-  </w:style>
-  <w:style w:customStyle="1" w:styleId="RegionMarkerTok" w:type="character">
-    <w:name w:val="RegionMarkerTok"/>
-    <w:basedOn w:val="VerbatimChar"/>
-    <w:rPr>
-      <w:rFonts w:ascii="Consolas" w:hAnsi="Consolas"/>
-      <w:sz w:val="22"/>
-      <w:shd w:color="auto" w:fill="F8F8F8" w:val="clear"/>
-    </w:rPr>
-  </w:style>
-  <w:style w:customStyle="1" w:styleId="InformationTok" w:type="character">
-    <w:name w:val="InformationTok"/>
-    <w:basedOn w:val="VerbatimChar"/>
-    <w:rPr>
-      <w:rFonts w:ascii="Consolas" w:hAnsi="Consolas"/>
-      <w:b/>
-      <w:i/>
-      <w:color w:val="8F5902"/>
-      <w:sz w:val="22"/>
-      <w:shd w:color="auto" w:fill="F8F8F8" w:val="clear"/>
-    </w:rPr>
-  </w:style>
-  <w:style w:customStyle="1" w:styleId="WarningTok" w:type="character">
-    <w:name w:val="WarningTok"/>
-    <w:basedOn w:val="VerbatimChar"/>
-    <w:rPr>
-      <w:rFonts w:ascii="Consolas" w:hAnsi="Consolas"/>
-      <w:b/>
-      <w:i/>
-      <w:color w:val="8F5902"/>
-      <w:sz w:val="22"/>
-      <w:shd w:color="auto" w:fill="F8F8F8" w:val="clear"/>
-    </w:rPr>
-  </w:style>
-  <w:style w:customStyle="1" w:styleId="AlertTok" w:type="character">
-    <w:name w:val="AlertTok"/>
-    <w:basedOn w:val="VerbatimChar"/>
-    <w:rPr>
-      <w:rFonts w:ascii="Consolas" w:hAnsi="Consolas"/>
-      <w:color w:val="EF2929"/>
-      <w:sz w:val="22"/>
-      <w:shd w:color="auto" w:fill="F8F8F8" w:val="clear"/>
-    </w:rPr>
-  </w:style>
-  <w:style w:customStyle="1" w:styleId="ErrorTok" w:type="character">
-    <w:name w:val="ErrorTok"/>
-    <w:basedOn w:val="VerbatimChar"/>
-    <w:rPr>
-      <w:rFonts w:ascii="Consolas" w:hAnsi="Consolas"/>
-      <w:b/>
-      <w:color w:val="A40000"/>
-      <w:sz w:val="22"/>
-      <w:shd w:color="auto" w:fill="F8F8F8" w:val="clear"/>
-    </w:rPr>
-  </w:style>
-  <w:style w:customStyle="1" w:styleId="NormalTok" w:type="character">
-    <w:name w:val="NormalTok"/>
-    <w:basedOn w:val="VerbatimChar"/>
-    <w:rPr>
-      <w:rFonts w:ascii="Consolas" w:hAnsi="Consolas"/>
-      <w:sz w:val="22"/>
-      <w:shd w:color="auto" w:fill="F8F8F8" w:val="clear"/>
-    </w:rPr>
-  </w:style>
-  <w:style w:styleId="LineNumber" w:type="character">
-    <w:name w:val="line number"/>
-    <w:basedOn w:val="DefaultParagraphFont"/>
-    <w:rsid w:val="00014752"/>
-  </w:style>
-</w:styles>
+<file path=word/styles.xml><?xml version="1.0" encoding="UTF-8"?><ns0:styles xmlns:ns0="http://schemas.openxmlformats.org/wordprocessingml/2006/main" xmlns:ns1="http://schemas.openxmlformats.org/markup-compatibility/2006" ns1:Ignorable="w14 w15 w16se w16cid w16 w16cex"><ns0:docDefaults><ns0:rPrDefault><ns0:rPr><ns0:rFonts ns0:asciiTheme="minorHAnsi" ns0:cstheme="minorBidi" ns0:eastAsiaTheme="minorHAnsi" ns0:hAnsiTheme="minorHAnsi" /><ns0:sz ns0:val="24" /><ns0:szCs ns0:val="24" /><ns0:lang ns0:bidi="ar-SA" ns0:eastAsia="en-US" ns0:val="en-US" /></ns0:rPr></ns0:rPrDefault><ns0:pPrDefault><ns0:pPr><ns0:spacing ns0:after="200" /></ns0:pPr></ns0:pPrDefault></ns0:docDefaults><ns0:latentStyles ns0:count="376" ns0:defLockedState="0" ns0:defQFormat="0" ns0:defSemiHidden="0" ns0:defUIPriority="0" ns0:defUnhideWhenUsed="0"><ns0:lsdException ns0:name="heading 2" ns0:semiHidden="1" ns0:unhideWhenUsed="1" /><ns0:lsdException ns0:name="heading 3" ns0:semiHidden="1" ns0:unhideWhenUsed="1" /><ns0:lsdException ns0:name="heading 4" ns0:semiHidden="1" ns0:unhideWhenUsed="1" /><ns0:lsdException ns0:name="heading 5" ns0:semiHidden="1" ns0:unhideWhenUsed="1" /><ns0:lsdException ns0:name="heading 6" ns0:semiHidden="1" ns0:unhideWhenUsed="1" /><ns0:lsdException ns0:name="heading 7" ns0:semiHidden="1" ns0:unhideWhenUsed="1" /><ns0:lsdException ns0:name="heading 8" ns0:semiHidden="1" ns0:unhideWhenUsed="1" /><ns0:lsdException ns0:name="heading 9" ns0:semiHidden="1" ns0:unhideWhenUsed="1" /><ns0:lsdException ns0:name="index 1" ns0:semiHidden="1" ns0:unhideWhenUsed="1" /><ns0:lsdException ns0:name="index 2" ns0:semiHidden="1" ns0:unhideWhenUsed="1" /><ns0:lsdException ns0:name="index 3" ns0:semiHidden="1" ns0:unhideWhenUsed="1" /><ns0:lsdException ns0:name="index 4" ns0:semiHidden="1" ns0:unhideWhenUsed="1" /><ns0:lsdException ns0:name="index 5" ns0:semiHidden="1" ns0:unhideWhenUsed="1" /><ns0:lsdException ns0:name="index 6" ns0:semiHidden="1" ns0:unhideWhenUsed="1" /><ns0:lsdException ns0:name="index 7" ns0:semiHidden="1" ns0:unhideWhenUsed="1" /><ns0:lsdException ns0:name="index 8" ns0:semiHidden="1" ns0:unhideWhenUsed="1" /><ns0:lsdException ns0:name="index 9" ns0:semiHidden="1" ns0:unhideWhenUsed="1" /><ns0:lsdException ns0:name="toc 1" ns0:semiHidden="1" ns0:unhideWhenUsed="1" /><ns0:lsdException ns0:name="toc 2" ns0:semiHidden="1" ns0:unhideWhenUsed="1" /><ns0:lsdException ns0:name="toc 3" ns0:semiHidden="1" ns0:unhideWhenUsed="1" /><ns0:lsdException ns0:name="toc 4" ns0:semiHidden="1" ns0:unhideWhenUsed="1" /><ns0:lsdException ns0:name="toc 5" ns0:semiHidden="1" ns0:unhideWhenUsed="1" /><ns0:lsdException ns0:name="toc 6" ns0:semiHidden="1" ns0:unhideWhenUsed="1" /><ns0:lsdException ns0:name="toc 7" ns0:semiHidden="1" ns0:unhideWhenUsed="1" /><ns0:lsdException ns0:name="toc 8" ns0:semiHidden="1" ns0:unhideWhenUsed="1" /><ns0:lsdException ns0:name="toc 9" ns0:semiHidden="1" ns0:unhideWhenUsed="1" /><ns0:lsdException ns0:name="Normal Indent" ns0:semiHidden="1" ns0:unhideWhenUsed="1" /><ns0:lsdException ns0:name="footnote text" ns0:semiHidden="1" ns0:unhideWhenUsed="1" /><ns0:lsdException ns0:name="annotation text" ns0:semiHidden="1" ns0:unhideWhenUsed="1" /><ns0:lsdException ns0:name="header" ns0:semiHidden="1" ns0:unhideWhenUsed="1" /><ns0:lsdException ns0:name="footer" ns0:semiHidden="1" ns0:unhideWhenUsed="1" /><ns0:lsdException ns0:name="index heading" ns0:semiHidden="1" ns0:unhideWhenUsed="1" /><ns0:lsdException ns0:name="caption" ns0:semiHidden="1" ns0:unhideWhenUsed="1" /><ns0:lsdException ns0:name="table of figures" ns0:semiHidden="1" ns0:unhideWhenUsed="1" /><ns0:lsdException ns0:name="envelope address" ns0:semiHidden="1" ns0:unhideWhenUsed="1" /><ns0:lsdException ns0:name="envelope return" ns0:semiHidden="1" ns0:unhideWhenUsed="1" /><ns0:lsdException ns0:name="footnote reference" ns0:semiHidden="1" ns0:unhideWhenUsed="1" /><ns0:lsdException ns0:name="annotation reference" ns0:semiHidden="1" ns0:unhideWhenUsed="1" /><ns0:lsdException ns0:name="line number" ns0:semiHidden="1" ns0:unhideWhenUsed="1" /><ns0:lsdException ns0:name="page number" ns0:semiHidden="1" ns0:unhideWhenUsed="1" /><ns0:lsdException ns0:name="endnote reference" ns0:semiHidden="1" ns0:unhideWhenUsed="1" /><ns0:lsdException ns0:name="endnote text" ns0:semiHidden="1" ns0:unhideWhenUsed="1" /><ns0:lsdException ns0:name="macro" ns0:semiHidden="1" ns0:unhideWhenUsed="1" /><ns0:lsdException ns0:name="toa heading" ns0:semiHidden="1" ns0:unhideWhenUsed="1" /><ns0:lsdException ns0:name="List Number" ns0:semiHidden="1" ns0:unhideWhenUsed="1" /><ns0:lsdException ns0:name="List 2" ns0:semiHidden="1" ns0:unhideWhenUsed="1" /><ns0:lsdException ns0:name="List 3" ns0:semiHidden="1" ns0:unhideWhenUsed="1" /><ns0:lsdException ns0:name="List 4" ns0:semiHidden="1" ns0:unhideWhenUsed="1" /><ns0:lsdException ns0:name="List 5" ns0:semiHidden="1" ns0:unhideWhenUsed="1" /><ns0:lsdException ns0:name="List Bullet 2" ns0:semiHidden="1" ns0:unhideWhenUsed="1" /><ns0:lsdException ns0:name="List Bullet 3" ns0:semiHidden="1" ns0:unhideWhenUsed="1" /><ns0:lsdException ns0:name="List Bullet 4" ns0:semiHidden="1" ns0:unhideWhenUsed="1" /><ns0:lsdException ns0:name="List Bullet 5" ns0:semiHidden="1" ns0:unhideWhenUsed="1" /><ns0:lsdException ns0:name="List Number 2" ns0:semiHidden="1" ns0:unhideWhenUsed="1" /><ns0:lsdException ns0:name="List Number 3" ns0:semiHidden="1" ns0:unhideWhenUsed="1" /><ns0:lsdException ns0:name="List Number 4" ns0:semiHidden="1" ns0:unhideWhenUsed="1" /><ns0:lsdException ns0:name="List Number 5" ns0:semiHidden="1" ns0:unhideWhenUsed="1" /><ns0:lsdException ns0:name="Closing" ns0:semiHidden="1" ns0:unhideWhenUsed="1" /><ns0:lsdException ns0:name="Signature" ns0:semiHidden="1" ns0:unhideWhenUsed="1" /><ns0:lsdException ns0:name="Default Paragraph Font" ns0:semiHidden="1" ns0:unhideWhenUsed="1" /><ns0:lsdException ns0:name="Body Text" ns0:semiHidden="1" ns0:unhideWhenUsed="1" /><ns0:lsdException ns0:name="Body Text Indent" ns0:semiHidden="1" ns0:unhideWhenUsed="1" /><ns0:lsdException ns0:name="List Continue" ns0:semiHidden="1" ns0:unhideWhenUsed="1" /><ns0:lsdException ns0:name="Message Header" ns0:semiHidden="1" ns0:unhideWhenUsed="1" /><ns0:lsdException ns0:name="Salutation" ns0:semiHidden="1" ns0:unhideWhenUsed="1" /><ns0:lsdException ns0:name="Date" ns0:semiHidden="1" ns0:unhideWhenUsed="1" /><ns0:lsdException ns0:name="Body Text First Indent" ns0:semiHidden="1" ns0:unhideWhenUsed="1" /><ns0:lsdException ns0:name="Body Text First Indent 2" ns0:semiHidden="1" ns0:unhideWhenUsed="1" /><ns0:lsdException ns0:name="Note Heading" ns0:semiHidden="1" ns0:unhideWhenUsed="1" /><ns0:lsdException ns0:name="Body Text 2" ns0:semiHidden="1" ns0:unhideWhenUsed="1" /><ns0:lsdException ns0:name="Body Text 3" ns0:semiHidden="1" ns0:unhideWhenUsed="1" /><ns0:lsdException ns0:name="Body Text Indent 2" ns0:semiHidden="1" ns0:unhideWhenUsed="1" /><ns0:lsdException ns0:name="Body Text Indent 3" ns0:semiHidden="1" ns0:unhideWhenUsed="1" /><ns0:lsdException ns0:name="Block Text" ns0:semiHidden="1" ns0:unhideWhenUsed="1" /><ns0:lsdException ns0:name="Hyperlink" ns0:semiHidden="1" ns0:unhideWhenUsed="1" /><ns0:lsdException ns0:name="FollowedHyperlink" ns0:semiHidden="1" ns0:unhideWhenUsed="1" /><ns0:lsdException ns0:name="Document Map" ns0:semiHidden="1" ns0:unhideWhenUsed="1" /><ns0:lsdException ns0:name="Plain Text" ns0:semiHidden="1" ns0:unhideWhenUsed="1" /><ns0:lsdException ns0:name="E-mail Signature" ns0:semiHidden="1" ns0:unhideWhenUsed="1" /><ns0:lsdException ns0:name="HTML Top of Form" ns0:semiHidden="1" ns0:unhideWhenUsed="1" /><ns0:lsdException ns0:name="HTML Bottom of Form" ns0:semiHidden="1" ns0:unhideWhenUsed="1" /><ns0:lsdException ns0:name="Normal (Web)" ns0:semiHidden="1" ns0:unhideWhenUsed="1" /><ns0:lsdException ns0:name="HTML Acronym" ns0:semiHidden="1" ns0:unhideWhenUsed="1" /><ns0:lsdException ns0:name="HTML Address" ns0:semiHidden="1" ns0:unhideWhenUsed="1" /><ns0:lsdException ns0:name="HTML Cite" ns0:semiHidden="1" ns0:unhideWhenUsed="1" /><ns0:lsdException ns0:name="HTML Code" ns0:semiHidden="1" ns0:unhideWhenUsed="1" /><ns0:lsdException ns0:name="HTML Definition" ns0:semiHidden="1" ns0:unhideWhenUsed="1" /><ns0:lsdException ns0:name="HTML Keyboard" ns0:semiHidden="1" ns0:unhideWhenUsed="1" /><ns0:lsdException ns0:name="HTML Preformatted" ns0:semiHidden="1" ns0:unhideWhenUsed="1" /><ns0:lsdException ns0:name="HTML Sample" ns0:semiHidden="1" ns0:unhideWhenUsed="1" /><ns0:lsdException ns0:name="HTML Typewriter" ns0:semiHidden="1" ns0:unhideWhenUsed="1" /><ns0:lsdException ns0:name="HTML Variable" ns0:semiHidden="1" ns0:unhideWhenUsed="1" /><ns0:lsdException ns0:name="Normal Table" ns0:semiHidden="1" ns0:unhideWhenUsed="1" /><ns0:lsdException ns0:name="annotation subject" ns0:semiHidden="1" ns0:unhideWhenUsed="1" /><ns0:lsdException ns0:name="No List" ns0:semiHidden="1" ns0:unhideWhenUsed="1" /><ns0:lsdException ns0:name="Outline List 1" ns0:semiHidden="1" ns0:unhideWhenUsed="1" /><ns0:lsdException ns0:name="Outline List 2" ns0:semiHidden="1" ns0:unhideWhenUsed="1" /><ns0:lsdException ns0:name="Outline List 3" ns0:semiHidden="1" ns0:unhideWhenUsed="1" /><ns0:lsdException ns0:name="Table Simple 1" ns0:semiHidden="1" ns0:unhideWhenUsed="1" /><ns0:lsdException ns0:name="Table Simple 2" ns0:semiHidden="1" ns0:unhideWhenUsed="1" /><ns0:lsdException ns0:name="Table Simple 3" ns0:semiHidden="1" ns0:unhideWhenUsed="1" /><ns0:lsdException ns0:name="Table Classic 1" ns0:semiHidden="1" ns0:unhideWhenUsed="1" /><ns0:lsdException ns0:name="Table Classic 2" ns0:semiHidden="1" ns0:unhideWhenUsed="1" /><ns0:lsdException ns0:name="Table Classic 3" ns0:semiHidden="1" ns0:unhideWhenUsed="1" /><ns0:lsdException ns0:name="Table Classic 4" ns0:semiHidden="1" ns0:unhideWhenUsed="1" /><ns0:lsdException ns0:name="Table Colorful 1" ns0:semiHidden="1" ns0:unhideWhenUsed="1" /><ns0:lsdException ns0:name="Table Colorful 2" ns0:semiHidden="1" ns0:unhideWhenUsed="1" /><ns0:lsdException ns0:name="Table Colorful 3" ns0:semiHidden="1" ns0:unhideWhenUsed="1" /><ns0:lsdException ns0:name="Table Columns 1" ns0:semiHidden="1" ns0:unhideWhenUsed="1" /><ns0:lsdException ns0:name="Table Columns 2" ns0:semiHidden="1" ns0:unhideWhenUsed="1" /><ns0:lsdException ns0:name="Table Columns 3" ns0:semiHidden="1" ns0:unhideWhenUsed="1" /><ns0:lsdException ns0:name="Table Columns 4" ns0:semiHidden="1" ns0:unhideWhenUsed="1" /><ns0:lsdException ns0:name="Table Columns 5" ns0:semiHidden="1" ns0:unhideWhenUsed="1" /><ns0:lsdException ns0:name="Table Grid 1" ns0:semiHidden="1" ns0:unhideWhenUsed="1" /><ns0:lsdException ns0:name="Table Grid 2" ns0:semiHidden="1" ns0:unhideWhenUsed="1" /><ns0:lsdException ns0:name="Table Grid 3" ns0:semiHidden="1" ns0:unhideWhenUsed="1" /><ns0:lsdException ns0:name="Table Grid 4" ns0:semiHidden="1" ns0:unhideWhenUsed="1" /><ns0:lsdException ns0:name="Table Grid 5" ns0:semiHidden="1" ns0:unhideWhenUsed="1" /><ns0:lsdException ns0:name="Table Grid 6" ns0:semiHidden="1" ns0:unhideWhenUsed="1" /><ns0:lsdException ns0:name="Table Grid 7" ns0:semiHidden="1" ns0:unhideWhenUsed="1" /><ns0:lsdException ns0:name="Table Grid 8" ns0:semiHidden="1" ns0:unhideWhenUsed="1" /><ns0:lsdException ns0:name="Table List 1" ns0:semiHidden="1" ns0:unhideWhenUsed="1" /><ns0:lsdException ns0:name="Table List 2" ns0:semiHidden="1" ns0:unhideWhenUsed="1" /><ns0:lsdException ns0:name="Table List 3" ns0:semiHidden="1" ns0:unhideWhenUsed="1" /><ns0:lsdException ns0:name="Table List 4" ns0:semiHidden="1" ns0:unhideWhenUsed="1" /><ns0:lsdException ns0:name="Table List 5" ns0:semiHidden="1" ns0:unhideWhenUsed="1" /><ns0:lsdException ns0:name="Table List 6" ns0:semiHidden="1" ns0:unhideWhenUsed="1" /><ns0:lsdException ns0:name="Table List 7" ns0:semiHidden="1" ns0:unhideWhenUsed="1" /><ns0:lsdException ns0:name="Table List 8" ns0:semiHidden="1" ns0:unhideWhenUsed="1" /><ns0:lsdException ns0:name="Table 3D effects 1" ns0:semiHidden="1" ns0:unhideWhenUsed="1" /><ns0:lsdException ns0:name="Table 3D effects 2" ns0:semiHidden="1" ns0:unhideWhenUsed="1" /><ns0:lsdException ns0:name="Table 3D effects 3" ns0:semiHidden="1" ns0:unhideWhenUsed="1" /><ns0:lsdException ns0:name="Table Contemporary" ns0:semiHidden="1" ns0:unhideWhenUsed="1" /><ns0:lsdException ns0:name="Table Elegant" ns0:semiHidden="1" ns0:unhideWhenUsed="1" /><ns0:lsdException ns0:name="Table Professional" ns0:semiHidden="1" ns0:unhideWhenUsed="1" /><ns0:lsdException ns0:name="Table Subtle 1" ns0:semiHidden="1" ns0:unhideWhenUsed="1" /><ns0:lsdException ns0:name="Table Subtle 2" ns0:semiHidden="1" ns0:unhideWhenUsed="1" /><ns0:lsdException ns0:name="Table Web 1" ns0:semiHidden="1" ns0:unhideWhenUsed="1" /><ns0:lsdException ns0:name="Light Shading" /><ns0:lsdException ns0:name="Light List" /><ns0:lsdException ns0:name="Light Grid" /><ns0:lsdException ns0:name="Medium Shading 1" /><ns0:lsdException ns0:name="Medium Shading 2" /><ns0:lsdException ns0:name="Medium List 1" /><ns0:lsdException ns0:name="Medium List 2" /><ns0:lsdException ns0:name="Medium Grid 1" /><ns0:lsdException ns0:name="Medium Grid 2" /><ns0:lsdException ns0:name="Medium Grid 3" /><ns0:lsdException ns0:name="Dark List" /><ns0:lsdException ns0:name="Colorful Shading" /><ns0:lsdException ns0:name="Colorful List" /><ns0:lsdException ns0:name="Colorful Grid" /><ns0:lsdException ns0:name="Light Shading Accent 1" /><ns0:lsdException ns0:name="Light List Accent 1" /><ns0:lsdException ns0:name="Light Grid Accent 1" /><ns0:lsdException ns0:name="Medium Shading 1 Accent 1" /><ns0:lsdException ns0:name="Medium Shading 2 Accent 1" /><ns0:lsdException ns0:name="Medium List 1 Accent 1" /><ns0:lsdException ns0:name="Revision" ns0:semiHidden="1" /><ns0:lsdException ns0:name="Medium List 2 Accent 1" /><ns0:lsdException ns0:name="Medium Grid 1 Accent 1" /><ns0:lsdException ns0:name="Medium Grid 2 Accent 1" /><ns0:lsdException ns0:name="Medium Grid 3 Accent 1" /><ns0:lsdException ns0:name="Dark List Accent 1" /><ns0:lsdException ns0:name="Colorful Shading Accent 1" /><ns0:lsdException ns0:name="Colorful List Accent 1" /><ns0:lsdException ns0:name="Colorful Grid Accent 1" /><ns0:lsdException ns0:name="Light Shading Accent 2" /><ns0:lsdException ns0:name="Light List Accent 2" /><ns0:lsdException ns0:name="Light Grid Accent 2" /><ns0:lsdException ns0:name="Medium Shading 1 Accent 2" /><ns0:lsdException ns0:name="Medium Shading 2 Accent 2" /><ns0:lsdException ns0:name="Medium List 1 Accent 2" /><ns0:lsdException ns0:name="Medium List 2 Accent 2" /><ns0:lsdException ns0:name="Medium Grid 1 Accent 2" /><ns0:lsdException ns0:name="Medium Grid 2 Accent 2" /><ns0:lsdException ns0:name="Medium Grid 3 Accent 2" /><ns0:lsdException ns0:name="Dark List Accent 2" /><ns0:lsdException ns0:name="Colorful Shading Accent 2" /><ns0:lsdException ns0:name="Colorful List Accent 2" /><ns0:lsdException ns0:name="Colorful Grid Accent 2" /><ns0:lsdException ns0:name="Light Shading Accent 3" /><ns0:lsdException ns0:name="Light List Accent 3" /><ns0:lsdException ns0:name="Light Grid Accent 3" /><ns0:lsdException ns0:name="Medium Shading 1 Accent 3" /><ns0:lsdException ns0:name="Medium Shading 2 Accent 3" /><ns0:lsdException ns0:name="Medium List 1 Accent 3" /><ns0:lsdException ns0:name="Medium List 2 Accent 3" /><ns0:lsdException ns0:name="Medium Grid 1 Accent 3" /><ns0:lsdException ns0:name="Medium Grid 2 Accent 3" /><ns0:lsdException ns0:name="Medium Grid 3 Accent 3" /><ns0:lsdException ns0:name="Dark List Accent 3" /><ns0:lsdException ns0:name="Colorful Shading Accent 3" /><ns0:lsdException ns0:name="Colorful List Accent 3" /><ns0:lsdException ns0:name="Colorful Grid Accent 3" /><ns0:lsdException ns0:name="Light Shading Accent 4" /><ns0:lsdException ns0:name="Light List Accent 4" /><ns0:lsdException ns0:name="Light Grid Accent 4" /><ns0:lsdException ns0:name="Medium Shading 1 Accent 4" /><ns0:lsdException ns0:name="Medium Shading 2 Accent 4" /><ns0:lsdException ns0:name="Medium List 1 Accent 4" /><ns0:lsdException ns0:name="Medium List 2 Accent 4" /><ns0:lsdException ns0:name="Medium Grid 1 Accent 4" /><ns0:lsdException ns0:name="Medium Grid 2 Accent 4" /><ns0:lsdException ns0:name="Medium Grid 3 Accent 4" /><ns0:lsdException ns0:name="Dark List Accent 4" /><ns0:lsdException ns0:name="Colorful Shading Accent 4" /><ns0:lsdException ns0:name="Colorful List Accent 4" /><ns0:lsdException ns0:name="Colorful Grid Accent 4" /><ns0:lsdException ns0:name="Light Shading Accent 5" /><ns0:lsdException ns0:name="Light List Accent 5" /><ns0:lsdException ns0:name="Light Grid Accent 5" /><ns0:lsdException ns0:name="Medium Shading 1 Accent 5" /><ns0:lsdException ns0:name="Medium Shading 2 Accent 5" /><ns0:lsdException ns0:name="Medium List 1 Accent 5" /><ns0:lsdException ns0:name="Medium List 2 Accent 5" /><ns0:lsdException ns0:name="Medium Grid 1 Accent 5" /><ns0:lsdException ns0:name="Medium Grid 2 Accent 5" /><ns0:lsdException ns0:name="Medium Grid 3 Accent 5" /><ns0:lsdException ns0:name="Dark List Accent 5" /><ns0:lsdException ns0:name="Colorful Shading Accent 5" /><ns0:lsdException ns0:name="Colorful List Accent 5" /><ns0:lsdException ns0:name="Colorful Grid Accent 5" /><ns0:lsdException ns0:name="Light Shading Accent 6" /><ns0:lsdException ns0:name="Light List Accent 6" /><ns0:lsdException ns0:name="Light Grid Accent 6" /><ns0:lsdException ns0:name="Medium Shading 1 Accent 6" /><ns0:lsdException ns0:name="Medium Shading 2 Accent 6" /><ns0:lsdException ns0:name="Medium List 1 Accent 6" /><ns0:lsdException ns0:name="Medium List 2 Accent 6" /><ns0:lsdException ns0:name="Medium Grid 1 Accent 6" /><ns0:lsdException ns0:name="Medium Grid 2 Accent 6" /><ns0:lsdException ns0:name="Medium Grid 3 Accent 6" /><ns0:lsdException ns0:name="Dark List Accent 6" /><ns0:lsdException ns0:name="Colorful Shading Accent 6" /><ns0:lsdException ns0:name="Colorful List Accent 6" /><ns0:lsdException ns0:name="Colorful Grid Accent 6" /><ns0:lsdException ns0:name="Plain Table 1" ns0:uiPriority="41" /><ns0:lsdException ns0:name="Plain Table 2" ns0:uiPriority="42" /><ns0:lsdException ns0:name="Plain Table 3" ns0:uiPriority="43" /><ns0:lsdException ns0:name="Plain Table 4" ns0:uiPriority="44" /><ns0:lsdException ns0:name="Plain Table 5" ns0:uiPriority="45" /><ns0:lsdException ns0:name="Grid Table Light" ns0:uiPriority="40" /><ns0:lsdException ns0:name="Grid Table 1 Light" ns0:uiPriority="46" /><ns0:lsdException ns0:name="Grid Table 2" ns0:uiPriority="47" /><ns0:lsdException ns0:name="Grid Table 3" ns0:uiPriority="48" /><ns0:lsdException ns0:name="Grid Table 4" ns0:uiPriority="49" /><ns0:lsdException ns0:name="Grid Table 5 Dark" ns0:uiPriority="50" /><ns0:lsdException ns0:name="Grid Table 6 Colorful" ns0:uiPriority="51" /><ns0:lsdException ns0:name="Grid Table 7 Colorful" ns0:uiPriority="52" /><ns0:lsdException ns0:name="Grid Table 1 Light Accent 1" ns0:uiPriority="46" /><ns0:lsdException ns0:name="Grid Table 2 Accent 1" ns0:uiPriority="47" /><ns0:lsdException ns0:name="Grid Table 3 Accent 1" ns0:uiPriority="48" /><ns0:lsdException ns0:name="Grid Table 4 Accent 1" ns0:uiPriority="49" /><ns0:lsdException ns0:name="Grid Table 5 Dark Accent 1" ns0:uiPriority="50" /><ns0:lsdException ns0:name="Grid Table 6 Colorful Accent 1" ns0:uiPriority="51" /><ns0:lsdException ns0:name="Grid Table 7 Colorful Accent 1" ns0:uiPriority="52" /><ns0:lsdException ns0:name="Grid Table 1 Light Accent 2" ns0:uiPriority="46" /><ns0:lsdException ns0:name="Grid Table 2 Accent 2" ns0:uiPriority="47" /><ns0:lsdException ns0:name="Grid Table 3 Accent 2" ns0:uiPriority="48" /><ns0:lsdException ns0:name="Grid Table 4 Accent 2" ns0:uiPriority="49" /><ns0:lsdException ns0:name="Grid Table 5 Dark Accent 2" ns0:uiPriority="50" /><ns0:lsdException ns0:name="Grid Table 6 Colorful Accent 2" ns0:uiPriority="51" /><ns0:lsdException ns0:name="Grid Table 7 Colorful Accent 2" ns0:uiPriority="52" /><ns0:lsdException ns0:name="Grid Table 1 Light Accent 3" ns0:uiPriority="46" /><ns0:lsdException ns0:name="Grid Table 2 Accent 3" ns0:uiPriority="47" /><ns0:lsdException ns0:name="Grid Table 3 Accent 3" ns0:uiPriority="48" /><ns0:lsdException ns0:name="Grid Table 4 Accent 3" ns0:uiPriority="49" /><ns0:lsdException ns0:name="Grid Table 5 Dark Accent 3" ns0:uiPriority="50" /><ns0:lsdException ns0:name="Grid Table 6 Colorful Accent 3" ns0:uiPriority="51" /><ns0:lsdException ns0:name="Grid Table 7 Colorful Accent 3" ns0:uiPriority="52" /><ns0:lsdException ns0:name="Grid Table 1 Light Accent 4" ns0:uiPriority="46" /><ns0:lsdException ns0:name="Grid Table 2 Accent 4" ns0:uiPriority="47" /><ns0:lsdException ns0:name="Grid Table 3 Accent 4" ns0:uiPriority="48" /><ns0:lsdException ns0:name="Grid Table 4 Accent 4" ns0:uiPriority="49" /><ns0:lsdException ns0:name="Grid Table 5 Dark Accent 4" ns0:uiPriority="50" /><ns0:lsdException ns0:name="Grid Table 6 Colorful Accent 4" ns0:uiPriority="51" /><ns0:lsdException ns0:name="Grid Table 7 Colorful Accent 4" ns0:uiPriority="52" /><ns0:lsdException ns0:name="Grid Table 1 Light Accent 5" ns0:uiPriority="46" /><ns0:lsdException ns0:name="Grid Table 2 Accent 5" ns0:uiPriority="47" /><ns0:lsdException ns0:name="Grid Table 3 Accent 5" ns0:uiPriority="48" /><ns0:lsdException ns0:name="Grid Table 4 Accent 5" ns0:uiPriority="49" /><ns0:lsdException ns0:name="Grid Table 5 Dark Accent 5" ns0:uiPriority="50" /><ns0:lsdException ns0:name="Grid Table 6 Colorful Accent 5" ns0:uiPriority="51" /><ns0:lsdException ns0:name="Grid Table 7 Colorful Accent 5" ns0:uiPriority="52" /><ns0:lsdException ns0:name="Grid Table 1 Light Accent 6" ns0:uiPriority="46" /><ns0:lsdException ns0:name="Grid Table 2 Accent 6" ns0:uiPriority="47" /><ns0:lsdException ns0:name="Grid Table 3 Accent 6" ns0:uiPriority="48" /><ns0:lsdException ns0:name="Grid Table 4 Accent 6" ns0:uiPriority="49" /><ns0:lsdException ns0:name="Grid Table 5 Dark Accent 6" ns0:uiPriority="50" /><ns0:lsdException ns0:name="Grid Table 6 Colorful Accent 6" ns0:uiPriority="51" /><ns0:lsdException ns0:name="Grid Table 7 Colorful Accent 6" ns0:uiPriority="52" /><ns0:lsdException ns0:name="List Table 1 Light" ns0:uiPriority="46" /><ns0:lsdException ns0:name="List Table 2" ns0:uiPriority="47" /><ns0:lsdException ns0:name="List Table 3" ns0:uiPriority="48" /><ns0:lsdException ns0:name="List Table 4" ns0:uiPriority="49" /><ns0:lsdException ns0:name="List Table 5 Dark" ns0:uiPriority="50" /><ns0:lsdException ns0:name="List Table 6 Colorful" ns0:uiPriority="51" /><ns0:lsdException ns0:name="List Table 7 Colorful" ns0:uiPriority="52" /><ns0:lsdException ns0:name="List Table 1 Light Accent 1" ns0:uiPriority="46" /><ns0:lsdException ns0:name="List Table 2 Accent 1" ns0:uiPriority="47" /><ns0:lsdException ns0:name="List Table 3 Accent 1" ns0:uiPriority="48" /><ns0:lsdException ns0:name="List Table 4 Accent 1" ns0:uiPriority="49" /><ns0:lsdException ns0:name="List Table 5 Dark Accent 1" ns0:uiPriority="50" /><ns0:lsdException ns0:name="List Table 6 Colorful Accent 1" ns0:uiPriority="51" /><ns0:lsdException ns0:name="List Table 7 Colorful Accent 1" ns0:uiPriority="52" /><ns0:lsdException ns0:name="List Table 1 Light Accent 2" ns0:uiPriority="46" /><ns0:lsdException ns0:name="List Table 2 Accent 2" ns0:uiPriority="47" /><ns0:lsdException ns0:name="List Table 3 Accent 2" ns0:uiPriority="48" /><ns0:lsdException ns0:name="List Table 4 Accent 2" ns0:uiPriority="49" /><ns0:lsdException ns0:name="List Table 5 Dark Accent 2" ns0:uiPriority="50" /><ns0:lsdException ns0:name="List Table 6 Colorful Accent 2" ns0:uiPriority="51" /><ns0:lsdException ns0:name="List Table 7 Colorful Accent 2" ns0:uiPriority="52" /><ns0:lsdException ns0:name="List Table 1 Light Accent 3" ns0:uiPriority="46" /><ns0:lsdException ns0:name="List Table 2 Accent 3" ns0:uiPriority="47" /><ns0:lsdException ns0:name="List Table 3 Accent 3" ns0:uiPriority="48" /><ns0:lsdException ns0:name="List Table 4 Accent 3" ns0:uiPriority="49" /><ns0:lsdException ns0:name="List Table 5 Dark Accent 3" ns0:uiPriority="50" /><ns0:lsdException ns0:name="List Table 6 Colorful Accent 3" ns0:uiPriority="51" /><ns0:lsdException ns0:name="List Table 7 Colorful Accent 3" ns0:uiPriority="52" /><ns0:lsdException ns0:name="List Table 1 Light Accent 4" ns0:uiPriority="46" /><ns0:lsdException ns0:name="List Table 2 Accent 4" ns0:uiPriority="47" /><ns0:lsdException ns0:name="List Table 3 Accent 4" ns0:uiPriority="48" /><ns0:lsdException ns0:name="List Table 4 Accent 4" ns0:uiPriority="49" /><ns0:lsdException ns0:name="List Table 5 Dark Accent 4" ns0:uiPriority="50" /><ns0:lsdException ns0:name="List Table 6 Colorful Accent 4" ns0:uiPriority="51" /><ns0:lsdException ns0:name="List Table 7 Colorful Accent 4" ns0:uiPriority="52" /><ns0:lsdException ns0:name="List Table 1 Light Accent 5" ns0:uiPriority="46" /><ns0:lsdException ns0:name="List Table 2 Accent 5" ns0:uiPriority="47" /><ns0:lsdException ns0:name="List Table 3 Accent 5" ns0:uiPriority="48" /><ns0:lsdException ns0:name="List Table 4 Accent 5" ns0:uiPriority="49" /><ns0:lsdException ns0:name="List Table 5 Dark Accent 5" ns0:uiPriority="50" /><ns0:lsdException ns0:name="List Table 6 Colorful Accent 5" ns0:uiPriority="51" /><ns0:lsdException ns0:name="List Table 7 Colorful Accent 5" ns0:uiPriority="52" /><ns0:lsdException ns0:name="List Table 1 Light Accent 6" ns0:uiPriority="46" /><ns0:lsdException ns0:name="List Table 2 Accent 6" ns0:uiPriority="47" /><ns0:lsdException ns0:name="List Table 3 Accent 6" ns0:uiPriority="48" /><ns0:lsdException ns0:name="List Table 4 Accent 6" ns0:uiPriority="49" /><ns0:lsdException ns0:name="List Table 5 Dark Accent 6" ns0:uiPriority="50" /><ns0:lsdException ns0:name="List Table 6 Colorful Accent 6" ns0:uiPriority="51" /><ns0:lsdException ns0:name="List Table 7 Colorful Accent 6" ns0:uiPriority="52" /><ns0:lsdException ns0:name="Mention" ns0:semiHidden="1" ns0:uiPriority="99" ns0:unhideWhenUsed="1" /><ns0:lsdException ns0:name="Smart Hyperlink" ns0:semiHidden="1" ns0:uiPriority="99" ns0:unhideWhenUsed="1" /><ns0:lsdException ns0:name="Hashtag" ns0:semiHidden="1" ns0:uiPriority="99" ns0:unhideWhenUsed="1" /><ns0:lsdException ns0:name="Unresolved Mention" ns0:semiHidden="1" ns0:uiPriority="99" ns0:unhideWhenUsed="1" /><ns0:lsdException ns0:name="Smart Link" ns0:semiHidden="1" ns0:uiPriority="99" ns0:unhideWhenUsed="1" /></ns0:latentStyles><ns0:style ns0:default="1" ns0:styleId="Normal" ns0:type="paragraph"><ns0:name ns0:val="Normal" /><ns0:qFormat /></ns0:style><ns0:style ns0:styleId="Heading1" ns0:type="paragraph"><ns0:name ns0:val="heading 1" /><ns0:basedOn ns0:val="Normal" /><ns0:next ns0:val="BodyText" /><ns0:uiPriority ns0:val="9" /><ns0:qFormat /><ns0:pPr><ns0:keepNext /><ns0:keepLines /><ns0:spacing ns0:after="0" ns0:before="480" /><ns0:outlineLvl ns0:val="0" /></ns0:pPr><ns0:rPr><ns0:rFonts ns0:asciiTheme="majorHAnsi" ns0:cstheme="majorBidi" ns0:eastAsiaTheme="majorEastAsia" ns0:hAnsiTheme="majorHAnsi" /><ns0:b /><ns0:bCs /><ns0:color ns0:themeColor="accent1" ns0:themeShade="B5" ns0:val="345A8A" /><ns0:sz ns0:val="32" /><ns0:szCs ns0:val="32" /></ns0:rPr></ns0:style><ns0:style ns0:styleId="Heading2" ns0:type="paragraph"><ns0:name ns0:val="heading 2" /><ns0:basedOn ns0:val="Normal" /><ns0:next ns0:val="BodyText" /><ns0:uiPriority ns0:val="9" /><ns0:unhideWhenUsed /><ns0:qFormat /><ns0:pPr><ns0:keepNext /><ns0:keepLines /><ns0:spacing ns0:after="0" ns0:before="200" /><ns0:outlineLvl ns0:val="1" /></ns0:pPr><ns0:rPr><ns0:rFonts ns0:asciiTheme="majorHAnsi" ns0:cstheme="majorBidi" ns0:eastAsiaTheme="majorEastAsia" ns0:hAnsiTheme="majorHAnsi" /><ns0:b /><ns0:bCs /><ns0:color ns0:themeColor="accent1" ns0:val="4F81BD" /><ns0:sz ns0:val="32" /><ns0:szCs ns0:val="32" /></ns0:rPr></ns0:style><ns0:style ns0:styleId="Heading3" ns0:type="paragraph"><ns0:name ns0:val="heading 3" /><ns0:basedOn ns0:val="Normal" /><ns0:next ns0:val="BodyText" /><ns0:uiPriority ns0:val="9" /><ns0:unhideWhenUsed /><ns0:qFormat /><ns0:pPr><ns0:keepNext /><ns0:keepLines /><ns0:spacing ns0:after="0" ns0:before="200" /><ns0:outlineLvl ns0:val="2" /></ns0:pPr><ns0:rPr><ns0:rFonts ns0:asciiTheme="majorHAnsi" ns0:cstheme="majorBidi" ns0:eastAsiaTheme="majorEastAsia" ns0:hAnsiTheme="majorHAnsi" /><ns0:b /><ns0:bCs /><ns0:color ns0:themeColor="accent1" ns0:val="4F81BD" /><ns0:sz ns0:val="28" /><ns0:szCs ns0:val="28" /></ns0:rPr></ns0:style><ns0:style ns0:styleId="Heading4" ns0:type="paragraph"><ns0:name ns0:val="heading 4" /><ns0:basedOn ns0:val="Normal" /><ns0:next ns0:val="BodyText" /><ns0:uiPriority ns0:val="9" /><ns0:unhideWhenUsed /><ns0:qFormat /><ns0:pPr><ns0:keepNext /><ns0:keepLines /><ns0:spacing ns0:after="0" ns0:before="200" /><ns0:outlineLvl ns0:val="3" /></ns0:pPr><ns0:rPr><ns0:rFonts ns0:asciiTheme="majorHAnsi" ns0:cstheme="majorBidi" ns0:eastAsiaTheme="majorEastAsia" ns0:hAnsiTheme="majorHAnsi" /><ns0:b /><ns0:bCs /><ns0:color ns0:themeColor="accent1" ns0:val="4F81BD" /></ns0:rPr></ns0:style><ns0:style ns0:styleId="Heading5" ns0:type="paragraph"><ns0:name ns0:val="heading 5" /><ns0:basedOn ns0:val="Normal" /><ns0:next ns0:val="BodyText" /><ns0:uiPriority ns0:val="9" /><ns0:unhideWhenUsed /><ns0:qFormat /><ns0:rsid ns0:val="00884F3F" /><ns0:pPr><ns0:keepNext /><ns0:keepLines /><ns0:pageBreakBefore /><ns0:spacing ns0:after="0" ns0:before="200" ns0:line="20" ns0:lineRule="exact" /><ns0:outlineLvl ns0:val="4" /></ns0:pPr><ns0:rPr><ns0:rFonts ns0:asciiTheme="majorHAnsi" ns0:cstheme="majorBidi" ns0:eastAsiaTheme="majorEastAsia" ns0:hAnsiTheme="majorHAnsi" /><ns0:i /><ns0:iCs /><ns0:color ns0:themeColor="background1" ns0:val="FFFFFF" /><ns0:sz ns0:val="16" /></ns0:rPr></ns0:style><ns0:style ns0:styleId="Heading6" ns0:type="paragraph"><ns0:name ns0:val="heading 6" /><ns0:basedOn ns0:val="Normal" /><ns0:next ns0:val="BodyText" /><ns0:uiPriority ns0:val="9" /><ns0:unhideWhenUsed /><ns0:qFormat /><ns0:pPr><ns0:keepNext /><ns0:keepLines /><ns0:spacing ns0:after="0" ns0:before="200" /><ns0:outlineLvl ns0:val="5" /></ns0:pPr><ns0:rPr><ns0:rFonts ns0:asciiTheme="majorHAnsi" ns0:cstheme="majorBidi" ns0:eastAsiaTheme="majorEastAsia" ns0:hAnsiTheme="majorHAnsi" /><ns0:color ns0:themeColor="accent1" ns0:val="4F81BD" /></ns0:rPr></ns0:style><ns0:style ns0:default="1" ns0:styleId="DefaultParagraphFont" ns0:type="character"><ns0:name ns0:val="Default Paragraph Font" /><ns0:uiPriority ns0:val="1" /><ns0:semiHidden /><ns0:unhideWhenUsed /></ns0:style><ns0:style ns0:default="1" ns0:styleId="TableNormal" ns0:type="table"><ns0:name ns0:val="Normal Table" /><ns0:uiPriority ns0:val="99" /><ns0:semiHidden /><ns0:unhideWhenUsed /><ns0:tblPr><ns0:tblInd ns0:type="dxa" ns0:w="0" /><ns0:tblCellMar><ns0:top ns0:type="dxa" ns0:w="0" /><ns0:left ns0:type="dxa" ns0:w="108" /><ns0:bottom ns0:type="dxa" ns0:w="0" /><ns0:right ns0:type="dxa" ns0:w="108" /></ns0:tblCellMar><ns0:tblBorders><ns0:top ns0:color="000000" ns0:space="0" ns0:sz="4" ns0:val="single" /><ns0:bottom ns0:color="000000" ns0:space="0" ns0:sz="4" ns0:val="single" /></ns0:tblBorders></ns0:tblPr></ns0:style><ns0:style ns0:default="1" ns0:styleId="NoList" ns0:type="numbering"><ns0:name ns0:val="No List" /><ns0:uiPriority ns0:val="99" /><ns0:semiHidden /><ns0:unhideWhenUsed /></ns0:style><ns0:style ns0:styleId="BodyText" ns0:type="paragraph"><ns0:name ns0:val="Body Text" /><ns0:basedOn ns0:val="Normal" /><ns0:qFormat /><ns0:pPr><ns0:spacing ns0:after="180" ns0:before="180" /></ns0:pPr></ns0:style><ns0:style ns0:customStyle="1" ns0:styleId="FirstParagraph" ns0:type="paragraph"><ns0:name ns0:val="First Paragraph" /><ns0:basedOn ns0:val="BodyText" /><ns0:next ns0:val="BodyText" /><ns0:qFormat /></ns0:style><ns0:style ns0:customStyle="1" ns0:styleId="Compact" ns0:type="paragraph"><ns0:name ns0:val="Compact" /><ns0:basedOn ns0:val="BodyText" /><ns0:qFormat /><ns0:pPr><ns0:spacing ns0:after="36" ns0:before="36" /></ns0:pPr><ns0:rPr><ns0:rFonts ns0:ascii="Arial" ns0:cs="Arial" ns0:hAnsi="Arial" /><ns0:sz ns0:val="20" /><ns0:szCs ns0:val="20" /></ns0:rPr></ns0:style><ns0:style ns0:styleId="Title" ns0:type="paragraph"><ns0:name ns0:val="Title" /><ns0:basedOn ns0:val="Normal" /><ns0:next ns0:val="BodyText" /><ns0:qFormat /><ns0:pPr><ns0:keepNext /><ns0:keepLines /><ns0:spacing ns0:after="240" ns0:before="480" /><ns0:jc ns0:val="center" /></ns0:pPr><ns0:rPr><ns0:rFonts ns0:asciiTheme="majorHAnsi" ns0:cstheme="majorBidi" ns0:eastAsiaTheme="majorEastAsia" ns0:hAnsiTheme="majorHAnsi" /><ns0:b /><ns0:bCs /><ns0:color ns0:themeColor="accent1" ns0:themeShade="B5" ns0:val="345A8A" /><ns0:sz ns0:val="36" /><ns0:szCs ns0:val="36" /></ns0:rPr></ns0:style><ns0:style ns0:styleId="Subtitle" ns0:type="paragraph"><ns0:name ns0:val="Subtitle" /><ns0:basedOn ns0:val="Title" /><ns0:next ns0:val="BodyText" /><ns0:qFormat /><ns0:pPr><ns0:spacing ns0:before="240" /></ns0:pPr><ns0:rPr><ns0:sz ns0:val="30" /><ns0:szCs ns0:val="30" /></ns0:rPr></ns0:style><ns0:style ns0:customStyle="1" ns0:styleId="Author" ns0:type="paragraph"><ns0:name ns0:val="Author" /><ns0:next ns0:val="BodyText" /><ns0:qFormat /><ns0:pPr><ns0:keepNext /><ns0:keepLines /><ns0:jc ns0:val="center" /></ns0:pPr></ns0:style><ns0:style ns0:styleId="Date" ns0:type="paragraph"><ns0:name ns0:val="Date" /><ns0:next ns0:val="BodyText" /><ns0:qFormat /><ns0:pPr><ns0:keepNext /><ns0:keepLines /><ns0:jc ns0:val="center" /></ns0:pPr></ns0:style><ns0:style ns0:customStyle="1" ns0:styleId="Abstract" ns0:type="paragraph"><ns0:name ns0:val="Abstract" /><ns0:basedOn ns0:val="Normal" /><ns0:next ns0:val="BodyText" /><ns0:qFormat /><ns0:pPr><ns0:keepNext /><ns0:keepLines /><ns0:spacing ns0:after="300" ns0:before="300" /></ns0:pPr><ns0:rPr><ns0:sz ns0:val="20" /><ns0:szCs ns0:val="20" /></ns0:rPr></ns0:style><ns0:style ns0:styleId="Bibliography" ns0:type="paragraph"><ns0:name ns0:val="Bibliography" /><ns0:basedOn ns0:val="Normal" /><ns0:qFormat /></ns0:style><ns0:style ns0:styleId="BlockText" ns0:type="paragraph"><ns0:name ns0:val="Block Text" /><ns0:basedOn ns0:val="BodyText" /><ns0:next ns0:val="BodyText" /><ns0:uiPriority ns0:val="9" /><ns0:unhideWhenUsed /><ns0:qFormat /><ns0:pPr><ns0:spacing ns0:after="100" ns0:before="100" /></ns0:pPr><ns0:rPr><ns0:rFonts ns0:asciiTheme="majorHAnsi" ns0:cstheme="majorBidi" ns0:eastAsiaTheme="majorEastAsia" ns0:hAnsiTheme="majorHAnsi" /><ns0:bCs /><ns0:sz ns0:val="20" /><ns0:szCs ns0:val="20" /></ns0:rPr></ns0:style><ns0:style ns0:styleId="FootnoteText" ns0:type="paragraph"><ns0:name ns0:val="footnote text" /><ns0:basedOn ns0:val="Normal" /><ns0:uiPriority ns0:val="9" /><ns0:unhideWhenUsed /><ns0:qFormat /></ns0:style><ns0:style ns0:customStyle="1" ns0:styleId="DefinitionTerm" ns0:type="paragraph"><ns0:name ns0:val="Definition Term" /><ns0:basedOn ns0:val="Normal" /><ns0:next ns0:val="Definition" /><ns0:pPr><ns0:keepNext /><ns0:keepLines /><ns0:spacing ns0:after="0" /></ns0:pPr><ns0:rPr><ns0:b /></ns0:rPr></ns0:style><ns0:style ns0:customStyle="1" ns0:styleId="Definition" ns0:type="paragraph"><ns0:name ns0:val="Definition" /><ns0:basedOn ns0:val="Normal" /></ns0:style><ns0:style ns0:styleId="Caption" ns0:type="paragraph"><ns0:name ns0:val="caption" /><ns0:basedOn ns0:val="Normal" /><ns0:link ns0:val="CaptionChar" /><ns0:pPr><ns0:spacing ns0:after="120" /></ns0:pPr><ns0:rPr><ns0:i /></ns0:rPr></ns0:style><ns0:style ns0:customStyle="1" ns0:styleId="TableCaption" ns0:type="paragraph"><ns0:name ns0:val="Table Caption" /><ns0:basedOn ns0:val="Caption" /><ns0:pPr><ns0:keepNext /></ns0:pPr></ns0:style><ns0:style ns0:customStyle="1" ns0:styleId="ImageCaption" ns0:type="paragraph"><ns0:name ns0:val="Image Caption" /><ns0:basedOn ns0:val="Caption" /></ns0:style><ns0:style ns0:customStyle="1" ns0:styleId="Figure" ns0:type="paragraph"><ns0:name ns0:val="Figure" /><ns0:basedOn ns0:val="Normal" /></ns0:style><ns0:style ns0:customStyle="1" ns0:styleId="FigurewithCaption" ns0:type="paragraph"><ns0:name ns0:val="Figure with Caption" /><ns0:basedOn ns0:val="Figure" /><ns0:pPr><ns0:keepNext /></ns0:pPr></ns0:style><ns0:style ns0:customStyle="1" ns0:styleId="CaptionChar" ns0:type="character"><ns0:name ns0:val="Caption Char" /><ns0:basedOn ns0:val="DefaultParagraphFont" /><ns0:link ns0:val="Caption" /></ns0:style><ns0:style ns0:customStyle="1" ns0:styleId="VerbatimChar" ns0:type="character"><ns0:name ns0:val="Verbatim Char" /><ns0:basedOn ns0:val="CaptionChar" /><ns0:link ns0:val="SourceCode" /><ns0:rPr><ns0:rFonts ns0:ascii="Consolas" ns0:hAnsi="Consolas" /><ns0:sz ns0:val="22" /></ns0:rPr></ns0:style><ns0:style ns0:styleId="FootnoteReference" ns0:type="character"><ns0:name ns0:val="footnote reference" /><ns0:basedOn ns0:val="CaptionChar" /><ns0:rPr><ns0:vertAlign ns0:val="superscript" /></ns0:rPr></ns0:style><ns0:style ns0:styleId="Hyperlink" ns0:type="character"><ns0:name ns0:val="Hyperlink" /><ns0:basedOn ns0:val="CaptionChar" /><ns0:rPr><ns0:color ns0:themeColor="accent1" ns0:val="4F81BD" /></ns0:rPr></ns0:style><ns0:style ns0:styleId="TOCHeading" ns0:type="paragraph"><ns0:name ns0:val="TOC Heading" /><ns0:basedOn ns0:val="Heading1" /><ns0:next ns0:val="BodyText" /><ns0:uiPriority ns0:val="39" /><ns0:unhideWhenUsed /><ns0:qFormat /><ns0:pPr><ns0:spacing ns0:before="240" ns0:line="259" ns0:lineRule="auto" /><ns0:outlineLvl ns0:val="9" /></ns0:pPr><ns0:rPr><ns0:b ns0:val="0" /><ns0:bCs ns0:val="0" /><ns0:color ns0:themeColor="accent1" ns0:themeShade="BF" ns0:val="365F91" /></ns0:rPr></ns0:style><ns0:style ns0:customStyle="1" ns0:styleId="SourceCode" ns0:type="paragraph"><ns0:name ns0:val="Source Code" /><ns0:basedOn ns0:val="Normal" /><ns0:link ns0:val="VerbatimChar" /><ns0:pPr><ns0:shd ns0:color="auto" ns0:fill="F8F8F8" ns0:val="clear" /><ns0:wordWrap ns0:val="0" /></ns0:pPr></ns0:style><ns0:style ns0:customStyle="1" ns0:styleId="KeywordTok" ns0:type="character"><ns0:name ns0:val="KeywordTok" /><ns0:basedOn ns0:val="VerbatimChar" /><ns0:rPr><ns0:rFonts ns0:ascii="Consolas" ns0:hAnsi="Consolas" /><ns0:b /><ns0:color ns0:val="204A87" /><ns0:sz ns0:val="22" /><ns0:shd ns0:color="auto" ns0:fill="F8F8F8" ns0:val="clear" /></ns0:rPr></ns0:style><ns0:style ns0:customStyle="1" ns0:styleId="DataTypeTok" ns0:type="character"><ns0:name ns0:val="DataTypeTok" /><ns0:basedOn ns0:val="VerbatimChar" /><ns0:rPr><ns0:rFonts ns0:ascii="Consolas" ns0:hAnsi="Consolas" /><ns0:color ns0:val="204A87" /><ns0:sz ns0:val="22" /><ns0:shd ns0:color="auto" ns0:fill="F8F8F8" ns0:val="clear" /></ns0:rPr></ns0:style><ns0:style ns0:customStyle="1" ns0:styleId="DecValTok" ns0:type="character"><ns0:name ns0:val="DecValTok" /><ns0:basedOn ns0:val="VerbatimChar" /><ns0:rPr><ns0:rFonts ns0:ascii="Consolas" ns0:hAnsi="Consolas" /><ns0:color ns0:val="0000CF" /><ns0:sz ns0:val="22" /><ns0:shd ns0:color="auto" ns0:fill="F8F8F8" ns0:val="clear" /></ns0:rPr></ns0:style><ns0:style ns0:customStyle="1" ns0:styleId="BaseNTok" ns0:type="character"><ns0:name ns0:val="BaseNTok" /><ns0:basedOn ns0:val="VerbatimChar" /><ns0:rPr><ns0:rFonts ns0:ascii="Consolas" ns0:hAnsi="Consolas" /><ns0:color ns0:val="0000CF" /><ns0:sz ns0:val="22" /><ns0:shd ns0:color="auto" ns0:fill="F8F8F8" ns0:val="clear" /></ns0:rPr></ns0:style><ns0:style ns0:customStyle="1" ns0:styleId="FloatTok" ns0:type="character"><ns0:name ns0:val="FloatTok" /><ns0:basedOn ns0:val="VerbatimChar" /><ns0:rPr><ns0:rFonts ns0:ascii="Consolas" ns0:hAnsi="Consolas" /><ns0:color ns0:val="0000CF" /><ns0:sz ns0:val="22" /><ns0:shd ns0:color="auto" ns0:fill="F8F8F8" ns0:val="clear" /></ns0:rPr></ns0:style><ns0:style ns0:customStyle="1" ns0:styleId="ConstantTok" ns0:type="character"><ns0:name ns0:val="ConstantTok" /><ns0:basedOn ns0:val="VerbatimChar" /><ns0:rPr><ns0:rFonts ns0:ascii="Consolas" ns0:hAnsi="Consolas" /><ns0:color ns0:val="000000" /><ns0:sz ns0:val="22" /><ns0:shd ns0:color="auto" ns0:fill="F8F8F8" ns0:val="clear" /></ns0:rPr></ns0:style><ns0:style ns0:customStyle="1" ns0:styleId="CharTok" ns0:type="character"><ns0:name ns0:val="CharTok" /><ns0:basedOn ns0:val="VerbatimChar" /><ns0:rPr><ns0:rFonts ns0:ascii="Consolas" ns0:hAnsi="Consolas" /><ns0:color ns0:val="4E9A06" /><ns0:sz ns0:val="22" /><ns0:shd ns0:color="auto" ns0:fill="F8F8F8" ns0:val="clear" /></ns0:rPr></ns0:style><ns0:style ns0:customStyle="1" ns0:styleId="SpecialCharTok" ns0:type="character"><ns0:name ns0:val="SpecialCharTok" /><ns0:basedOn ns0:val="VerbatimChar" /><ns0:rPr><ns0:rFonts ns0:ascii="Consolas" ns0:hAnsi="Consolas" /><ns0:color ns0:val="000000" /><ns0:sz ns0:val="22" /><ns0:shd ns0:color="auto" ns0:fill="F8F8F8" ns0:val="clear" /></ns0:rPr></ns0:style><ns0:style ns0:customStyle="1" ns0:styleId="StringTok" ns0:type="character"><ns0:name ns0:val="StringTok" /><ns0:basedOn ns0:val="VerbatimChar" /><ns0:rPr><ns0:rFonts ns0:ascii="Consolas" ns0:hAnsi="Consolas" /><ns0:color ns0:val="4E9A06" /><ns0:sz ns0:val="22" /><ns0:shd ns0:color="auto" ns0:fill="F8F8F8" ns0:val="clear" /></ns0:rPr></ns0:style><ns0:style ns0:customStyle="1" ns0:styleId="VerbatimStringTok" ns0:type="character"><ns0:name ns0:val="VerbatimStringTok" /><ns0:basedOn ns0:val="VerbatimChar" /><ns0:rPr><ns0:rFonts ns0:ascii="Consolas" ns0:hAnsi="Consolas" /><ns0:color ns0:val="4E9A06" /><ns0:sz ns0:val="22" /><ns0:shd ns0:color="auto" ns0:fill="F8F8F8" ns0:val="clear" /></ns0:rPr></ns0:style><ns0:style ns0:customStyle="1" ns0:styleId="SpecialStringTok" ns0:type="character"><ns0:name ns0:val="SpecialStringTok" /><ns0:basedOn ns0:val="VerbatimChar" /><ns0:rPr><ns0:rFonts ns0:ascii="Consolas" ns0:hAnsi="Consolas" /><ns0:color ns0:val="4E9A06" /><ns0:sz ns0:val="22" /><ns0:shd ns0:color="auto" ns0:fill="F8F8F8" ns0:val="clear" /></ns0:rPr></ns0:style><ns0:style ns0:customStyle="1" ns0:styleId="ImportTok" ns0:type="character"><ns0:name ns0:val="ImportTok" /><ns0:basedOn ns0:val="VerbatimChar" /><ns0:rPr><ns0:rFonts ns0:ascii="Consolas" ns0:hAnsi="Consolas" /><ns0:sz ns0:val="22" /><ns0:shd ns0:color="auto" ns0:fill="F8F8F8" ns0:val="clear" /></ns0:rPr></ns0:style><ns0:style ns0:customStyle="1" ns0:styleId="CommentTok" ns0:type="character"><ns0:name ns0:val="CommentTok" /><ns0:basedOn ns0:val="VerbatimChar" /><ns0:rPr><ns0:rFonts ns0:ascii="Consolas" ns0:hAnsi="Consolas" /><ns0:i /><ns0:color ns0:val="8F5902" /><ns0:sz ns0:val="22" /><ns0:shd ns0:color="auto" ns0:fill="F8F8F8" ns0:val="clear" /></ns0:rPr></ns0:style><ns0:style ns0:customStyle="1" ns0:styleId="DocumentationTok" ns0:type="character"><ns0:name ns0:val="DocumentationTok" /><ns0:basedOn ns0:val="VerbatimChar" /><ns0:rPr><ns0:rFonts ns0:ascii="Consolas" ns0:hAnsi="Consolas" /><ns0:b /><ns0:i /><ns0:color ns0:val="8F5902" /><ns0:sz ns0:val="22" /><ns0:shd ns0:color="auto" ns0:fill="F8F8F8" ns0:val="clear" /></ns0:rPr></ns0:style><ns0:style ns0:customStyle="1" ns0:styleId="AnnotationTok" ns0:type="character"><ns0:name ns0:val="AnnotationTok" /><ns0:basedOn ns0:val="VerbatimChar" /><ns0:rPr><ns0:rFonts ns0:ascii="Consolas" ns0:hAnsi="Consolas" /><ns0:b /><ns0:i /><ns0:color ns0:val="8F5902" /><ns0:sz ns0:val="22" /><ns0:shd ns0:color="auto" ns0:fill="F8F8F8" ns0:val="clear" /></ns0:rPr></ns0:style><ns0:style ns0:customStyle="1" ns0:styleId="CommentVarTok" ns0:type="character"><ns0:name ns0:val="CommentVarTok" /><ns0:basedOn ns0:val="VerbatimChar" /><ns0:rPr><ns0:rFonts ns0:ascii="Consolas" ns0:hAnsi="Consolas" /><ns0:b /><ns0:i /><ns0:color ns0:val="8F5902" /><ns0:sz ns0:val="22" /><ns0:shd ns0:color="auto" ns0:fill="F8F8F8" ns0:val="clear" /></ns0:rPr></ns0:style><ns0:style ns0:customStyle="1" ns0:styleId="OtherTok" ns0:type="character"><ns0:name ns0:val="OtherTok" /><ns0:basedOn ns0:val="VerbatimChar" /><ns0:rPr><ns0:rFonts ns0:ascii="Consolas" ns0:hAnsi="Consolas" /><ns0:color ns0:val="8F5902" /><ns0:sz ns0:val="22" /><ns0:shd ns0:color="auto" ns0:fill="F8F8F8" ns0:val="clear" /></ns0:rPr></ns0:style><ns0:style ns0:customStyle="1" ns0:styleId="FunctionTok" ns0:type="character"><ns0:name ns0:val="FunctionTok" /><ns0:basedOn ns0:val="VerbatimChar" /><ns0:rPr><ns0:rFonts ns0:ascii="Consolas" ns0:hAnsi="Consolas" /><ns0:color ns0:val="000000" /><ns0:sz ns0:val="22" /><ns0:shd ns0:color="auto" ns0:fill="F8F8F8" ns0:val="clear" /></ns0:rPr></ns0:style><ns0:style ns0:customStyle="1" ns0:styleId="VariableTok" ns0:type="character"><ns0:name ns0:val="VariableTok" /><ns0:basedOn ns0:val="VerbatimChar" /><ns0:rPr><ns0:rFonts ns0:ascii="Consolas" ns0:hAnsi="Consolas" /><ns0:color ns0:val="000000" /><ns0:sz ns0:val="22" /><ns0:shd ns0:color="auto" ns0:fill="F8F8F8" ns0:val="clear" /></ns0:rPr></ns0:style><ns0:style ns0:customStyle="1" ns0:styleId="ControlFlowTok" ns0:type="character"><ns0:name ns0:val="ControlFlowTok" /><ns0:basedOn ns0:val="VerbatimChar" /><ns0:rPr><ns0:rFonts ns0:ascii="Consolas" ns0:hAnsi="Consolas" /><ns0:b /><ns0:color ns0:val="204A87" /><ns0:sz ns0:val="22" /><ns0:shd ns0:color="auto" ns0:fill="F8F8F8" ns0:val="clear" /></ns0:rPr></ns0:style><ns0:style ns0:customStyle="1" ns0:styleId="OperatorTok" ns0:type="character"><ns0:name ns0:val="OperatorTok" /><ns0:basedOn ns0:val="VerbatimChar" /><ns0:rPr><ns0:rFonts ns0:ascii="Consolas" ns0:hAnsi="Consolas" /><ns0:b /><ns0:color ns0:val="CE5C00" /><ns0:sz ns0:val="22" /><ns0:shd ns0:color="auto" ns0:fill="F8F8F8" ns0:val="clear" /></ns0:rPr></ns0:style><ns0:style ns0:customStyle="1" ns0:styleId="BuiltInTok" ns0:type="character"><ns0:name ns0:val="BuiltInTok" /><ns0:basedOn ns0:val="VerbatimChar" /><ns0:rPr><ns0:rFonts ns0:ascii="Consolas" ns0:hAnsi="Consolas" /><ns0:sz ns0:val="22" /><ns0:shd ns0:color="auto" ns0:fill="F8F8F8" ns0:val="clear" /></ns0:rPr></ns0:style><ns0:style ns0:customStyle="1" ns0:styleId="ExtensionTok" ns0:type="character"><ns0:name ns0:val="ExtensionTok" /><ns0:basedOn ns0:val="VerbatimChar" /><ns0:rPr><ns0:rFonts ns0:ascii="Consolas" ns0:hAnsi="Consolas" /><ns0:sz ns0:val="22" /><ns0:shd ns0:color="auto" ns0:fill="F8F8F8" ns0:val="clear" /></ns0:rPr></ns0:style><ns0:style ns0:customStyle="1" ns0:styleId="PreprocessorTok" ns0:type="character"><ns0:name ns0:val="PreprocessorTok" /><ns0:basedOn ns0:val="VerbatimChar" /><ns0:rPr><ns0:rFonts ns0:ascii="Consolas" ns0:hAnsi="Consolas" /><ns0:i /><ns0:color ns0:val="8F5902" /><ns0:sz ns0:val="22" /><ns0:shd ns0:color="auto" ns0:fill="F8F8F8" ns0:val="clear" /></ns0:rPr></ns0:style><ns0:style ns0:customStyle="1" ns0:styleId="AttributeTok" ns0:type="character"><ns0:name ns0:val="AttributeTok" /><ns0:basedOn ns0:val="VerbatimChar" /><ns0:rPr><ns0:rFonts ns0:ascii="Consolas" ns0:hAnsi="Consolas" /><ns0:color ns0:val="C4A000" /><ns0:sz ns0:val="22" /><ns0:shd ns0:color="auto" ns0:fill="F8F8F8" ns0:val="clear" /></ns0:rPr></ns0:style><ns0:style ns0:customStyle="1" ns0:styleId="RegionMarkerTok" ns0:type="character"><ns0:name ns0:val="RegionMarkerTok" /><ns0:basedOn ns0:val="VerbatimChar" /><ns0:rPr><ns0:rFonts ns0:ascii="Consolas" ns0:hAnsi="Consolas" /><ns0:sz ns0:val="22" /><ns0:shd ns0:color="auto" ns0:fill="F8F8F8" ns0:val="clear" /></ns0:rPr></ns0:style><ns0:style ns0:customStyle="1" ns0:styleId="InformationTok" ns0:type="character"><ns0:name ns0:val="InformationTok" /><ns0:basedOn ns0:val="VerbatimChar" /><ns0:rPr><ns0:rFonts ns0:ascii="Consolas" ns0:hAnsi="Consolas" /><ns0:b /><ns0:i /><ns0:color ns0:val="8F5902" /><ns0:sz ns0:val="22" /><ns0:shd ns0:color="auto" ns0:fill="F8F8F8" ns0:val="clear" /></ns0:rPr></ns0:style><ns0:style ns0:customStyle="1" ns0:styleId="WarningTok" ns0:type="character"><ns0:name ns0:val="WarningTok" /><ns0:basedOn ns0:val="VerbatimChar" /><ns0:rPr><ns0:rFonts ns0:ascii="Consolas" ns0:hAnsi="Consolas" /><ns0:b /><ns0:i /><ns0:color ns0:val="8F5902" /><ns0:sz ns0:val="22" /><ns0:shd ns0:color="auto" ns0:fill="F8F8F8" ns0:val="clear" /></ns0:rPr></ns0:style><ns0:style ns0:customStyle="1" ns0:styleId="AlertTok" ns0:type="character"><ns0:name ns0:val="AlertTok" /><ns0:basedOn ns0:val="VerbatimChar" /><ns0:rPr><ns0:rFonts ns0:ascii="Consolas" ns0:hAnsi="Consolas" /><ns0:color ns0:val="EF2929" /><ns0:sz ns0:val="22" /><ns0:shd ns0:color="auto" ns0:fill="F8F8F8" ns0:val="clear" /></ns0:rPr></ns0:style><ns0:style ns0:customStyle="1" ns0:styleId="ErrorTok" ns0:type="character"><ns0:name ns0:val="ErrorTok" /><ns0:basedOn ns0:val="VerbatimChar" /><ns0:rPr><ns0:rFonts ns0:ascii="Consolas" ns0:hAnsi="Consolas" /><ns0:b /><ns0:color ns0:val="A40000" /><ns0:sz ns0:val="22" /><ns0:shd ns0:color="auto" ns0:fill="F8F8F8" ns0:val="clear" /></ns0:rPr></ns0:style><ns0:style ns0:customStyle="1" ns0:styleId="NormalTok" ns0:type="character"><ns0:name ns0:val="NormalTok" /><ns0:basedOn ns0:val="VerbatimChar" /><ns0:rPr><ns0:rFonts ns0:ascii="Consolas" ns0:hAnsi="Consolas" /><ns0:sz ns0:val="22" /><ns0:shd ns0:color="auto" ns0:fill="F8F8F8" ns0:val="clear" /></ns0:rPr></ns0:style><ns0:style ns0:styleId="LineNumber" ns0:type="character"><ns0:name ns0:val="line number" /><ns0:basedOn ns0:val="DefaultParagraphFont" /><ns0:rsid ns0:val="00014752" /></ns0:style><ns0:style ns0:customStyle="1" ns0:styleId="Table" ns0:type="table"><ns0:tblPr><ns0:tblBorders><ns0:top ns0:color="000000" ns0:space="0" ns0:sz="4" ns0:val="single" /><ns0:bottom ns0:color="000000" ns0:space="0" ns0:sz="4" ns0:val="single" /></ns0:tblBorders></ns0:tblPr><ns0:name ns0:val="Table" /></ns0:style><w:style w:type="paragraph" w:customStyle="1" w:styleId="SourceCode"><w:name w:val="Source Code" /><w:basedOn w:val="Normal" /><w:link w:val="VerbatimChar" /><w:pPr><w:wordWrap w:val="off" /><w:shd w:val="clear" w:fill="f1f3f5" /></w:pPr></w:style><w:style w:type="character" w:customStyle="1" w:styleId="KeywordTok"><w:name w:val="KeywordTok" /><w:basedOn w:val="VerbatimChar" /><w:rPr><w:color w:val="003b4f" /><w:shd w:val="clear" w:fill="f1f3f5" /></w:rPr></w:style><w:style w:type="character" w:customStyle="1" w:styleId="DataTypeTok"><w:name w:val="DataTypeTok" /><w:basedOn w:val="VerbatimChar" /><w:rPr><w:color w:val="ad0000" /><w:shd w:val="clear" w:fill="f1f3f5" /></w:rPr></w:style><w:style w:type="character" w:customStyle="1" w:styleId="DecValTok"><w:name w:val="DecValTok" /><w:basedOn w:val="VerbatimChar" /><w:rPr><w:color w:val="ad0000" /><w:shd w:val="clear" w:fill="f1f3f5" /></w:rPr></w:style><w:style w:type="character" w:customStyle="1" w:styleId="BaseNTok"><w:name w:val="BaseNTok" /><w:basedOn w:val="VerbatimChar" /><w:rPr><w:color w:val="ad0000" /><w:shd w:val="clear" w:fill="f1f3f5" /></w:rPr></w:style><w:style w:type="character" w:customStyle="1" w:styleId="FloatTok"><w:name w:val="FloatTok" /><w:basedOn w:val="VerbatimChar" /><w:rPr><w:color w:val="ad0000" /><w:shd w:val="clear" w:fill="f1f3f5" /></w:rPr></w:style><w:style w:type="character" w:customStyle="1" w:styleId="ConstantTok"><w:name w:val="ConstantTok" /><w:basedOn w:val="VerbatimChar" /><w:rPr><w:color w:val="8f5902" /><w:shd w:val="clear" w:fill="f1f3f5" /></w:rPr></w:style><w:style w:type="character" w:customStyle="1" w:styleId="CharTok"><w:name w:val="CharTok" /><w:basedOn w:val="VerbatimChar" /><w:rPr><w:color w:val="20794d" /><w:shd w:val="clear" w:fill="f1f3f5" /></w:rPr></w:style><w:style w:type="character" w:customStyle="1" w:styleId="SpecialCharTok"><w:name w:val="SpecialCharTok" /><w:basedOn w:val="VerbatimChar" /><w:rPr><w:color w:val="5e5e5e" /><w:shd w:val="clear" w:fill="f1f3f5" /></w:rPr></w:style><w:style w:type="character" w:customStyle="1" w:styleId="StringTok"><w:name w:val="StringTok" /><w:basedOn w:val="VerbatimChar" /><w:rPr><w:color w:val="20794d" /><w:shd w:val="clear" w:fill="f1f3f5" /></w:rPr></w:style><w:style w:type="character" w:customStyle="1" w:styleId="VerbatimStringTok"><w:name w:val="VerbatimStringTok" /><w:basedOn w:val="VerbatimChar" /><w:rPr><w:color w:val="20794d" /><w:shd w:val="clear" w:fill="f1f3f5" /></w:rPr></w:style><w:style w:type="character" w:customStyle="1" w:styleId="SpecialStringTok"><w:name w:val="SpecialStringTok" /><w:basedOn w:val="VerbatimChar" /><w:rPr><w:color w:val="20794d" /><w:shd w:val="clear" w:fill="f1f3f5" /></w:rPr></w:style><w:style w:type="character" w:customStyle="1" w:styleId="ImportTok"><w:name w:val="ImportTok" /><w:basedOn w:val="VerbatimChar" /><w:rPr><w:color w:val="00769e" /><w:shd w:val="clear" w:fill="f1f3f5" /></w:rPr></w:style><w:style w:type="character" w:customStyle="1" w:styleId="CommentTok"><w:name w:val="CommentTok" /><w:basedOn w:val="VerbatimChar" /><w:rPr><w:color w:val="5e5e5e" /><w:shd w:val="clear" w:fill="f1f3f5" /></w:rPr></w:style><w:style w:type="character" w:customStyle="1" w:styleId="DocumentationTok"><w:name w:val="DocumentationTok" /><w:basedOn w:val="VerbatimChar" /><w:rPr><w:color w:val="5e5e5e" /><w:shd w:val="clear" w:fill="f1f3f5" /><w:i /></w:rPr></w:style><w:style w:type="character" w:customStyle="1" w:styleId="AnnotationTok"><w:name w:val="AnnotationTok" /><w:basedOn w:val="VerbatimChar" /><w:rPr><w:color w:val="5e5e5e" /><w:shd w:val="clear" w:fill="f1f3f5" /></w:rPr></w:style><w:style w:type="character" w:customStyle="1" w:styleId="CommentVarTok"><w:name w:val="CommentVarTok" /><w:basedOn w:val="VerbatimChar" /><w:rPr><w:color w:val="5e5e5e" /><w:shd w:val="clear" w:fill="f1f3f5" /><w:i /></w:rPr></w:style><w:style w:type="character" w:customStyle="1" w:styleId="OtherTok"><w:name w:val="OtherTok" /><w:basedOn w:val="VerbatimChar" /><w:rPr><w:color w:val="003b4f" /><w:shd w:val="clear" w:fill="f1f3f5" /></w:rPr></w:style><w:style w:type="character" w:customStyle="1" w:styleId="FunctionTok"><w:name w:val="FunctionTok" /><w:basedOn w:val="VerbatimChar" /><w:rPr><w:color w:val="4758ab" /><w:shd w:val="clear" w:fill="f1f3f5" /></w:rPr></w:style><w:style w:type="character" w:customStyle="1" w:styleId="VariableTok"><w:name w:val="VariableTok" /><w:basedOn w:val="VerbatimChar" /><w:rPr><w:color w:val="111111" /><w:shd w:val="clear" w:fill="f1f3f5" /></w:rPr></w:style><w:style w:type="character" w:customStyle="1" w:styleId="ControlFlowTok"><w:name w:val="ControlFlowTok" /><w:basedOn w:val="VerbatimChar" /><w:rPr><w:color w:val="003b4f" /><w:shd w:val="clear" w:fill="f1f3f5" /></w:rPr></w:style><w:style w:type="character" w:customStyle="1" w:styleId="OperatorTok"><w:name w:val="OperatorTok" /><w:basedOn w:val="VerbatimChar" /><w:rPr><w:color w:val="5e5e5e" /><w:shd w:val="clear" w:fill="f1f3f5" /></w:rPr></w:style><w:style w:type="character" w:customStyle="1" w:styleId="BuiltInTok"><w:name w:val="BuiltInTok" /><w:basedOn w:val="VerbatimChar" /><w:rPr><w:color w:val="003b4f" /><w:shd w:val="clear" w:fill="f1f3f5" /></w:rPr></w:style><w:style w:type="character" w:customStyle="1" w:styleId="ExtensionTok"><w:name w:val="ExtensionTok" /><w:basedOn w:val="VerbatimChar" /><w:rPr><w:color w:val="003b4f" /><w:shd w:val="clear" w:fill="f1f3f5" /></w:rPr></w:style><w:style w:type="character" w:customStyle="1" w:styleId="PreprocessorTok"><w:name w:val="PreprocessorTok" /><w:basedOn w:val="VerbatimChar" /><w:rPr><w:color w:val="ad0000" /><w:shd w:val="clear" w:fill="f1f3f5" /></w:rPr></w:style><w:style w:type="character" w:customStyle="1" w:styleId="AttributeTok"><w:name w:val="AttributeTok" /><w:basedOn w:val="VerbatimChar" /><w:rPr><w:color w:val="657422" /><w:shd w:val="clear" w:fill="f1f3f5" /></w:rPr></w:style><w:style w:type="character" w:customStyle="1" w:styleId="RegionMarkerTok"><w:name w:val="RegionMarkerTok" /><w:basedOn w:val="VerbatimChar" /><w:rPr><w:color w:val="003b4f" /><w:shd w:val="clear" w:fill="f1f3f5" /></w:rPr></w:style><w:style w:type="character" w:customStyle="1" w:styleId="InformationTok"><w:name w:val="InformationTok" /><w:basedOn w:val="VerbatimChar" /><w:rPr><w:color w:val="5e5e5e" /><w:shd w:val="clear" w:fill="f1f3f5" /></w:rPr></w:style><w:style w:type="character" w:customStyle="1" w:styleId="WarningTok"><w:name w:val="WarningTok" /><w:basedOn w:val="VerbatimChar" /><w:rPr><w:color w:val="5e5e5e" /><w:shd w:val="clear" w:fill="f1f3f5" /><w:i /></w:rPr></w:style><w:style w:type="character" w:customStyle="1" w:styleId="AlertTok"><w:name w:val="AlertTok" /><w:basedOn w:val="VerbatimChar" /><w:rPr><w:color w:val="ad0000" /><w:shd w:val="clear" w:fill="f1f3f5" /></w:rPr></w:style><w:style w:type="character" w:customStyle="1" w:styleId="ErrorTok"><w:name w:val="ErrorTok" /><w:basedOn w:val="VerbatimChar" /><w:rPr><w:color w:val="ad0000" /><w:shd w:val="clear" w:fill="f1f3f5" /></w:rPr></w:style><w:style w:type="character" w:customStyle="1" w:styleId="NormalTok"><w:name w:val="NormalTok" /><w:basedOn w:val="VerbatimChar" /><w:rPr><w:color w:val="003b4f" /><w:shd w:val="clear" w:fill="f1f3f5" /></w:rPr></w:style></ns0:styles>
 </file>
 
 <file path=word/theme/theme1.xml><?xml version="1.0" encoding="utf-8"?>

</xml_diff>